<commit_message>
Część 1: spis treści w zwykłym układzie (kropki, numery stron) z udziałem procentowym
Co-Authored-By: Claude Opus 5.5 <noreply@anthropic.com>
Claude-Session: https://claude.ai/code/session_01QehAftz7E7q6ro6WRzRWTg
</commit_message>
<xml_diff>
--- a/Czesc_1_Projekt_Toyota_Corolla_E12.docx
+++ b/Czesc_1_Projekt_Toyota_Corolla_E12.docx
@@ -139,3695 +139,758 @@
     </w:p>
     <w:p>
       <w:pPr>
-        <w:spacing w:after="200" w:before="0" w:line="276"/>
+        <w:spacing w:after="160" w:before="0" w:line="276"/>
         <w:jc w:val="left"/>
+      </w:pPr>
+      <w:r>
+        <w:rPr>
+          <w:rFonts w:ascii="Calibri" w:cs="Calibri" w:eastAsia="Calibri" w:hAnsi="Calibri"/>
+          <w:b w:val="false"/>
+          <w:bCs w:val="false"/>
+          <w:sz w:val="30"/>
+          <w:szCs w:val="30"/>
+        </w:rPr>
+        <w:t xml:space="preserve">Spis treści</w:t>
+      </w:r>
+    </w:p>
+    <w:p>
+      <w:pPr>
+        <w:tabs>
+          <w:tab w:val="right" w:pos="8338"/>
+          <w:tab w:val="right" w:pos="9638"/>
+        </w:tabs>
+        <w:spacing w:after="60"/>
+      </w:pPr>
+      <w:r>
+        <w:rPr>
+          <w:rFonts w:ascii="Calibri" w:cs="Calibri" w:eastAsia="Calibri" w:hAnsi="Calibri"/>
+          <w:i/>
+          <w:iCs/>
+          <w:color w:val="595959"/>
+          <w:sz w:val="18"/>
+          <w:szCs w:val="18"/>
+        </w:rPr>
+        <w:t xml:space="preserve">	strona	udział</w:t>
+      </w:r>
+    </w:p>
+    <w:p>
+      <w:pPr>
+        <w:tabs>
+          <w:tab w:val="right" w:pos="8338" w:leader="dot"/>
+          <w:tab w:val="right" w:pos="9638"/>
+        </w:tabs>
+        <w:spacing w:after="70"/>
+        <w:ind w:left="0"/>
+      </w:pPr>
+      <w:r>
+        <w:rPr>
+          <w:rFonts w:ascii="Calibri" w:cs="Calibri" w:eastAsia="Calibri" w:hAnsi="Calibri"/>
+          <w:sz w:val="22"/>
+          <w:szCs w:val="22"/>
+        </w:rPr>
+        <w:t xml:space="preserve">1. Wstęp</w:t>
+      </w:r>
+      <w:r>
+        <w:rPr>
+          <w:rFonts w:ascii="Calibri" w:cs="Calibri" w:eastAsia="Calibri" w:hAnsi="Calibri"/>
+          <w:sz w:val="22"/>
+          <w:szCs w:val="22"/>
+        </w:rPr>
+        <w:t xml:space="preserve">	3	3%</w:t>
+      </w:r>
+    </w:p>
+    <w:p>
+      <w:pPr>
+        <w:tabs>
+          <w:tab w:val="right" w:pos="8338" w:leader="dot"/>
+          <w:tab w:val="right" w:pos="9638"/>
+        </w:tabs>
+        <w:spacing w:after="70"/>
+        <w:ind w:left="0"/>
+      </w:pPr>
+      <w:r>
+        <w:rPr>
+          <w:rFonts w:ascii="Calibri" w:cs="Calibri" w:eastAsia="Calibri" w:hAnsi="Calibri"/>
+          <w:sz w:val="22"/>
+          <w:szCs w:val="22"/>
+        </w:rPr>
+        <w:t xml:space="preserve">2. Charakterystyka obiektu naprawy</w:t>
+      </w:r>
+      <w:r>
+        <w:rPr>
+          <w:rFonts w:ascii="Calibri" w:cs="Calibri" w:eastAsia="Calibri" w:hAnsi="Calibri"/>
+          <w:sz w:val="22"/>
+          <w:szCs w:val="22"/>
+        </w:rPr>
+        <w:t xml:space="preserve">	4	9%</w:t>
+      </w:r>
+    </w:p>
+    <w:p>
+      <w:pPr>
+        <w:tabs>
+          <w:tab w:val="right" w:pos="8338" w:leader="dot"/>
+          <w:tab w:val="right" w:pos="9638"/>
+        </w:tabs>
+        <w:spacing w:after="70"/>
+        <w:ind w:left="400"/>
+      </w:pPr>
+      <w:r>
+        <w:rPr>
+          <w:rFonts w:ascii="Calibri" w:cs="Calibri" w:eastAsia="Calibri" w:hAnsi="Calibri"/>
+          <w:sz w:val="22"/>
+          <w:szCs w:val="22"/>
+        </w:rPr>
+        <w:t xml:space="preserve">2.1. Dane techniczne pojazdu</w:t>
+      </w:r>
+      <w:r>
+        <w:rPr>
+          <w:rFonts w:ascii="Calibri" w:cs="Calibri" w:eastAsia="Calibri" w:hAnsi="Calibri"/>
+          <w:sz w:val="22"/>
+          <w:szCs w:val="22"/>
+        </w:rPr>
+        <w:t xml:space="preserve">	4	</w:t>
+      </w:r>
+    </w:p>
+    <w:p>
+      <w:pPr>
+        <w:tabs>
+          <w:tab w:val="right" w:pos="8338" w:leader="dot"/>
+          <w:tab w:val="right" w:pos="9638"/>
+        </w:tabs>
+        <w:spacing w:after="70"/>
+        <w:ind w:left="400"/>
+      </w:pPr>
+      <w:r>
+        <w:rPr>
+          <w:rFonts w:ascii="Calibri" w:cs="Calibri" w:eastAsia="Calibri" w:hAnsi="Calibri"/>
+          <w:sz w:val="22"/>
+          <w:szCs w:val="22"/>
+        </w:rPr>
+        <w:t xml:space="preserve">2.2. Budowa hamulca tarczowego osi przedniej</w:t>
+      </w:r>
+      <w:r>
+        <w:rPr>
+          <w:rFonts w:ascii="Calibri" w:cs="Calibri" w:eastAsia="Calibri" w:hAnsi="Calibri"/>
+          <w:sz w:val="22"/>
+          <w:szCs w:val="22"/>
+        </w:rPr>
+        <w:t xml:space="preserve">	5	</w:t>
+      </w:r>
+    </w:p>
+    <w:p>
+      <w:pPr>
+        <w:tabs>
+          <w:tab w:val="right" w:pos="8338" w:leader="dot"/>
+          <w:tab w:val="right" w:pos="9638"/>
+        </w:tabs>
+        <w:spacing w:after="70"/>
+        <w:ind w:left="0"/>
+      </w:pPr>
+      <w:r>
+        <w:rPr>
+          <w:rFonts w:ascii="Calibri" w:cs="Calibri" w:eastAsia="Calibri" w:hAnsi="Calibri"/>
+          <w:sz w:val="22"/>
+          <w:szCs w:val="22"/>
+        </w:rPr>
+        <w:t xml:space="preserve">3. Warunki techniczne weryfikacji i montażu</w:t>
+      </w:r>
+      <w:r>
+        <w:rPr>
+          <w:rFonts w:ascii="Calibri" w:cs="Calibri" w:eastAsia="Calibri" w:hAnsi="Calibri"/>
+          <w:sz w:val="22"/>
+          <w:szCs w:val="22"/>
+        </w:rPr>
+        <w:t xml:space="preserve">	7	6%</w:t>
+      </w:r>
+    </w:p>
+    <w:p>
+      <w:pPr>
+        <w:tabs>
+          <w:tab w:val="right" w:pos="8338" w:leader="dot"/>
+          <w:tab w:val="right" w:pos="9638"/>
+        </w:tabs>
+        <w:spacing w:after="70"/>
+        <w:ind w:left="400"/>
+      </w:pPr>
+      <w:r>
+        <w:rPr>
+          <w:rFonts w:ascii="Calibri" w:cs="Calibri" w:eastAsia="Calibri" w:hAnsi="Calibri"/>
+          <w:sz w:val="22"/>
+          <w:szCs w:val="22"/>
+        </w:rPr>
+        <w:t xml:space="preserve">3.1. Wymiary nominalne i dopuszczalne</w:t>
+      </w:r>
+      <w:r>
+        <w:rPr>
+          <w:rFonts w:ascii="Calibri" w:cs="Calibri" w:eastAsia="Calibri" w:hAnsi="Calibri"/>
+          <w:sz w:val="22"/>
+          <w:szCs w:val="22"/>
+        </w:rPr>
+        <w:t xml:space="preserve">	7	</w:t>
+      </w:r>
+    </w:p>
+    <w:p>
+      <w:pPr>
+        <w:tabs>
+          <w:tab w:val="right" w:pos="8338" w:leader="dot"/>
+          <w:tab w:val="right" w:pos="9638"/>
+        </w:tabs>
+        <w:spacing w:after="70"/>
+        <w:ind w:left="400"/>
+      </w:pPr>
+      <w:r>
+        <w:rPr>
+          <w:rFonts w:ascii="Calibri" w:cs="Calibri" w:eastAsia="Calibri" w:hAnsi="Calibri"/>
+          <w:sz w:val="22"/>
+          <w:szCs w:val="22"/>
+        </w:rPr>
+        <w:t xml:space="preserve">3.2. Momenty dokręcania oraz rozmiar i typ kluczy</w:t>
+      </w:r>
+      <w:r>
+        <w:rPr>
+          <w:rFonts w:ascii="Calibri" w:cs="Calibri" w:eastAsia="Calibri" w:hAnsi="Calibri"/>
+          <w:sz w:val="22"/>
+          <w:szCs w:val="22"/>
+        </w:rPr>
+        <w:t xml:space="preserve">	7	</w:t>
+      </w:r>
+    </w:p>
+    <w:p>
+      <w:pPr>
+        <w:tabs>
+          <w:tab w:val="right" w:pos="8338" w:leader="dot"/>
+          <w:tab w:val="right" w:pos="9638"/>
+        </w:tabs>
+        <w:spacing w:after="70"/>
+        <w:ind w:left="400"/>
+      </w:pPr>
+      <w:r>
+        <w:rPr>
+          <w:rFonts w:ascii="Calibri" w:cs="Calibri" w:eastAsia="Calibri" w:hAnsi="Calibri"/>
+          <w:sz w:val="22"/>
+          <w:szCs w:val="22"/>
+        </w:rPr>
+        <w:t xml:space="preserve">3.3. Środki smarne i eksploatacyjne</w:t>
+      </w:r>
+      <w:r>
+        <w:rPr>
+          <w:rFonts w:ascii="Calibri" w:cs="Calibri" w:eastAsia="Calibri" w:hAnsi="Calibri"/>
+          <w:sz w:val="22"/>
+          <w:szCs w:val="22"/>
+        </w:rPr>
+        <w:t xml:space="preserve">	8	</w:t>
+      </w:r>
+    </w:p>
+    <w:p>
+      <w:pPr>
+        <w:tabs>
+          <w:tab w:val="right" w:pos="8338" w:leader="dot"/>
+          <w:tab w:val="right" w:pos="9638"/>
+        </w:tabs>
+        <w:spacing w:after="70"/>
+        <w:ind w:left="0"/>
+      </w:pPr>
+      <w:r>
+        <w:rPr>
+          <w:rFonts w:ascii="Calibri" w:cs="Calibri" w:eastAsia="Calibri" w:hAnsi="Calibri"/>
+          <w:sz w:val="22"/>
+          <w:szCs w:val="22"/>
+        </w:rPr>
+        <w:t xml:space="preserve">4. Diagnostyka i kwalifikacja pojazdu do naprawy</w:t>
+      </w:r>
+      <w:r>
+        <w:rPr>
+          <w:rFonts w:ascii="Calibri" w:cs="Calibri" w:eastAsia="Calibri" w:hAnsi="Calibri"/>
+          <w:sz w:val="22"/>
+          <w:szCs w:val="22"/>
+        </w:rPr>
+        <w:t xml:space="preserve">		6%</w:t>
+      </w:r>
+    </w:p>
+    <w:p>
+      <w:pPr>
+        <w:tabs>
+          <w:tab w:val="right" w:pos="8338" w:leader="dot"/>
+          <w:tab w:val="right" w:pos="9638"/>
+        </w:tabs>
+        <w:spacing w:after="70"/>
+        <w:ind w:left="400"/>
+      </w:pPr>
+      <w:r>
+        <w:rPr>
+          <w:rFonts w:ascii="Calibri" w:cs="Calibri" w:eastAsia="Calibri" w:hAnsi="Calibri"/>
+          <w:sz w:val="22"/>
+          <w:szCs w:val="22"/>
+        </w:rPr>
+        <w:t xml:space="preserve">4.1. Macierz diagnostyczna objawów</w:t>
+      </w:r>
+      <w:r>
+        <w:rPr>
+          <w:rFonts w:ascii="Calibri" w:cs="Calibri" w:eastAsia="Calibri" w:hAnsi="Calibri"/>
+          <w:sz w:val="22"/>
+          <w:szCs w:val="22"/>
+        </w:rPr>
+        <w:t xml:space="preserve">		</w:t>
+      </w:r>
+    </w:p>
+    <w:p>
+      <w:pPr>
+        <w:tabs>
+          <w:tab w:val="right" w:pos="8338" w:leader="dot"/>
+          <w:tab w:val="right" w:pos="9638"/>
+        </w:tabs>
+        <w:spacing w:after="70"/>
+        <w:ind w:left="400"/>
+      </w:pPr>
+      <w:r>
+        <w:rPr>
+          <w:rFonts w:ascii="Calibri" w:cs="Calibri" w:eastAsia="Calibri" w:hAnsi="Calibri"/>
+          <w:sz w:val="22"/>
+          <w:szCs w:val="22"/>
+        </w:rPr>
+        <w:t xml:space="preserve">4.2. Karta weryfikacji części</w:t>
+      </w:r>
+      <w:r>
+        <w:rPr>
+          <w:rFonts w:ascii="Calibri" w:cs="Calibri" w:eastAsia="Calibri" w:hAnsi="Calibri"/>
+          <w:sz w:val="22"/>
+          <w:szCs w:val="22"/>
+        </w:rPr>
+        <w:t xml:space="preserve">		</w:t>
+      </w:r>
+    </w:p>
+    <w:p>
+      <w:pPr>
+        <w:tabs>
+          <w:tab w:val="right" w:pos="8338" w:leader="dot"/>
+          <w:tab w:val="right" w:pos="9638"/>
+        </w:tabs>
+        <w:spacing w:after="70"/>
+        <w:ind w:left="0"/>
+      </w:pPr>
+      <w:r>
+        <w:rPr>
+          <w:rFonts w:ascii="Calibri" w:cs="Calibri" w:eastAsia="Calibri" w:hAnsi="Calibri"/>
+          <w:sz w:val="22"/>
+          <w:szCs w:val="22"/>
+        </w:rPr>
+        <w:t xml:space="preserve">5. Wyposażenie stanowiska pracy</w:t>
+      </w:r>
+      <w:r>
+        <w:rPr>
+          <w:rFonts w:ascii="Calibri" w:cs="Calibri" w:eastAsia="Calibri" w:hAnsi="Calibri"/>
+          <w:sz w:val="22"/>
+          <w:szCs w:val="22"/>
+        </w:rPr>
+        <w:t xml:space="preserve">		4%</w:t>
+      </w:r>
+    </w:p>
+    <w:p>
+      <w:pPr>
+        <w:tabs>
+          <w:tab w:val="right" w:pos="8338" w:leader="dot"/>
+          <w:tab w:val="right" w:pos="9638"/>
+        </w:tabs>
+        <w:spacing w:after="70"/>
+        <w:ind w:left="0"/>
+      </w:pPr>
+      <w:r>
+        <w:rPr>
+          <w:rFonts w:ascii="Calibri" w:cs="Calibri" w:eastAsia="Calibri" w:hAnsi="Calibri"/>
+          <w:sz w:val="22"/>
+          <w:szCs w:val="22"/>
+        </w:rPr>
+        <w:t xml:space="preserve">6. Proces technologiczny wymiany klocków hamulcowych</w:t>
+      </w:r>
+      <w:r>
+        <w:rPr>
+          <w:rFonts w:ascii="Calibri" w:cs="Calibri" w:eastAsia="Calibri" w:hAnsi="Calibri"/>
+          <w:sz w:val="22"/>
+          <w:szCs w:val="22"/>
+        </w:rPr>
+        <w:t xml:space="preserve">		50%</w:t>
+      </w:r>
+    </w:p>
+    <w:p>
+      <w:pPr>
+        <w:tabs>
+          <w:tab w:val="right" w:pos="8338" w:leader="dot"/>
+          <w:tab w:val="right" w:pos="9638"/>
+        </w:tabs>
+        <w:spacing w:after="70"/>
+        <w:ind w:left="400"/>
+      </w:pPr>
+      <w:r>
+        <w:rPr>
+          <w:rFonts w:ascii="Calibri" w:cs="Calibri" w:eastAsia="Calibri" w:hAnsi="Calibri"/>
+          <w:sz w:val="22"/>
+          <w:szCs w:val="22"/>
+        </w:rPr>
+        <w:t xml:space="preserve">6.1. Schemat procesu technologicznego</w:t>
+      </w:r>
+      <w:r>
+        <w:rPr>
+          <w:rFonts w:ascii="Calibri" w:cs="Calibri" w:eastAsia="Calibri" w:hAnsi="Calibri"/>
+          <w:sz w:val="22"/>
+          <w:szCs w:val="22"/>
+        </w:rPr>
+        <w:t xml:space="preserve">		</w:t>
+      </w:r>
+    </w:p>
+    <w:p>
+      <w:pPr>
+        <w:tabs>
+          <w:tab w:val="right" w:pos="8338" w:leader="dot"/>
+          <w:tab w:val="right" w:pos="9638"/>
+        </w:tabs>
+        <w:spacing w:after="70"/>
+        <w:ind w:left="400"/>
+      </w:pPr>
+      <w:r>
+        <w:rPr>
+          <w:rFonts w:ascii="Calibri" w:cs="Calibri" w:eastAsia="Calibri" w:hAnsi="Calibri"/>
+          <w:sz w:val="22"/>
+          <w:szCs w:val="22"/>
+        </w:rPr>
+        <w:t xml:space="preserve">6.2. Karta instrukcyjna operacji</w:t>
+      </w:r>
+      <w:r>
+        <w:rPr>
+          <w:rFonts w:ascii="Calibri" w:cs="Calibri" w:eastAsia="Calibri" w:hAnsi="Calibri"/>
+          <w:sz w:val="22"/>
+          <w:szCs w:val="22"/>
+        </w:rPr>
+        <w:t xml:space="preserve">		</w:t>
+      </w:r>
+    </w:p>
+    <w:p>
+      <w:pPr>
+        <w:tabs>
+          <w:tab w:val="right" w:pos="8338" w:leader="dot"/>
+          <w:tab w:val="right" w:pos="9638"/>
+        </w:tabs>
+        <w:spacing w:after="70"/>
+        <w:ind w:left="0"/>
+      </w:pPr>
+      <w:r>
+        <w:rPr>
+          <w:rFonts w:ascii="Calibri" w:cs="Calibri" w:eastAsia="Calibri" w:hAnsi="Calibri"/>
+          <w:sz w:val="22"/>
+          <w:szCs w:val="22"/>
+        </w:rPr>
+        <w:t xml:space="preserve">7. Kontrola jakości po naprawie</w:t>
+      </w:r>
+      <w:r>
+        <w:rPr>
+          <w:rFonts w:ascii="Calibri" w:cs="Calibri" w:eastAsia="Calibri" w:hAnsi="Calibri"/>
+          <w:sz w:val="22"/>
+          <w:szCs w:val="22"/>
+        </w:rPr>
+        <w:t xml:space="preserve">		7%</w:t>
+      </w:r>
+    </w:p>
+    <w:p>
+      <w:pPr>
+        <w:tabs>
+          <w:tab w:val="right" w:pos="8338" w:leader="dot"/>
+          <w:tab w:val="right" w:pos="9638"/>
+        </w:tabs>
+        <w:spacing w:after="70"/>
+        <w:ind w:left="400"/>
+      </w:pPr>
+      <w:r>
+        <w:rPr>
+          <w:rFonts w:ascii="Calibri" w:cs="Calibri" w:eastAsia="Calibri" w:hAnsi="Calibri"/>
+          <w:sz w:val="22"/>
+          <w:szCs w:val="22"/>
+        </w:rPr>
+        <w:t xml:space="preserve">7.1. Kontrola statyczna układu hamulcowego</w:t>
+      </w:r>
+      <w:r>
+        <w:rPr>
+          <w:rFonts w:ascii="Calibri" w:cs="Calibri" w:eastAsia="Calibri" w:hAnsi="Calibri"/>
+          <w:sz w:val="22"/>
+          <w:szCs w:val="22"/>
+        </w:rPr>
+        <w:t xml:space="preserve">		</w:t>
+      </w:r>
+    </w:p>
+    <w:p>
+      <w:pPr>
+        <w:tabs>
+          <w:tab w:val="right" w:pos="8338" w:leader="dot"/>
+          <w:tab w:val="right" w:pos="9638"/>
+        </w:tabs>
+        <w:spacing w:after="70"/>
+        <w:ind w:left="400"/>
+      </w:pPr>
+      <w:r>
+        <w:rPr>
+          <w:rFonts w:ascii="Calibri" w:cs="Calibri" w:eastAsia="Calibri" w:hAnsi="Calibri"/>
+          <w:sz w:val="22"/>
+          <w:szCs w:val="22"/>
+        </w:rPr>
+        <w:t xml:space="preserve">7.2. Badanie skuteczności hamowania na stanowisku rolkowym</w:t>
+      </w:r>
+      <w:r>
+        <w:rPr>
+          <w:rFonts w:ascii="Calibri" w:cs="Calibri" w:eastAsia="Calibri" w:hAnsi="Calibri"/>
+          <w:sz w:val="22"/>
+          <w:szCs w:val="22"/>
+        </w:rPr>
+        <w:t xml:space="preserve">		</w:t>
+      </w:r>
+    </w:p>
+    <w:p>
+      <w:pPr>
+        <w:tabs>
+          <w:tab w:val="right" w:pos="8338" w:leader="dot"/>
+          <w:tab w:val="right" w:pos="9638"/>
+        </w:tabs>
+        <w:spacing w:after="70"/>
+        <w:ind w:left="400"/>
+      </w:pPr>
+      <w:r>
+        <w:rPr>
+          <w:rFonts w:ascii="Calibri" w:cs="Calibri" w:eastAsia="Calibri" w:hAnsi="Calibri"/>
+          <w:sz w:val="22"/>
+          <w:szCs w:val="22"/>
+        </w:rPr>
+        <w:t xml:space="preserve">7.3. Protokół kontroli jakości</w:t>
+      </w:r>
+      <w:r>
+        <w:rPr>
+          <w:rFonts w:ascii="Calibri" w:cs="Calibri" w:eastAsia="Calibri" w:hAnsi="Calibri"/>
+          <w:sz w:val="22"/>
+          <w:szCs w:val="22"/>
+        </w:rPr>
+        <w:t xml:space="preserve">		</w:t>
+      </w:r>
+    </w:p>
+    <w:p>
+      <w:pPr>
+        <w:tabs>
+          <w:tab w:val="right" w:pos="8338" w:leader="dot"/>
+          <w:tab w:val="right" w:pos="9638"/>
+        </w:tabs>
+        <w:spacing w:after="70"/>
+        <w:ind w:left="400"/>
+      </w:pPr>
+      <w:r>
+        <w:rPr>
+          <w:rFonts w:ascii="Calibri" w:cs="Calibri" w:eastAsia="Calibri" w:hAnsi="Calibri"/>
+          <w:sz w:val="22"/>
+          <w:szCs w:val="22"/>
+        </w:rPr>
+        <w:t xml:space="preserve">7.4. Jazda próbna i docieranie klocków</w:t>
+      </w:r>
+      <w:r>
+        <w:rPr>
+          <w:rFonts w:ascii="Calibri" w:cs="Calibri" w:eastAsia="Calibri" w:hAnsi="Calibri"/>
+          <w:sz w:val="22"/>
+          <w:szCs w:val="22"/>
+        </w:rPr>
+        <w:t xml:space="preserve">		</w:t>
+      </w:r>
+    </w:p>
+    <w:p>
+      <w:pPr>
+        <w:tabs>
+          <w:tab w:val="right" w:pos="8338" w:leader="dot"/>
+          <w:tab w:val="right" w:pos="9638"/>
+        </w:tabs>
+        <w:spacing w:after="70"/>
+        <w:ind w:left="0"/>
+      </w:pPr>
+      <w:r>
+        <w:rPr>
+          <w:rFonts w:ascii="Calibri" w:cs="Calibri" w:eastAsia="Calibri" w:hAnsi="Calibri"/>
+          <w:sz w:val="22"/>
+          <w:szCs w:val="22"/>
+        </w:rPr>
+        <w:t xml:space="preserve">8. Typowe błędy wykonawcze i ich skutki</w:t>
+      </w:r>
+      <w:r>
+        <w:rPr>
+          <w:rFonts w:ascii="Calibri" w:cs="Calibri" w:eastAsia="Calibri" w:hAnsi="Calibri"/>
+          <w:sz w:val="22"/>
+          <w:szCs w:val="22"/>
+        </w:rPr>
+        <w:t xml:space="preserve">		4%</w:t>
+      </w:r>
+    </w:p>
+    <w:p>
+      <w:pPr>
+        <w:tabs>
+          <w:tab w:val="right" w:pos="8338" w:leader="dot"/>
+          <w:tab w:val="right" w:pos="9638"/>
+        </w:tabs>
+        <w:spacing w:after="70"/>
+        <w:ind w:left="0"/>
+      </w:pPr>
+      <w:r>
+        <w:rPr>
+          <w:rFonts w:ascii="Calibri" w:cs="Calibri" w:eastAsia="Calibri" w:hAnsi="Calibri"/>
+          <w:sz w:val="22"/>
+          <w:szCs w:val="22"/>
+        </w:rPr>
+        <w:t xml:space="preserve">9. Analiza kosztów naprawy</w:t>
+      </w:r>
+      <w:r>
+        <w:rPr>
+          <w:rFonts w:ascii="Calibri" w:cs="Calibri" w:eastAsia="Calibri" w:hAnsi="Calibri"/>
+          <w:sz w:val="22"/>
+          <w:szCs w:val="22"/>
+        </w:rPr>
+        <w:t xml:space="preserve">		4%</w:t>
+      </w:r>
+    </w:p>
+    <w:p>
+      <w:pPr>
+        <w:tabs>
+          <w:tab w:val="right" w:pos="8338" w:leader="dot"/>
+          <w:tab w:val="right" w:pos="9638"/>
+        </w:tabs>
+        <w:spacing w:after="70"/>
+        <w:ind w:left="400"/>
+      </w:pPr>
+      <w:r>
+        <w:rPr>
+          <w:rFonts w:ascii="Calibri" w:cs="Calibri" w:eastAsia="Calibri" w:hAnsi="Calibri"/>
+          <w:sz w:val="22"/>
+          <w:szCs w:val="22"/>
+        </w:rPr>
+        <w:t xml:space="preserve">9.1. Warianty doboru części</w:t>
+      </w:r>
+      <w:r>
+        <w:rPr>
+          <w:rFonts w:ascii="Calibri" w:cs="Calibri" w:eastAsia="Calibri" w:hAnsi="Calibri"/>
+          <w:sz w:val="22"/>
+          <w:szCs w:val="22"/>
+        </w:rPr>
+        <w:t xml:space="preserve">		</w:t>
+      </w:r>
+    </w:p>
+    <w:p>
+      <w:pPr>
+        <w:tabs>
+          <w:tab w:val="right" w:pos="8338" w:leader="dot"/>
+          <w:tab w:val="right" w:pos="9638"/>
+        </w:tabs>
+        <w:spacing w:after="70"/>
+        <w:ind w:left="400"/>
+      </w:pPr>
+      <w:r>
+        <w:rPr>
+          <w:rFonts w:ascii="Calibri" w:cs="Calibri" w:eastAsia="Calibri" w:hAnsi="Calibri"/>
+          <w:sz w:val="22"/>
+          <w:szCs w:val="22"/>
+        </w:rPr>
+        <w:t xml:space="preserve">9.2. Koszt robocizny</w:t>
+      </w:r>
+      <w:r>
+        <w:rPr>
+          <w:rFonts w:ascii="Calibri" w:cs="Calibri" w:eastAsia="Calibri" w:hAnsi="Calibri"/>
+          <w:sz w:val="22"/>
+          <w:szCs w:val="22"/>
+        </w:rPr>
+        <w:t xml:space="preserve">		</w:t>
+      </w:r>
+    </w:p>
+    <w:p>
+      <w:pPr>
+        <w:tabs>
+          <w:tab w:val="right" w:pos="8338" w:leader="dot"/>
+          <w:tab w:val="right" w:pos="9638"/>
+        </w:tabs>
+        <w:spacing w:after="70"/>
+        <w:ind w:left="400"/>
+      </w:pPr>
+      <w:r>
+        <w:rPr>
+          <w:rFonts w:ascii="Calibri" w:cs="Calibri" w:eastAsia="Calibri" w:hAnsi="Calibri"/>
+          <w:sz w:val="22"/>
+          <w:szCs w:val="22"/>
+        </w:rPr>
+        <w:t xml:space="preserve">9.3. Zestawienie kosztów</w:t>
+      </w:r>
+      <w:r>
+        <w:rPr>
+          <w:rFonts w:ascii="Calibri" w:cs="Calibri" w:eastAsia="Calibri" w:hAnsi="Calibri"/>
+          <w:sz w:val="22"/>
+          <w:szCs w:val="22"/>
+        </w:rPr>
+        <w:t xml:space="preserve">		</w:t>
+      </w:r>
+    </w:p>
+    <w:p>
+      <w:pPr>
+        <w:tabs>
+          <w:tab w:val="right" w:pos="8338" w:leader="dot"/>
+          <w:tab w:val="right" w:pos="9638"/>
+        </w:tabs>
+        <w:spacing w:after="70"/>
+        <w:ind w:left="0"/>
+      </w:pPr>
+      <w:r>
+        <w:rPr>
+          <w:rFonts w:ascii="Calibri" w:cs="Calibri" w:eastAsia="Calibri" w:hAnsi="Calibri"/>
+          <w:sz w:val="22"/>
+          <w:szCs w:val="22"/>
+        </w:rPr>
+        <w:t xml:space="preserve">10. Wnioski</w:t>
+      </w:r>
+      <w:r>
+        <w:rPr>
+          <w:rFonts w:ascii="Calibri" w:cs="Calibri" w:eastAsia="Calibri" w:hAnsi="Calibri"/>
+          <w:sz w:val="22"/>
+          <w:szCs w:val="22"/>
+        </w:rPr>
+        <w:t xml:space="preserve">		3%</w:t>
+      </w:r>
+    </w:p>
+    <w:p>
+      <w:pPr>
+        <w:tabs>
+          <w:tab w:val="right" w:pos="8338" w:leader="dot"/>
+          <w:tab w:val="right" w:pos="9638"/>
+        </w:tabs>
+        <w:spacing w:after="70"/>
+        <w:ind w:left="0"/>
+      </w:pPr>
+      <w:r>
+        <w:rPr>
+          <w:rFonts w:ascii="Calibri" w:cs="Calibri" w:eastAsia="Calibri" w:hAnsi="Calibri"/>
+          <w:sz w:val="22"/>
+          <w:szCs w:val="22"/>
+        </w:rPr>
+        <w:t xml:space="preserve">Bibliografia</w:t>
+      </w:r>
+      <w:r>
+        <w:rPr>
+          <w:rFonts w:ascii="Calibri" w:cs="Calibri" w:eastAsia="Calibri" w:hAnsi="Calibri"/>
+          <w:sz w:val="22"/>
+          <w:szCs w:val="22"/>
+        </w:rPr>
+        <w:t xml:space="preserve">	9	4%</w:t>
+      </w:r>
+    </w:p>
+    <w:p>
+      <w:pPr>
+        <w:tabs>
+          <w:tab w:val="right" w:pos="9638"/>
+        </w:tabs>
+        <w:spacing w:before="80"/>
       </w:pPr>
       <w:r>
         <w:rPr>
           <w:rFonts w:ascii="Calibri" w:cs="Calibri" w:eastAsia="Calibri" w:hAnsi="Calibri"/>
           <w:b/>
           <w:bCs/>
-          <w:sz w:val="30"/>
-          <w:szCs w:val="30"/>
-        </w:rPr>
-        <w:t xml:space="preserve">Spis treści</w:t>
-      </w:r>
-    </w:p>
-    <w:tbl>
-      <w:tblPr>
-        <w:tblW w:type="dxa" w:w="9638"/>
-        <w:tblBorders>
-          <w:top w:val="single" w:color="auto" w:sz="4"/>
-          <w:left w:val="single" w:color="auto" w:sz="4"/>
-          <w:bottom w:val="single" w:color="auto" w:sz="4"/>
-          <w:right w:val="single" w:color="auto" w:sz="4"/>
-          <w:insideH w:val="single" w:color="auto" w:sz="4"/>
-          <w:insideV w:val="single" w:color="auto" w:sz="4"/>
-        </w:tblBorders>
-      </w:tblPr>
-      <w:tblGrid>
-        <w:gridCol w:w="6038"/>
-        <w:gridCol w:w="1100"/>
-        <w:gridCol w:w="1300"/>
-        <w:gridCol w:w="1200"/>
-      </w:tblGrid>
-      <w:tr>
-        <w:trPr>
-          <w:tblHeader/>
-        </w:trPr>
-        <w:tc>
-          <w:tcPr>
-            <w:tcW w:type="dxa" w:w="6038"/>
-            <w:tcBorders>
-              <w:top w:val="single" w:color="000000" w:sz="4"/>
-              <w:left w:val="single" w:color="000000" w:sz="4"/>
-              <w:bottom w:val="single" w:color="000000" w:sz="4"/>
-              <w:right w:val="single" w:color="000000" w:sz="4"/>
-            </w:tcBorders>
-            <w:shd w:fill="C9D7EE" w:color="auto" w:val="clear"/>
-            <w:tcMar>
-              <w:top w:type="dxa" w:w="40"/>
-              <w:left w:type="dxa" w:w="80"/>
-              <w:bottom w:type="dxa" w:w="40"/>
-              <w:right w:type="dxa" w:w="80"/>
-            </w:tcMar>
-            <w:vAlign w:val="center"/>
-          </w:tcPr>
-          <w:p>
-            <w:pPr>
-              <w:spacing w:after="0" w:before="0" w:line="240"/>
-              <w:jc w:val="center"/>
-            </w:pPr>
-            <w:r>
-              <w:rPr>
-                <w:rFonts w:ascii="Calibri" w:cs="Calibri" w:eastAsia="Calibri" w:hAnsi="Calibri"/>
-                <w:b/>
-                <w:bCs/>
-                <w:sz w:val="19"/>
-                <w:szCs w:val="19"/>
-              </w:rPr>
-              <w:t xml:space="preserve">Rozdział</w:t>
-            </w:r>
-          </w:p>
-        </w:tc>
-        <w:tc>
-          <w:tcPr>
-            <w:tcW w:type="dxa" w:w="1100"/>
-            <w:tcBorders>
-              <w:top w:val="single" w:color="000000" w:sz="4"/>
-              <w:left w:val="single" w:color="000000" w:sz="4"/>
-              <w:bottom w:val="single" w:color="000000" w:sz="4"/>
-              <w:right w:val="single" w:color="000000" w:sz="4"/>
-            </w:tcBorders>
-            <w:shd w:fill="C9D7EE" w:color="auto" w:val="clear"/>
-            <w:tcMar>
-              <w:top w:type="dxa" w:w="40"/>
-              <w:left w:type="dxa" w:w="80"/>
-              <w:bottom w:type="dxa" w:w="40"/>
-              <w:right w:type="dxa" w:w="80"/>
-            </w:tcMar>
-            <w:vAlign w:val="center"/>
-          </w:tcPr>
-          <w:p>
-            <w:pPr>
-              <w:spacing w:after="0" w:before="0" w:line="240"/>
-              <w:jc w:val="center"/>
-            </w:pPr>
-            <w:r>
-              <w:rPr>
-                <w:rFonts w:ascii="Calibri" w:cs="Calibri" w:eastAsia="Calibri" w:hAnsi="Calibri"/>
-                <w:b/>
-                <w:bCs/>
-                <w:sz w:val="19"/>
-                <w:szCs w:val="19"/>
-              </w:rPr>
-              <w:t xml:space="preserve">Strona</w:t>
-            </w:r>
-          </w:p>
-        </w:tc>
-        <w:tc>
-          <w:tcPr>
-            <w:tcW w:type="dxa" w:w="1300"/>
-            <w:tcBorders>
-              <w:top w:val="single" w:color="000000" w:sz="4"/>
-              <w:left w:val="single" w:color="000000" w:sz="4"/>
-              <w:bottom w:val="single" w:color="000000" w:sz="4"/>
-              <w:right w:val="single" w:color="000000" w:sz="4"/>
-            </w:tcBorders>
-            <w:shd w:fill="C9D7EE" w:color="auto" w:val="clear"/>
-            <w:tcMar>
-              <w:top w:type="dxa" w:w="40"/>
-              <w:left w:type="dxa" w:w="80"/>
-              <w:bottom w:type="dxa" w:w="40"/>
-              <w:right w:type="dxa" w:w="80"/>
-            </w:tcMar>
-            <w:vAlign w:val="center"/>
-          </w:tcPr>
-          <w:p>
-            <w:pPr>
-              <w:spacing w:after="0" w:before="0" w:line="240"/>
-              <w:jc w:val="center"/>
-            </w:pPr>
-            <w:r>
-              <w:rPr>
-                <w:rFonts w:ascii="Calibri" w:cs="Calibri" w:eastAsia="Calibri" w:hAnsi="Calibri"/>
-                <w:b/>
-                <w:bCs/>
-                <w:sz w:val="19"/>
-                <w:szCs w:val="19"/>
-              </w:rPr>
-              <w:t xml:space="preserve">Udział w projekcie [%]</w:t>
-            </w:r>
-          </w:p>
-        </w:tc>
-        <w:tc>
-          <w:tcPr>
-            <w:tcW w:type="dxa" w:w="1200"/>
-            <w:tcBorders>
-              <w:top w:val="single" w:color="000000" w:sz="4"/>
-              <w:left w:val="single" w:color="000000" w:sz="4"/>
-              <w:bottom w:val="single" w:color="000000" w:sz="4"/>
-              <w:right w:val="single" w:color="000000" w:sz="4"/>
-            </w:tcBorders>
-            <w:shd w:fill="C9D7EE" w:color="auto" w:val="clear"/>
-            <w:tcMar>
-              <w:top w:type="dxa" w:w="40"/>
-              <w:left w:type="dxa" w:w="80"/>
-              <w:bottom w:type="dxa" w:w="40"/>
-              <w:right w:type="dxa" w:w="80"/>
-            </w:tcMar>
-            <w:vAlign w:val="center"/>
-          </w:tcPr>
-          <w:p>
-            <w:pPr>
-              <w:spacing w:after="0" w:before="0" w:line="240"/>
-              <w:jc w:val="center"/>
-            </w:pPr>
-            <w:r>
-              <w:rPr>
-                <w:rFonts w:ascii="Calibri" w:cs="Calibri" w:eastAsia="Calibri" w:hAnsi="Calibri"/>
-                <w:b/>
-                <w:bCs/>
-                <w:sz w:val="19"/>
-                <w:szCs w:val="19"/>
-              </w:rPr>
-              <w:t xml:space="preserve">Stan</w:t>
-            </w:r>
-          </w:p>
-        </w:tc>
-      </w:tr>
-      <w:tr>
-        <w:trPr>
-          <w:cantSplit/>
-        </w:trPr>
-        <w:tc>
-          <w:tcPr>
-            <w:tcW w:type="dxa" w:w="6038"/>
-            <w:tcBorders>
-              <w:top w:val="single" w:color="000000" w:sz="4"/>
-              <w:left w:val="single" w:color="000000" w:sz="4"/>
-              <w:bottom w:val="single" w:color="000000" w:sz="4"/>
-              <w:right w:val="single" w:color="000000" w:sz="4"/>
-            </w:tcBorders>
-            <w:tcMar>
-              <w:top w:type="dxa" w:w="40"/>
-              <w:left w:type="dxa" w:w="80"/>
-              <w:bottom w:type="dxa" w:w="40"/>
-              <w:right w:type="dxa" w:w="80"/>
-            </w:tcMar>
-            <w:vAlign w:val="center"/>
-          </w:tcPr>
-          <w:p>
-            <w:pPr>
-              <w:spacing w:after="0" w:before="0" w:line="240"/>
-              <w:jc w:val="left"/>
-            </w:pPr>
-            <w:r>
-              <w:rPr>
-                <w:rFonts w:ascii="Calibri" w:cs="Calibri" w:eastAsia="Calibri" w:hAnsi="Calibri"/>
-                <w:b/>
-                <w:bCs/>
-                <w:sz w:val="19"/>
-                <w:szCs w:val="19"/>
-              </w:rPr>
-              <w:t xml:space="preserve">1. Wstęp</w:t>
-            </w:r>
-          </w:p>
-        </w:tc>
-        <w:tc>
-          <w:tcPr>
-            <w:tcW w:type="dxa" w:w="1100"/>
-            <w:tcBorders>
-              <w:top w:val="single" w:color="000000" w:sz="4"/>
-              <w:left w:val="single" w:color="000000" w:sz="4"/>
-              <w:bottom w:val="single" w:color="000000" w:sz="4"/>
-              <w:right w:val="single" w:color="000000" w:sz="4"/>
-            </w:tcBorders>
-            <w:tcMar>
-              <w:top w:type="dxa" w:w="40"/>
-              <w:left w:type="dxa" w:w="80"/>
-              <w:bottom w:type="dxa" w:w="40"/>
-              <w:right w:type="dxa" w:w="80"/>
-            </w:tcMar>
-            <w:vAlign w:val="center"/>
-          </w:tcPr>
-          <w:p>
-            <w:pPr>
-              <w:spacing w:after="0" w:before="0" w:line="240"/>
-              <w:jc w:val="center"/>
-            </w:pPr>
-            <w:r>
-              <w:rPr>
-                <w:rFonts w:ascii="Calibri" w:cs="Calibri" w:eastAsia="Calibri" w:hAnsi="Calibri"/>
-                <w:sz w:val="19"/>
-                <w:szCs w:val="19"/>
-              </w:rPr>
-              <w:t xml:space="preserve">3</w:t>
-            </w:r>
-          </w:p>
-        </w:tc>
-        <w:tc>
-          <w:tcPr>
-            <w:tcW w:type="dxa" w:w="1300"/>
-            <w:tcBorders>
-              <w:top w:val="single" w:color="000000" w:sz="4"/>
-              <w:left w:val="single" w:color="000000" w:sz="4"/>
-              <w:bottom w:val="single" w:color="000000" w:sz="4"/>
-              <w:right w:val="single" w:color="000000" w:sz="4"/>
-            </w:tcBorders>
-            <w:tcMar>
-              <w:top w:type="dxa" w:w="40"/>
-              <w:left w:type="dxa" w:w="80"/>
-              <w:bottom w:type="dxa" w:w="40"/>
-              <w:right w:type="dxa" w:w="80"/>
-            </w:tcMar>
-            <w:vAlign w:val="center"/>
-          </w:tcPr>
-          <w:p>
-            <w:pPr>
-              <w:spacing w:after="0" w:before="0" w:line="240"/>
-              <w:jc w:val="center"/>
-            </w:pPr>
-            <w:r>
-              <w:rPr>
-                <w:rFonts w:ascii="Calibri" w:cs="Calibri" w:eastAsia="Calibri" w:hAnsi="Calibri"/>
-                <w:b/>
-                <w:bCs/>
-                <w:sz w:val="19"/>
-                <w:szCs w:val="19"/>
-              </w:rPr>
-              <w:t xml:space="preserve">3%</w:t>
-            </w:r>
-          </w:p>
-        </w:tc>
-        <w:tc>
-          <w:tcPr>
-            <w:tcW w:type="dxa" w:w="1200"/>
-            <w:tcBorders>
-              <w:top w:val="single" w:color="000000" w:sz="4"/>
-              <w:left w:val="single" w:color="000000" w:sz="4"/>
-              <w:bottom w:val="single" w:color="000000" w:sz="4"/>
-              <w:right w:val="single" w:color="000000" w:sz="4"/>
-            </w:tcBorders>
-            <w:tcMar>
-              <w:top w:type="dxa" w:w="40"/>
-              <w:left w:type="dxa" w:w="80"/>
-              <w:bottom w:type="dxa" w:w="40"/>
-              <w:right w:type="dxa" w:w="80"/>
-            </w:tcMar>
-            <w:vAlign w:val="center"/>
-          </w:tcPr>
-          <w:p>
-            <w:pPr>
-              <w:spacing w:after="0" w:before="0" w:line="240"/>
-              <w:jc w:val="center"/>
-            </w:pPr>
-            <w:r>
-              <w:rPr>
-                <w:rFonts w:ascii="Calibri" w:cs="Calibri" w:eastAsia="Calibri" w:hAnsi="Calibri"/>
-                <w:sz w:val="17"/>
-                <w:szCs w:val="17"/>
-              </w:rPr>
-              <w:t xml:space="preserve">opracowany</w:t>
-            </w:r>
-          </w:p>
-        </w:tc>
-      </w:tr>
-      <w:tr>
-        <w:trPr>
-          <w:cantSplit/>
-        </w:trPr>
-        <w:tc>
-          <w:tcPr>
-            <w:tcW w:type="dxa" w:w="6038"/>
-            <w:tcBorders>
-              <w:top w:val="single" w:color="000000" w:sz="4"/>
-              <w:left w:val="single" w:color="000000" w:sz="4"/>
-              <w:bottom w:val="single" w:color="000000" w:sz="4"/>
-              <w:right w:val="single" w:color="000000" w:sz="4"/>
-            </w:tcBorders>
-            <w:tcMar>
-              <w:top w:type="dxa" w:w="40"/>
-              <w:left w:type="dxa" w:w="80"/>
-              <w:bottom w:type="dxa" w:w="40"/>
-              <w:right w:type="dxa" w:w="80"/>
-            </w:tcMar>
-            <w:vAlign w:val="center"/>
-          </w:tcPr>
-          <w:p>
-            <w:pPr>
-              <w:spacing w:after="0" w:before="0" w:line="240"/>
-              <w:jc w:val="left"/>
-            </w:pPr>
-            <w:r>
-              <w:rPr>
-                <w:rFonts w:ascii="Calibri" w:cs="Calibri" w:eastAsia="Calibri" w:hAnsi="Calibri"/>
-                <w:b/>
-                <w:bCs/>
-                <w:sz w:val="19"/>
-                <w:szCs w:val="19"/>
-              </w:rPr>
-              <w:t xml:space="preserve">2. Charakterystyka obiektu naprawy</w:t>
-            </w:r>
-          </w:p>
-        </w:tc>
-        <w:tc>
-          <w:tcPr>
-            <w:tcW w:type="dxa" w:w="1100"/>
-            <w:tcBorders>
-              <w:top w:val="single" w:color="000000" w:sz="4"/>
-              <w:left w:val="single" w:color="000000" w:sz="4"/>
-              <w:bottom w:val="single" w:color="000000" w:sz="4"/>
-              <w:right w:val="single" w:color="000000" w:sz="4"/>
-            </w:tcBorders>
-            <w:tcMar>
-              <w:top w:type="dxa" w:w="40"/>
-              <w:left w:type="dxa" w:w="80"/>
-              <w:bottom w:type="dxa" w:w="40"/>
-              <w:right w:type="dxa" w:w="80"/>
-            </w:tcMar>
-            <w:vAlign w:val="center"/>
-          </w:tcPr>
-          <w:p>
-            <w:pPr>
-              <w:spacing w:after="0" w:before="0" w:line="240"/>
-              <w:jc w:val="center"/>
-            </w:pPr>
-            <w:r>
-              <w:rPr>
-                <w:rFonts w:ascii="Calibri" w:cs="Calibri" w:eastAsia="Calibri" w:hAnsi="Calibri"/>
-                <w:sz w:val="19"/>
-                <w:szCs w:val="19"/>
-              </w:rPr>
-              <w:t xml:space="preserve">4</w:t>
-            </w:r>
-          </w:p>
-        </w:tc>
-        <w:tc>
-          <w:tcPr>
-            <w:tcW w:type="dxa" w:w="1300"/>
-            <w:tcBorders>
-              <w:top w:val="single" w:color="000000" w:sz="4"/>
-              <w:left w:val="single" w:color="000000" w:sz="4"/>
-              <w:bottom w:val="single" w:color="000000" w:sz="4"/>
-              <w:right w:val="single" w:color="000000" w:sz="4"/>
-            </w:tcBorders>
-            <w:tcMar>
-              <w:top w:type="dxa" w:w="40"/>
-              <w:left w:type="dxa" w:w="80"/>
-              <w:bottom w:type="dxa" w:w="40"/>
-              <w:right w:type="dxa" w:w="80"/>
-            </w:tcMar>
-            <w:vAlign w:val="center"/>
-          </w:tcPr>
-          <w:p>
-            <w:pPr>
-              <w:spacing w:after="0" w:before="0" w:line="240"/>
-              <w:jc w:val="center"/>
-            </w:pPr>
-            <w:r>
-              <w:rPr>
-                <w:rFonts w:ascii="Calibri" w:cs="Calibri" w:eastAsia="Calibri" w:hAnsi="Calibri"/>
-                <w:b/>
-                <w:bCs/>
-                <w:sz w:val="19"/>
-                <w:szCs w:val="19"/>
-              </w:rPr>
-              <w:t xml:space="preserve">9%</w:t>
-            </w:r>
-          </w:p>
-        </w:tc>
-        <w:tc>
-          <w:tcPr>
-            <w:tcW w:type="dxa" w:w="1200"/>
-            <w:tcBorders>
-              <w:top w:val="single" w:color="000000" w:sz="4"/>
-              <w:left w:val="single" w:color="000000" w:sz="4"/>
-              <w:bottom w:val="single" w:color="000000" w:sz="4"/>
-              <w:right w:val="single" w:color="000000" w:sz="4"/>
-            </w:tcBorders>
-            <w:tcMar>
-              <w:top w:type="dxa" w:w="40"/>
-              <w:left w:type="dxa" w:w="80"/>
-              <w:bottom w:type="dxa" w:w="40"/>
-              <w:right w:type="dxa" w:w="80"/>
-            </w:tcMar>
-            <w:vAlign w:val="center"/>
-          </w:tcPr>
-          <w:p>
-            <w:pPr>
-              <w:spacing w:after="0" w:before="0" w:line="240"/>
-              <w:jc w:val="center"/>
-            </w:pPr>
-            <w:r>
-              <w:rPr>
-                <w:rFonts w:ascii="Calibri" w:cs="Calibri" w:eastAsia="Calibri" w:hAnsi="Calibri"/>
-                <w:sz w:val="17"/>
-                <w:szCs w:val="17"/>
-              </w:rPr>
-              <w:t xml:space="preserve">opracowany</w:t>
-            </w:r>
-          </w:p>
-        </w:tc>
-      </w:tr>
-      <w:tr>
-        <w:trPr>
-          <w:cantSplit/>
-        </w:trPr>
-        <w:tc>
-          <w:tcPr>
-            <w:tcW w:type="dxa" w:w="6038"/>
-            <w:tcBorders>
-              <w:top w:val="single" w:color="000000" w:sz="4"/>
-              <w:left w:val="single" w:color="000000" w:sz="4"/>
-              <w:bottom w:val="single" w:color="000000" w:sz="4"/>
-              <w:right w:val="single" w:color="000000" w:sz="4"/>
-            </w:tcBorders>
-            <w:tcMar>
-              <w:top w:type="dxa" w:w="40"/>
-              <w:left w:type="dxa" w:w="80"/>
-              <w:bottom w:type="dxa" w:w="40"/>
-              <w:right w:type="dxa" w:w="80"/>
-            </w:tcMar>
-            <w:vAlign w:val="center"/>
-          </w:tcPr>
-          <w:p>
-            <w:pPr>
-              <w:spacing w:after="0" w:before="0" w:line="240"/>
-              <w:jc w:val="left"/>
-            </w:pPr>
-            <w:r>
-              <w:rPr>
-                <w:rFonts w:ascii="Calibri" w:cs="Calibri" w:eastAsia="Calibri" w:hAnsi="Calibri"/>
-                <w:sz w:val="19"/>
-                <w:szCs w:val="19"/>
-              </w:rPr>
-              <w:t xml:space="preserve">      2.1. Dane techniczne pojazdu</w:t>
-            </w:r>
-          </w:p>
-        </w:tc>
-        <w:tc>
-          <w:tcPr>
-            <w:tcW w:type="dxa" w:w="1100"/>
-            <w:tcBorders>
-              <w:top w:val="single" w:color="000000" w:sz="4"/>
-              <w:left w:val="single" w:color="000000" w:sz="4"/>
-              <w:bottom w:val="single" w:color="000000" w:sz="4"/>
-              <w:right w:val="single" w:color="000000" w:sz="4"/>
-            </w:tcBorders>
-            <w:tcMar>
-              <w:top w:type="dxa" w:w="40"/>
-              <w:left w:type="dxa" w:w="80"/>
-              <w:bottom w:type="dxa" w:w="40"/>
-              <w:right w:type="dxa" w:w="80"/>
-            </w:tcMar>
-            <w:vAlign w:val="center"/>
-          </w:tcPr>
-          <w:p>
-            <w:pPr>
-              <w:spacing w:after="0" w:before="0" w:line="240"/>
-              <w:jc w:val="center"/>
-            </w:pPr>
-            <w:r>
-              <w:rPr>
-                <w:rFonts w:ascii="Calibri" w:cs="Calibri" w:eastAsia="Calibri" w:hAnsi="Calibri"/>
-                <w:sz w:val="19"/>
-                <w:szCs w:val="19"/>
-              </w:rPr>
-              <w:t xml:space="preserve">4</w:t>
-            </w:r>
-          </w:p>
-        </w:tc>
-        <w:tc>
-          <w:tcPr>
-            <w:tcW w:type="dxa" w:w="1300"/>
-            <w:tcBorders>
-              <w:top w:val="single" w:color="000000" w:sz="4"/>
-              <w:left w:val="single" w:color="000000" w:sz="4"/>
-              <w:bottom w:val="single" w:color="000000" w:sz="4"/>
-              <w:right w:val="single" w:color="000000" w:sz="4"/>
-            </w:tcBorders>
-            <w:tcMar>
-              <w:top w:type="dxa" w:w="40"/>
-              <w:left w:type="dxa" w:w="80"/>
-              <w:bottom w:type="dxa" w:w="40"/>
-              <w:right w:type="dxa" w:w="80"/>
-            </w:tcMar>
-            <w:vAlign w:val="center"/>
-          </w:tcPr>
-          <w:p>
-            <w:pPr>
-              <w:spacing w:after="0" w:before="0" w:line="240"/>
-              <w:jc w:val="center"/>
-            </w:pPr>
-          </w:p>
-        </w:tc>
-        <w:tc>
-          <w:tcPr>
-            <w:tcW w:type="dxa" w:w="1200"/>
-            <w:tcBorders>
-              <w:top w:val="single" w:color="000000" w:sz="4"/>
-              <w:left w:val="single" w:color="000000" w:sz="4"/>
-              <w:bottom w:val="single" w:color="000000" w:sz="4"/>
-              <w:right w:val="single" w:color="000000" w:sz="4"/>
-            </w:tcBorders>
-            <w:tcMar>
-              <w:top w:type="dxa" w:w="40"/>
-              <w:left w:type="dxa" w:w="80"/>
-              <w:bottom w:type="dxa" w:w="40"/>
-              <w:right w:type="dxa" w:w="80"/>
-            </w:tcMar>
-            <w:vAlign w:val="center"/>
-          </w:tcPr>
-          <w:p>
-            <w:pPr>
-              <w:spacing w:after="0" w:before="0" w:line="240"/>
-              <w:jc w:val="center"/>
-            </w:pPr>
-          </w:p>
-        </w:tc>
-      </w:tr>
-      <w:tr>
-        <w:trPr>
-          <w:cantSplit/>
-        </w:trPr>
-        <w:tc>
-          <w:tcPr>
-            <w:tcW w:type="dxa" w:w="6038"/>
-            <w:tcBorders>
-              <w:top w:val="single" w:color="000000" w:sz="4"/>
-              <w:left w:val="single" w:color="000000" w:sz="4"/>
-              <w:bottom w:val="single" w:color="000000" w:sz="4"/>
-              <w:right w:val="single" w:color="000000" w:sz="4"/>
-            </w:tcBorders>
-            <w:tcMar>
-              <w:top w:type="dxa" w:w="40"/>
-              <w:left w:type="dxa" w:w="80"/>
-              <w:bottom w:type="dxa" w:w="40"/>
-              <w:right w:type="dxa" w:w="80"/>
-            </w:tcMar>
-            <w:vAlign w:val="center"/>
-          </w:tcPr>
-          <w:p>
-            <w:pPr>
-              <w:spacing w:after="0" w:before="0" w:line="240"/>
-              <w:jc w:val="left"/>
-            </w:pPr>
-            <w:r>
-              <w:rPr>
-                <w:rFonts w:ascii="Calibri" w:cs="Calibri" w:eastAsia="Calibri" w:hAnsi="Calibri"/>
-                <w:sz w:val="19"/>
-                <w:szCs w:val="19"/>
-              </w:rPr>
-              <w:t xml:space="preserve">      2.2. Budowa hamulca tarczowego osi przedniej</w:t>
-            </w:r>
-          </w:p>
-        </w:tc>
-        <w:tc>
-          <w:tcPr>
-            <w:tcW w:type="dxa" w:w="1100"/>
-            <w:tcBorders>
-              <w:top w:val="single" w:color="000000" w:sz="4"/>
-              <w:left w:val="single" w:color="000000" w:sz="4"/>
-              <w:bottom w:val="single" w:color="000000" w:sz="4"/>
-              <w:right w:val="single" w:color="000000" w:sz="4"/>
-            </w:tcBorders>
-            <w:tcMar>
-              <w:top w:type="dxa" w:w="40"/>
-              <w:left w:type="dxa" w:w="80"/>
-              <w:bottom w:type="dxa" w:w="40"/>
-              <w:right w:type="dxa" w:w="80"/>
-            </w:tcMar>
-            <w:vAlign w:val="center"/>
-          </w:tcPr>
-          <w:p>
-            <w:pPr>
-              <w:spacing w:after="0" w:before="0" w:line="240"/>
-              <w:jc w:val="center"/>
-            </w:pPr>
-            <w:r>
-              <w:rPr>
-                <w:rFonts w:ascii="Calibri" w:cs="Calibri" w:eastAsia="Calibri" w:hAnsi="Calibri"/>
-                <w:sz w:val="19"/>
-                <w:szCs w:val="19"/>
-              </w:rPr>
-              <w:t xml:space="preserve">5</w:t>
-            </w:r>
-          </w:p>
-        </w:tc>
-        <w:tc>
-          <w:tcPr>
-            <w:tcW w:type="dxa" w:w="1300"/>
-            <w:tcBorders>
-              <w:top w:val="single" w:color="000000" w:sz="4"/>
-              <w:left w:val="single" w:color="000000" w:sz="4"/>
-              <w:bottom w:val="single" w:color="000000" w:sz="4"/>
-              <w:right w:val="single" w:color="000000" w:sz="4"/>
-            </w:tcBorders>
-            <w:tcMar>
-              <w:top w:type="dxa" w:w="40"/>
-              <w:left w:type="dxa" w:w="80"/>
-              <w:bottom w:type="dxa" w:w="40"/>
-              <w:right w:type="dxa" w:w="80"/>
-            </w:tcMar>
-            <w:vAlign w:val="center"/>
-          </w:tcPr>
-          <w:p>
-            <w:pPr>
-              <w:spacing w:after="0" w:before="0" w:line="240"/>
-              <w:jc w:val="center"/>
-            </w:pPr>
-          </w:p>
-        </w:tc>
-        <w:tc>
-          <w:tcPr>
-            <w:tcW w:type="dxa" w:w="1200"/>
-            <w:tcBorders>
-              <w:top w:val="single" w:color="000000" w:sz="4"/>
-              <w:left w:val="single" w:color="000000" w:sz="4"/>
-              <w:bottom w:val="single" w:color="000000" w:sz="4"/>
-              <w:right w:val="single" w:color="000000" w:sz="4"/>
-            </w:tcBorders>
-            <w:tcMar>
-              <w:top w:type="dxa" w:w="40"/>
-              <w:left w:type="dxa" w:w="80"/>
-              <w:bottom w:type="dxa" w:w="40"/>
-              <w:right w:type="dxa" w:w="80"/>
-            </w:tcMar>
-            <w:vAlign w:val="center"/>
-          </w:tcPr>
-          <w:p>
-            <w:pPr>
-              <w:spacing w:after="0" w:before="0" w:line="240"/>
-              <w:jc w:val="center"/>
-            </w:pPr>
-          </w:p>
-        </w:tc>
-      </w:tr>
-      <w:tr>
-        <w:trPr>
-          <w:cantSplit/>
-        </w:trPr>
-        <w:tc>
-          <w:tcPr>
-            <w:tcW w:type="dxa" w:w="6038"/>
-            <w:tcBorders>
-              <w:top w:val="single" w:color="000000" w:sz="4"/>
-              <w:left w:val="single" w:color="000000" w:sz="4"/>
-              <w:bottom w:val="single" w:color="000000" w:sz="4"/>
-              <w:right w:val="single" w:color="000000" w:sz="4"/>
-            </w:tcBorders>
-            <w:tcMar>
-              <w:top w:type="dxa" w:w="40"/>
-              <w:left w:type="dxa" w:w="80"/>
-              <w:bottom w:type="dxa" w:w="40"/>
-              <w:right w:type="dxa" w:w="80"/>
-            </w:tcMar>
-            <w:vAlign w:val="center"/>
-          </w:tcPr>
-          <w:p>
-            <w:pPr>
-              <w:spacing w:after="0" w:before="0" w:line="240"/>
-              <w:jc w:val="left"/>
-            </w:pPr>
-            <w:r>
-              <w:rPr>
-                <w:rFonts w:ascii="Calibri" w:cs="Calibri" w:eastAsia="Calibri" w:hAnsi="Calibri"/>
-                <w:b/>
-                <w:bCs/>
-                <w:sz w:val="19"/>
-                <w:szCs w:val="19"/>
-              </w:rPr>
-              <w:t xml:space="preserve">3. Warunki techniczne weryfikacji i montażu</w:t>
-            </w:r>
-          </w:p>
-        </w:tc>
-        <w:tc>
-          <w:tcPr>
-            <w:tcW w:type="dxa" w:w="1100"/>
-            <w:tcBorders>
-              <w:top w:val="single" w:color="000000" w:sz="4"/>
-              <w:left w:val="single" w:color="000000" w:sz="4"/>
-              <w:bottom w:val="single" w:color="000000" w:sz="4"/>
-              <w:right w:val="single" w:color="000000" w:sz="4"/>
-            </w:tcBorders>
-            <w:tcMar>
-              <w:top w:type="dxa" w:w="40"/>
-              <w:left w:type="dxa" w:w="80"/>
-              <w:bottom w:type="dxa" w:w="40"/>
-              <w:right w:type="dxa" w:w="80"/>
-            </w:tcMar>
-            <w:vAlign w:val="center"/>
-          </w:tcPr>
-          <w:p>
-            <w:pPr>
-              <w:spacing w:after="0" w:before="0" w:line="240"/>
-              <w:jc w:val="center"/>
-            </w:pPr>
-            <w:r>
-              <w:rPr>
-                <w:rFonts w:ascii="Calibri" w:cs="Calibri" w:eastAsia="Calibri" w:hAnsi="Calibri"/>
-                <w:sz w:val="19"/>
-                <w:szCs w:val="19"/>
-              </w:rPr>
-              <w:t xml:space="preserve">7</w:t>
-            </w:r>
-          </w:p>
-        </w:tc>
-        <w:tc>
-          <w:tcPr>
-            <w:tcW w:type="dxa" w:w="1300"/>
-            <w:tcBorders>
-              <w:top w:val="single" w:color="000000" w:sz="4"/>
-              <w:left w:val="single" w:color="000000" w:sz="4"/>
-              <w:bottom w:val="single" w:color="000000" w:sz="4"/>
-              <w:right w:val="single" w:color="000000" w:sz="4"/>
-            </w:tcBorders>
-            <w:tcMar>
-              <w:top w:type="dxa" w:w="40"/>
-              <w:left w:type="dxa" w:w="80"/>
-              <w:bottom w:type="dxa" w:w="40"/>
-              <w:right w:type="dxa" w:w="80"/>
-            </w:tcMar>
-            <w:vAlign w:val="center"/>
-          </w:tcPr>
-          <w:p>
-            <w:pPr>
-              <w:spacing w:after="0" w:before="0" w:line="240"/>
-              <w:jc w:val="center"/>
-            </w:pPr>
-            <w:r>
-              <w:rPr>
-                <w:rFonts w:ascii="Calibri" w:cs="Calibri" w:eastAsia="Calibri" w:hAnsi="Calibri"/>
-                <w:b/>
-                <w:bCs/>
-                <w:sz w:val="19"/>
-                <w:szCs w:val="19"/>
-              </w:rPr>
-              <w:t xml:space="preserve">6%</w:t>
-            </w:r>
-          </w:p>
-        </w:tc>
-        <w:tc>
-          <w:tcPr>
-            <w:tcW w:type="dxa" w:w="1200"/>
-            <w:tcBorders>
-              <w:top w:val="single" w:color="000000" w:sz="4"/>
-              <w:left w:val="single" w:color="000000" w:sz="4"/>
-              <w:bottom w:val="single" w:color="000000" w:sz="4"/>
-              <w:right w:val="single" w:color="000000" w:sz="4"/>
-            </w:tcBorders>
-            <w:tcMar>
-              <w:top w:type="dxa" w:w="40"/>
-              <w:left w:type="dxa" w:w="80"/>
-              <w:bottom w:type="dxa" w:w="40"/>
-              <w:right w:type="dxa" w:w="80"/>
-            </w:tcMar>
-            <w:vAlign w:val="center"/>
-          </w:tcPr>
-          <w:p>
-            <w:pPr>
-              <w:spacing w:after="0" w:before="0" w:line="240"/>
-              <w:jc w:val="center"/>
-            </w:pPr>
-            <w:r>
-              <w:rPr>
-                <w:rFonts w:ascii="Calibri" w:cs="Calibri" w:eastAsia="Calibri" w:hAnsi="Calibri"/>
-                <w:sz w:val="17"/>
-                <w:szCs w:val="17"/>
-              </w:rPr>
-              <w:t xml:space="preserve">opracowany</w:t>
-            </w:r>
-          </w:p>
-        </w:tc>
-      </w:tr>
-      <w:tr>
-        <w:trPr>
-          <w:cantSplit/>
-        </w:trPr>
-        <w:tc>
-          <w:tcPr>
-            <w:tcW w:type="dxa" w:w="6038"/>
-            <w:tcBorders>
-              <w:top w:val="single" w:color="000000" w:sz="4"/>
-              <w:left w:val="single" w:color="000000" w:sz="4"/>
-              <w:bottom w:val="single" w:color="000000" w:sz="4"/>
-              <w:right w:val="single" w:color="000000" w:sz="4"/>
-            </w:tcBorders>
-            <w:tcMar>
-              <w:top w:type="dxa" w:w="40"/>
-              <w:left w:type="dxa" w:w="80"/>
-              <w:bottom w:type="dxa" w:w="40"/>
-              <w:right w:type="dxa" w:w="80"/>
-            </w:tcMar>
-            <w:vAlign w:val="center"/>
-          </w:tcPr>
-          <w:p>
-            <w:pPr>
-              <w:spacing w:after="0" w:before="0" w:line="240"/>
-              <w:jc w:val="left"/>
-            </w:pPr>
-            <w:r>
-              <w:rPr>
-                <w:rFonts w:ascii="Calibri" w:cs="Calibri" w:eastAsia="Calibri" w:hAnsi="Calibri"/>
-                <w:sz w:val="19"/>
-                <w:szCs w:val="19"/>
-              </w:rPr>
-              <w:t xml:space="preserve">      3.1. Wymiary nominalne i dopuszczalne</w:t>
-            </w:r>
-          </w:p>
-        </w:tc>
-        <w:tc>
-          <w:tcPr>
-            <w:tcW w:type="dxa" w:w="1100"/>
-            <w:tcBorders>
-              <w:top w:val="single" w:color="000000" w:sz="4"/>
-              <w:left w:val="single" w:color="000000" w:sz="4"/>
-              <w:bottom w:val="single" w:color="000000" w:sz="4"/>
-              <w:right w:val="single" w:color="000000" w:sz="4"/>
-            </w:tcBorders>
-            <w:tcMar>
-              <w:top w:type="dxa" w:w="40"/>
-              <w:left w:type="dxa" w:w="80"/>
-              <w:bottom w:type="dxa" w:w="40"/>
-              <w:right w:type="dxa" w:w="80"/>
-            </w:tcMar>
-            <w:vAlign w:val="center"/>
-          </w:tcPr>
-          <w:p>
-            <w:pPr>
-              <w:spacing w:after="0" w:before="0" w:line="240"/>
-              <w:jc w:val="center"/>
-            </w:pPr>
-            <w:r>
-              <w:rPr>
-                <w:rFonts w:ascii="Calibri" w:cs="Calibri" w:eastAsia="Calibri" w:hAnsi="Calibri"/>
-                <w:sz w:val="19"/>
-                <w:szCs w:val="19"/>
-              </w:rPr>
-              <w:t xml:space="preserve">7</w:t>
-            </w:r>
-          </w:p>
-        </w:tc>
-        <w:tc>
-          <w:tcPr>
-            <w:tcW w:type="dxa" w:w="1300"/>
-            <w:tcBorders>
-              <w:top w:val="single" w:color="000000" w:sz="4"/>
-              <w:left w:val="single" w:color="000000" w:sz="4"/>
-              <w:bottom w:val="single" w:color="000000" w:sz="4"/>
-              <w:right w:val="single" w:color="000000" w:sz="4"/>
-            </w:tcBorders>
-            <w:tcMar>
-              <w:top w:type="dxa" w:w="40"/>
-              <w:left w:type="dxa" w:w="80"/>
-              <w:bottom w:type="dxa" w:w="40"/>
-              <w:right w:type="dxa" w:w="80"/>
-            </w:tcMar>
-            <w:vAlign w:val="center"/>
-          </w:tcPr>
-          <w:p>
-            <w:pPr>
-              <w:spacing w:after="0" w:before="0" w:line="240"/>
-              <w:jc w:val="center"/>
-            </w:pPr>
-          </w:p>
-        </w:tc>
-        <w:tc>
-          <w:tcPr>
-            <w:tcW w:type="dxa" w:w="1200"/>
-            <w:tcBorders>
-              <w:top w:val="single" w:color="000000" w:sz="4"/>
-              <w:left w:val="single" w:color="000000" w:sz="4"/>
-              <w:bottom w:val="single" w:color="000000" w:sz="4"/>
-              <w:right w:val="single" w:color="000000" w:sz="4"/>
-            </w:tcBorders>
-            <w:tcMar>
-              <w:top w:type="dxa" w:w="40"/>
-              <w:left w:type="dxa" w:w="80"/>
-              <w:bottom w:type="dxa" w:w="40"/>
-              <w:right w:type="dxa" w:w="80"/>
-            </w:tcMar>
-            <w:vAlign w:val="center"/>
-          </w:tcPr>
-          <w:p>
-            <w:pPr>
-              <w:spacing w:after="0" w:before="0" w:line="240"/>
-              <w:jc w:val="center"/>
-            </w:pPr>
-          </w:p>
-        </w:tc>
-      </w:tr>
-      <w:tr>
-        <w:trPr>
-          <w:cantSplit/>
-        </w:trPr>
-        <w:tc>
-          <w:tcPr>
-            <w:tcW w:type="dxa" w:w="6038"/>
-            <w:tcBorders>
-              <w:top w:val="single" w:color="000000" w:sz="4"/>
-              <w:left w:val="single" w:color="000000" w:sz="4"/>
-              <w:bottom w:val="single" w:color="000000" w:sz="4"/>
-              <w:right w:val="single" w:color="000000" w:sz="4"/>
-            </w:tcBorders>
-            <w:tcMar>
-              <w:top w:type="dxa" w:w="40"/>
-              <w:left w:type="dxa" w:w="80"/>
-              <w:bottom w:type="dxa" w:w="40"/>
-              <w:right w:type="dxa" w:w="80"/>
-            </w:tcMar>
-            <w:vAlign w:val="center"/>
-          </w:tcPr>
-          <w:p>
-            <w:pPr>
-              <w:spacing w:after="0" w:before="0" w:line="240"/>
-              <w:jc w:val="left"/>
-            </w:pPr>
-            <w:r>
-              <w:rPr>
-                <w:rFonts w:ascii="Calibri" w:cs="Calibri" w:eastAsia="Calibri" w:hAnsi="Calibri"/>
-                <w:sz w:val="19"/>
-                <w:szCs w:val="19"/>
-              </w:rPr>
-              <w:t xml:space="preserve">      3.2. Momenty dokręcania oraz rozmiar i typ kluczy</w:t>
-            </w:r>
-          </w:p>
-        </w:tc>
-        <w:tc>
-          <w:tcPr>
-            <w:tcW w:type="dxa" w:w="1100"/>
-            <w:tcBorders>
-              <w:top w:val="single" w:color="000000" w:sz="4"/>
-              <w:left w:val="single" w:color="000000" w:sz="4"/>
-              <w:bottom w:val="single" w:color="000000" w:sz="4"/>
-              <w:right w:val="single" w:color="000000" w:sz="4"/>
-            </w:tcBorders>
-            <w:tcMar>
-              <w:top w:type="dxa" w:w="40"/>
-              <w:left w:type="dxa" w:w="80"/>
-              <w:bottom w:type="dxa" w:w="40"/>
-              <w:right w:type="dxa" w:w="80"/>
-            </w:tcMar>
-            <w:vAlign w:val="center"/>
-          </w:tcPr>
-          <w:p>
-            <w:pPr>
-              <w:spacing w:after="0" w:before="0" w:line="240"/>
-              <w:jc w:val="center"/>
-            </w:pPr>
-            <w:r>
-              <w:rPr>
-                <w:rFonts w:ascii="Calibri" w:cs="Calibri" w:eastAsia="Calibri" w:hAnsi="Calibri"/>
-                <w:sz w:val="19"/>
-                <w:szCs w:val="19"/>
-              </w:rPr>
-              <w:t xml:space="preserve">7</w:t>
-            </w:r>
-          </w:p>
-        </w:tc>
-        <w:tc>
-          <w:tcPr>
-            <w:tcW w:type="dxa" w:w="1300"/>
-            <w:tcBorders>
-              <w:top w:val="single" w:color="000000" w:sz="4"/>
-              <w:left w:val="single" w:color="000000" w:sz="4"/>
-              <w:bottom w:val="single" w:color="000000" w:sz="4"/>
-              <w:right w:val="single" w:color="000000" w:sz="4"/>
-            </w:tcBorders>
-            <w:tcMar>
-              <w:top w:type="dxa" w:w="40"/>
-              <w:left w:type="dxa" w:w="80"/>
-              <w:bottom w:type="dxa" w:w="40"/>
-              <w:right w:type="dxa" w:w="80"/>
-            </w:tcMar>
-            <w:vAlign w:val="center"/>
-          </w:tcPr>
-          <w:p>
-            <w:pPr>
-              <w:spacing w:after="0" w:before="0" w:line="240"/>
-              <w:jc w:val="center"/>
-            </w:pPr>
-          </w:p>
-        </w:tc>
-        <w:tc>
-          <w:tcPr>
-            <w:tcW w:type="dxa" w:w="1200"/>
-            <w:tcBorders>
-              <w:top w:val="single" w:color="000000" w:sz="4"/>
-              <w:left w:val="single" w:color="000000" w:sz="4"/>
-              <w:bottom w:val="single" w:color="000000" w:sz="4"/>
-              <w:right w:val="single" w:color="000000" w:sz="4"/>
-            </w:tcBorders>
-            <w:tcMar>
-              <w:top w:type="dxa" w:w="40"/>
-              <w:left w:type="dxa" w:w="80"/>
-              <w:bottom w:type="dxa" w:w="40"/>
-              <w:right w:type="dxa" w:w="80"/>
-            </w:tcMar>
-            <w:vAlign w:val="center"/>
-          </w:tcPr>
-          <w:p>
-            <w:pPr>
-              <w:spacing w:after="0" w:before="0" w:line="240"/>
-              <w:jc w:val="center"/>
-            </w:pPr>
-          </w:p>
-        </w:tc>
-      </w:tr>
-      <w:tr>
-        <w:trPr>
-          <w:cantSplit/>
-        </w:trPr>
-        <w:tc>
-          <w:tcPr>
-            <w:tcW w:type="dxa" w:w="6038"/>
-            <w:tcBorders>
-              <w:top w:val="single" w:color="000000" w:sz="4"/>
-              <w:left w:val="single" w:color="000000" w:sz="4"/>
-              <w:bottom w:val="single" w:color="000000" w:sz="4"/>
-              <w:right w:val="single" w:color="000000" w:sz="4"/>
-            </w:tcBorders>
-            <w:tcMar>
-              <w:top w:type="dxa" w:w="40"/>
-              <w:left w:type="dxa" w:w="80"/>
-              <w:bottom w:type="dxa" w:w="40"/>
-              <w:right w:type="dxa" w:w="80"/>
-            </w:tcMar>
-            <w:vAlign w:val="center"/>
-          </w:tcPr>
-          <w:p>
-            <w:pPr>
-              <w:spacing w:after="0" w:before="0" w:line="240"/>
-              <w:jc w:val="left"/>
-            </w:pPr>
-            <w:r>
-              <w:rPr>
-                <w:rFonts w:ascii="Calibri" w:cs="Calibri" w:eastAsia="Calibri" w:hAnsi="Calibri"/>
-                <w:sz w:val="19"/>
-                <w:szCs w:val="19"/>
-              </w:rPr>
-              <w:t xml:space="preserve">      3.3. Środki smarne i eksploatacyjne</w:t>
-            </w:r>
-          </w:p>
-        </w:tc>
-        <w:tc>
-          <w:tcPr>
-            <w:tcW w:type="dxa" w:w="1100"/>
-            <w:tcBorders>
-              <w:top w:val="single" w:color="000000" w:sz="4"/>
-              <w:left w:val="single" w:color="000000" w:sz="4"/>
-              <w:bottom w:val="single" w:color="000000" w:sz="4"/>
-              <w:right w:val="single" w:color="000000" w:sz="4"/>
-            </w:tcBorders>
-            <w:tcMar>
-              <w:top w:type="dxa" w:w="40"/>
-              <w:left w:type="dxa" w:w="80"/>
-              <w:bottom w:type="dxa" w:w="40"/>
-              <w:right w:type="dxa" w:w="80"/>
-            </w:tcMar>
-            <w:vAlign w:val="center"/>
-          </w:tcPr>
-          <w:p>
-            <w:pPr>
-              <w:spacing w:after="0" w:before="0" w:line="240"/>
-              <w:jc w:val="center"/>
-            </w:pPr>
-            <w:r>
-              <w:rPr>
-                <w:rFonts w:ascii="Calibri" w:cs="Calibri" w:eastAsia="Calibri" w:hAnsi="Calibri"/>
-                <w:sz w:val="19"/>
-                <w:szCs w:val="19"/>
-              </w:rPr>
-              <w:t xml:space="preserve">8</w:t>
-            </w:r>
-          </w:p>
-        </w:tc>
-        <w:tc>
-          <w:tcPr>
-            <w:tcW w:type="dxa" w:w="1300"/>
-            <w:tcBorders>
-              <w:top w:val="single" w:color="000000" w:sz="4"/>
-              <w:left w:val="single" w:color="000000" w:sz="4"/>
-              <w:bottom w:val="single" w:color="000000" w:sz="4"/>
-              <w:right w:val="single" w:color="000000" w:sz="4"/>
-            </w:tcBorders>
-            <w:tcMar>
-              <w:top w:type="dxa" w:w="40"/>
-              <w:left w:type="dxa" w:w="80"/>
-              <w:bottom w:type="dxa" w:w="40"/>
-              <w:right w:type="dxa" w:w="80"/>
-            </w:tcMar>
-            <w:vAlign w:val="center"/>
-          </w:tcPr>
-          <w:p>
-            <w:pPr>
-              <w:spacing w:after="0" w:before="0" w:line="240"/>
-              <w:jc w:val="center"/>
-            </w:pPr>
-          </w:p>
-        </w:tc>
-        <w:tc>
-          <w:tcPr>
-            <w:tcW w:type="dxa" w:w="1200"/>
-            <w:tcBorders>
-              <w:top w:val="single" w:color="000000" w:sz="4"/>
-              <w:left w:val="single" w:color="000000" w:sz="4"/>
-              <w:bottom w:val="single" w:color="000000" w:sz="4"/>
-              <w:right w:val="single" w:color="000000" w:sz="4"/>
-            </w:tcBorders>
-            <w:tcMar>
-              <w:top w:type="dxa" w:w="40"/>
-              <w:left w:type="dxa" w:w="80"/>
-              <w:bottom w:type="dxa" w:w="40"/>
-              <w:right w:type="dxa" w:w="80"/>
-            </w:tcMar>
-            <w:vAlign w:val="center"/>
-          </w:tcPr>
-          <w:p>
-            <w:pPr>
-              <w:spacing w:after="0" w:before="0" w:line="240"/>
-              <w:jc w:val="center"/>
-            </w:pPr>
-          </w:p>
-        </w:tc>
-      </w:tr>
-      <w:tr>
-        <w:trPr>
-          <w:cantSplit/>
-        </w:trPr>
-        <w:tc>
-          <w:tcPr>
-            <w:tcW w:type="dxa" w:w="6038"/>
-            <w:tcBorders>
-              <w:top w:val="single" w:color="000000" w:sz="4"/>
-              <w:left w:val="single" w:color="000000" w:sz="4"/>
-              <w:bottom w:val="single" w:color="000000" w:sz="4"/>
-              <w:right w:val="single" w:color="000000" w:sz="4"/>
-            </w:tcBorders>
-            <w:tcMar>
-              <w:top w:type="dxa" w:w="40"/>
-              <w:left w:type="dxa" w:w="80"/>
-              <w:bottom w:type="dxa" w:w="40"/>
-              <w:right w:type="dxa" w:w="80"/>
-            </w:tcMar>
-            <w:vAlign w:val="center"/>
-          </w:tcPr>
-          <w:p>
-            <w:pPr>
-              <w:spacing w:after="0" w:before="0" w:line="240"/>
-              <w:jc w:val="left"/>
-            </w:pPr>
-            <w:r>
-              <w:rPr>
-                <w:rFonts w:ascii="Calibri" w:cs="Calibri" w:eastAsia="Calibri" w:hAnsi="Calibri"/>
-                <w:b/>
-                <w:bCs/>
-                <w:sz w:val="19"/>
-                <w:szCs w:val="19"/>
-              </w:rPr>
-              <w:t xml:space="preserve">4. Diagnostyka i kwalifikacja pojazdu do naprawy</w:t>
-            </w:r>
-          </w:p>
-        </w:tc>
-        <w:tc>
-          <w:tcPr>
-            <w:tcW w:type="dxa" w:w="1100"/>
-            <w:tcBorders>
-              <w:top w:val="single" w:color="000000" w:sz="4"/>
-              <w:left w:val="single" w:color="000000" w:sz="4"/>
-              <w:bottom w:val="single" w:color="000000" w:sz="4"/>
-              <w:right w:val="single" w:color="000000" w:sz="4"/>
-            </w:tcBorders>
-            <w:tcMar>
-              <w:top w:type="dxa" w:w="40"/>
-              <w:left w:type="dxa" w:w="80"/>
-              <w:bottom w:type="dxa" w:w="40"/>
-              <w:right w:type="dxa" w:w="80"/>
-            </w:tcMar>
-            <w:vAlign w:val="center"/>
-          </w:tcPr>
-          <w:p>
-            <w:pPr>
-              <w:spacing w:after="0" w:before="0" w:line="240"/>
-              <w:jc w:val="center"/>
-            </w:pPr>
-            <w:r>
-              <w:rPr>
-                <w:rFonts w:ascii="Calibri" w:cs="Calibri" w:eastAsia="Calibri" w:hAnsi="Calibri"/>
-                <w:sz w:val="19"/>
-                <w:szCs w:val="19"/>
-              </w:rPr>
-              <w:t xml:space="preserve">–</w:t>
-            </w:r>
-          </w:p>
-        </w:tc>
-        <w:tc>
-          <w:tcPr>
-            <w:tcW w:type="dxa" w:w="1300"/>
-            <w:tcBorders>
-              <w:top w:val="single" w:color="000000" w:sz="4"/>
-              <w:left w:val="single" w:color="000000" w:sz="4"/>
-              <w:bottom w:val="single" w:color="000000" w:sz="4"/>
-              <w:right w:val="single" w:color="000000" w:sz="4"/>
-            </w:tcBorders>
-            <w:tcMar>
-              <w:top w:type="dxa" w:w="40"/>
-              <w:left w:type="dxa" w:w="80"/>
-              <w:bottom w:type="dxa" w:w="40"/>
-              <w:right w:type="dxa" w:w="80"/>
-            </w:tcMar>
-            <w:vAlign w:val="center"/>
-          </w:tcPr>
-          <w:p>
-            <w:pPr>
-              <w:spacing w:after="0" w:before="0" w:line="240"/>
-              <w:jc w:val="center"/>
-            </w:pPr>
-            <w:r>
-              <w:rPr>
-                <w:rFonts w:ascii="Calibri" w:cs="Calibri" w:eastAsia="Calibri" w:hAnsi="Calibri"/>
-                <w:b/>
-                <w:bCs/>
-                <w:sz w:val="19"/>
-                <w:szCs w:val="19"/>
-              </w:rPr>
-              <w:t xml:space="preserve">6%</w:t>
-            </w:r>
-          </w:p>
-        </w:tc>
-        <w:tc>
-          <w:tcPr>
-            <w:tcW w:type="dxa" w:w="1200"/>
-            <w:tcBorders>
-              <w:top w:val="single" w:color="000000" w:sz="4"/>
-              <w:left w:val="single" w:color="000000" w:sz="4"/>
-              <w:bottom w:val="single" w:color="000000" w:sz="4"/>
-              <w:right w:val="single" w:color="000000" w:sz="4"/>
-            </w:tcBorders>
-            <w:tcMar>
-              <w:top w:type="dxa" w:w="40"/>
-              <w:left w:type="dxa" w:w="80"/>
-              <w:bottom w:type="dxa" w:w="40"/>
-              <w:right w:type="dxa" w:w="80"/>
-            </w:tcMar>
-            <w:vAlign w:val="center"/>
-          </w:tcPr>
-          <w:p>
-            <w:pPr>
-              <w:spacing w:after="0" w:before="0" w:line="240"/>
-              <w:jc w:val="center"/>
-            </w:pPr>
-            <w:r>
-              <w:rPr>
-                <w:rFonts w:ascii="Calibri" w:cs="Calibri" w:eastAsia="Calibri" w:hAnsi="Calibri"/>
-                <w:sz w:val="17"/>
-                <w:szCs w:val="17"/>
-              </w:rPr>
-              <w:t xml:space="preserve">w przygotowaniu</w:t>
-            </w:r>
-          </w:p>
-        </w:tc>
-      </w:tr>
-      <w:tr>
-        <w:trPr>
-          <w:cantSplit/>
-        </w:trPr>
-        <w:tc>
-          <w:tcPr>
-            <w:tcW w:type="dxa" w:w="6038"/>
-            <w:tcBorders>
-              <w:top w:val="single" w:color="000000" w:sz="4"/>
-              <w:left w:val="single" w:color="000000" w:sz="4"/>
-              <w:bottom w:val="single" w:color="000000" w:sz="4"/>
-              <w:right w:val="single" w:color="000000" w:sz="4"/>
-            </w:tcBorders>
-            <w:tcMar>
-              <w:top w:type="dxa" w:w="40"/>
-              <w:left w:type="dxa" w:w="80"/>
-              <w:bottom w:type="dxa" w:w="40"/>
-              <w:right w:type="dxa" w:w="80"/>
-            </w:tcMar>
-            <w:vAlign w:val="center"/>
-          </w:tcPr>
-          <w:p>
-            <w:pPr>
-              <w:spacing w:after="0" w:before="0" w:line="240"/>
-              <w:jc w:val="left"/>
-            </w:pPr>
-            <w:r>
-              <w:rPr>
-                <w:rFonts w:ascii="Calibri" w:cs="Calibri" w:eastAsia="Calibri" w:hAnsi="Calibri"/>
-                <w:sz w:val="19"/>
-                <w:szCs w:val="19"/>
-              </w:rPr>
-              <w:t xml:space="preserve">      4.1. Macierz diagnostyczna objawów</w:t>
-            </w:r>
-          </w:p>
-        </w:tc>
-        <w:tc>
-          <w:tcPr>
-            <w:tcW w:type="dxa" w:w="1100"/>
-            <w:tcBorders>
-              <w:top w:val="single" w:color="000000" w:sz="4"/>
-              <w:left w:val="single" w:color="000000" w:sz="4"/>
-              <w:bottom w:val="single" w:color="000000" w:sz="4"/>
-              <w:right w:val="single" w:color="000000" w:sz="4"/>
-            </w:tcBorders>
-            <w:tcMar>
-              <w:top w:type="dxa" w:w="40"/>
-              <w:left w:type="dxa" w:w="80"/>
-              <w:bottom w:type="dxa" w:w="40"/>
-              <w:right w:type="dxa" w:w="80"/>
-            </w:tcMar>
-            <w:vAlign w:val="center"/>
-          </w:tcPr>
-          <w:p>
-            <w:pPr>
-              <w:spacing w:after="0" w:before="0" w:line="240"/>
-              <w:jc w:val="center"/>
-            </w:pPr>
-            <w:r>
-              <w:rPr>
-                <w:rFonts w:ascii="Calibri" w:cs="Calibri" w:eastAsia="Calibri" w:hAnsi="Calibri"/>
-                <w:sz w:val="19"/>
-                <w:szCs w:val="19"/>
-              </w:rPr>
-              <w:t xml:space="preserve">–</w:t>
-            </w:r>
-          </w:p>
-        </w:tc>
-        <w:tc>
-          <w:tcPr>
-            <w:tcW w:type="dxa" w:w="1300"/>
-            <w:tcBorders>
-              <w:top w:val="single" w:color="000000" w:sz="4"/>
-              <w:left w:val="single" w:color="000000" w:sz="4"/>
-              <w:bottom w:val="single" w:color="000000" w:sz="4"/>
-              <w:right w:val="single" w:color="000000" w:sz="4"/>
-            </w:tcBorders>
-            <w:tcMar>
-              <w:top w:type="dxa" w:w="40"/>
-              <w:left w:type="dxa" w:w="80"/>
-              <w:bottom w:type="dxa" w:w="40"/>
-              <w:right w:type="dxa" w:w="80"/>
-            </w:tcMar>
-            <w:vAlign w:val="center"/>
-          </w:tcPr>
-          <w:p>
-            <w:pPr>
-              <w:spacing w:after="0" w:before="0" w:line="240"/>
-              <w:jc w:val="center"/>
-            </w:pPr>
-          </w:p>
-        </w:tc>
-        <w:tc>
-          <w:tcPr>
-            <w:tcW w:type="dxa" w:w="1200"/>
-            <w:tcBorders>
-              <w:top w:val="single" w:color="000000" w:sz="4"/>
-              <w:left w:val="single" w:color="000000" w:sz="4"/>
-              <w:bottom w:val="single" w:color="000000" w:sz="4"/>
-              <w:right w:val="single" w:color="000000" w:sz="4"/>
-            </w:tcBorders>
-            <w:tcMar>
-              <w:top w:type="dxa" w:w="40"/>
-              <w:left w:type="dxa" w:w="80"/>
-              <w:bottom w:type="dxa" w:w="40"/>
-              <w:right w:type="dxa" w:w="80"/>
-            </w:tcMar>
-            <w:vAlign w:val="center"/>
-          </w:tcPr>
-          <w:p>
-            <w:pPr>
-              <w:spacing w:after="0" w:before="0" w:line="240"/>
-              <w:jc w:val="center"/>
-            </w:pPr>
-          </w:p>
-        </w:tc>
-      </w:tr>
-      <w:tr>
-        <w:trPr>
-          <w:cantSplit/>
-        </w:trPr>
-        <w:tc>
-          <w:tcPr>
-            <w:tcW w:type="dxa" w:w="6038"/>
-            <w:tcBorders>
-              <w:top w:val="single" w:color="000000" w:sz="4"/>
-              <w:left w:val="single" w:color="000000" w:sz="4"/>
-              <w:bottom w:val="single" w:color="000000" w:sz="4"/>
-              <w:right w:val="single" w:color="000000" w:sz="4"/>
-            </w:tcBorders>
-            <w:tcMar>
-              <w:top w:type="dxa" w:w="40"/>
-              <w:left w:type="dxa" w:w="80"/>
-              <w:bottom w:type="dxa" w:w="40"/>
-              <w:right w:type="dxa" w:w="80"/>
-            </w:tcMar>
-            <w:vAlign w:val="center"/>
-          </w:tcPr>
-          <w:p>
-            <w:pPr>
-              <w:spacing w:after="0" w:before="0" w:line="240"/>
-              <w:jc w:val="left"/>
-            </w:pPr>
-            <w:r>
-              <w:rPr>
-                <w:rFonts w:ascii="Calibri" w:cs="Calibri" w:eastAsia="Calibri" w:hAnsi="Calibri"/>
-                <w:sz w:val="19"/>
-                <w:szCs w:val="19"/>
-              </w:rPr>
-              <w:t xml:space="preserve">      4.2. Karta weryfikacji części</w:t>
-            </w:r>
-          </w:p>
-        </w:tc>
-        <w:tc>
-          <w:tcPr>
-            <w:tcW w:type="dxa" w:w="1100"/>
-            <w:tcBorders>
-              <w:top w:val="single" w:color="000000" w:sz="4"/>
-              <w:left w:val="single" w:color="000000" w:sz="4"/>
-              <w:bottom w:val="single" w:color="000000" w:sz="4"/>
-              <w:right w:val="single" w:color="000000" w:sz="4"/>
-            </w:tcBorders>
-            <w:tcMar>
-              <w:top w:type="dxa" w:w="40"/>
-              <w:left w:type="dxa" w:w="80"/>
-              <w:bottom w:type="dxa" w:w="40"/>
-              <w:right w:type="dxa" w:w="80"/>
-            </w:tcMar>
-            <w:vAlign w:val="center"/>
-          </w:tcPr>
-          <w:p>
-            <w:pPr>
-              <w:spacing w:after="0" w:before="0" w:line="240"/>
-              <w:jc w:val="center"/>
-            </w:pPr>
-            <w:r>
-              <w:rPr>
-                <w:rFonts w:ascii="Calibri" w:cs="Calibri" w:eastAsia="Calibri" w:hAnsi="Calibri"/>
-                <w:sz w:val="19"/>
-                <w:szCs w:val="19"/>
-              </w:rPr>
-              <w:t xml:space="preserve">–</w:t>
-            </w:r>
-          </w:p>
-        </w:tc>
-        <w:tc>
-          <w:tcPr>
-            <w:tcW w:type="dxa" w:w="1300"/>
-            <w:tcBorders>
-              <w:top w:val="single" w:color="000000" w:sz="4"/>
-              <w:left w:val="single" w:color="000000" w:sz="4"/>
-              <w:bottom w:val="single" w:color="000000" w:sz="4"/>
-              <w:right w:val="single" w:color="000000" w:sz="4"/>
-            </w:tcBorders>
-            <w:tcMar>
-              <w:top w:type="dxa" w:w="40"/>
-              <w:left w:type="dxa" w:w="80"/>
-              <w:bottom w:type="dxa" w:w="40"/>
-              <w:right w:type="dxa" w:w="80"/>
-            </w:tcMar>
-            <w:vAlign w:val="center"/>
-          </w:tcPr>
-          <w:p>
-            <w:pPr>
-              <w:spacing w:after="0" w:before="0" w:line="240"/>
-              <w:jc w:val="center"/>
-            </w:pPr>
-          </w:p>
-        </w:tc>
-        <w:tc>
-          <w:tcPr>
-            <w:tcW w:type="dxa" w:w="1200"/>
-            <w:tcBorders>
-              <w:top w:val="single" w:color="000000" w:sz="4"/>
-              <w:left w:val="single" w:color="000000" w:sz="4"/>
-              <w:bottom w:val="single" w:color="000000" w:sz="4"/>
-              <w:right w:val="single" w:color="000000" w:sz="4"/>
-            </w:tcBorders>
-            <w:tcMar>
-              <w:top w:type="dxa" w:w="40"/>
-              <w:left w:type="dxa" w:w="80"/>
-              <w:bottom w:type="dxa" w:w="40"/>
-              <w:right w:type="dxa" w:w="80"/>
-            </w:tcMar>
-            <w:vAlign w:val="center"/>
-          </w:tcPr>
-          <w:p>
-            <w:pPr>
-              <w:spacing w:after="0" w:before="0" w:line="240"/>
-              <w:jc w:val="center"/>
-            </w:pPr>
-          </w:p>
-        </w:tc>
-      </w:tr>
-      <w:tr>
-        <w:trPr>
-          <w:cantSplit/>
-        </w:trPr>
-        <w:tc>
-          <w:tcPr>
-            <w:tcW w:type="dxa" w:w="6038"/>
-            <w:tcBorders>
-              <w:top w:val="single" w:color="000000" w:sz="4"/>
-              <w:left w:val="single" w:color="000000" w:sz="4"/>
-              <w:bottom w:val="single" w:color="000000" w:sz="4"/>
-              <w:right w:val="single" w:color="000000" w:sz="4"/>
-            </w:tcBorders>
-            <w:tcMar>
-              <w:top w:type="dxa" w:w="40"/>
-              <w:left w:type="dxa" w:w="80"/>
-              <w:bottom w:type="dxa" w:w="40"/>
-              <w:right w:type="dxa" w:w="80"/>
-            </w:tcMar>
-            <w:vAlign w:val="center"/>
-          </w:tcPr>
-          <w:p>
-            <w:pPr>
-              <w:spacing w:after="0" w:before="0" w:line="240"/>
-              <w:jc w:val="left"/>
-            </w:pPr>
-            <w:r>
-              <w:rPr>
-                <w:rFonts w:ascii="Calibri" w:cs="Calibri" w:eastAsia="Calibri" w:hAnsi="Calibri"/>
-                <w:b/>
-                <w:bCs/>
-                <w:sz w:val="19"/>
-                <w:szCs w:val="19"/>
-              </w:rPr>
-              <w:t xml:space="preserve">5. Wyposażenie stanowiska pracy</w:t>
-            </w:r>
-          </w:p>
-        </w:tc>
-        <w:tc>
-          <w:tcPr>
-            <w:tcW w:type="dxa" w:w="1100"/>
-            <w:tcBorders>
-              <w:top w:val="single" w:color="000000" w:sz="4"/>
-              <w:left w:val="single" w:color="000000" w:sz="4"/>
-              <w:bottom w:val="single" w:color="000000" w:sz="4"/>
-              <w:right w:val="single" w:color="000000" w:sz="4"/>
-            </w:tcBorders>
-            <w:tcMar>
-              <w:top w:type="dxa" w:w="40"/>
-              <w:left w:type="dxa" w:w="80"/>
-              <w:bottom w:type="dxa" w:w="40"/>
-              <w:right w:type="dxa" w:w="80"/>
-            </w:tcMar>
-            <w:vAlign w:val="center"/>
-          </w:tcPr>
-          <w:p>
-            <w:pPr>
-              <w:spacing w:after="0" w:before="0" w:line="240"/>
-              <w:jc w:val="center"/>
-            </w:pPr>
-            <w:r>
-              <w:rPr>
-                <w:rFonts w:ascii="Calibri" w:cs="Calibri" w:eastAsia="Calibri" w:hAnsi="Calibri"/>
-                <w:sz w:val="19"/>
-                <w:szCs w:val="19"/>
-              </w:rPr>
-              <w:t xml:space="preserve">–</w:t>
-            </w:r>
-          </w:p>
-        </w:tc>
-        <w:tc>
-          <w:tcPr>
-            <w:tcW w:type="dxa" w:w="1300"/>
-            <w:tcBorders>
-              <w:top w:val="single" w:color="000000" w:sz="4"/>
-              <w:left w:val="single" w:color="000000" w:sz="4"/>
-              <w:bottom w:val="single" w:color="000000" w:sz="4"/>
-              <w:right w:val="single" w:color="000000" w:sz="4"/>
-            </w:tcBorders>
-            <w:tcMar>
-              <w:top w:type="dxa" w:w="40"/>
-              <w:left w:type="dxa" w:w="80"/>
-              <w:bottom w:type="dxa" w:w="40"/>
-              <w:right w:type="dxa" w:w="80"/>
-            </w:tcMar>
-            <w:vAlign w:val="center"/>
-          </w:tcPr>
-          <w:p>
-            <w:pPr>
-              <w:spacing w:after="0" w:before="0" w:line="240"/>
-              <w:jc w:val="center"/>
-            </w:pPr>
-            <w:r>
-              <w:rPr>
-                <w:rFonts w:ascii="Calibri" w:cs="Calibri" w:eastAsia="Calibri" w:hAnsi="Calibri"/>
-                <w:b/>
-                <w:bCs/>
-                <w:sz w:val="19"/>
-                <w:szCs w:val="19"/>
-              </w:rPr>
-              <w:t xml:space="preserve">4%</w:t>
-            </w:r>
-          </w:p>
-        </w:tc>
-        <w:tc>
-          <w:tcPr>
-            <w:tcW w:type="dxa" w:w="1200"/>
-            <w:tcBorders>
-              <w:top w:val="single" w:color="000000" w:sz="4"/>
-              <w:left w:val="single" w:color="000000" w:sz="4"/>
-              <w:bottom w:val="single" w:color="000000" w:sz="4"/>
-              <w:right w:val="single" w:color="000000" w:sz="4"/>
-            </w:tcBorders>
-            <w:tcMar>
-              <w:top w:type="dxa" w:w="40"/>
-              <w:left w:type="dxa" w:w="80"/>
-              <w:bottom w:type="dxa" w:w="40"/>
-              <w:right w:type="dxa" w:w="80"/>
-            </w:tcMar>
-            <w:vAlign w:val="center"/>
-          </w:tcPr>
-          <w:p>
-            <w:pPr>
-              <w:spacing w:after="0" w:before="0" w:line="240"/>
-              <w:jc w:val="center"/>
-            </w:pPr>
-            <w:r>
-              <w:rPr>
-                <w:rFonts w:ascii="Calibri" w:cs="Calibri" w:eastAsia="Calibri" w:hAnsi="Calibri"/>
-                <w:sz w:val="17"/>
-                <w:szCs w:val="17"/>
-              </w:rPr>
-              <w:t xml:space="preserve">w przygotowaniu</w:t>
-            </w:r>
-          </w:p>
-        </w:tc>
-      </w:tr>
-      <w:tr>
-        <w:trPr>
-          <w:cantSplit/>
-        </w:trPr>
-        <w:tc>
-          <w:tcPr>
-            <w:tcW w:type="dxa" w:w="6038"/>
-            <w:tcBorders>
-              <w:top w:val="single" w:color="000000" w:sz="4"/>
-              <w:left w:val="single" w:color="000000" w:sz="4"/>
-              <w:bottom w:val="single" w:color="000000" w:sz="4"/>
-              <w:right w:val="single" w:color="000000" w:sz="4"/>
-            </w:tcBorders>
-            <w:tcMar>
-              <w:top w:type="dxa" w:w="40"/>
-              <w:left w:type="dxa" w:w="80"/>
-              <w:bottom w:type="dxa" w:w="40"/>
-              <w:right w:type="dxa" w:w="80"/>
-            </w:tcMar>
-            <w:vAlign w:val="center"/>
-          </w:tcPr>
-          <w:p>
-            <w:pPr>
-              <w:spacing w:after="0" w:before="0" w:line="240"/>
-              <w:jc w:val="left"/>
-            </w:pPr>
-            <w:r>
-              <w:rPr>
-                <w:rFonts w:ascii="Calibri" w:cs="Calibri" w:eastAsia="Calibri" w:hAnsi="Calibri"/>
-                <w:b/>
-                <w:bCs/>
-                <w:sz w:val="19"/>
-                <w:szCs w:val="19"/>
-              </w:rPr>
-              <w:t xml:space="preserve">6. Proces technologiczny wymiany klocków hamulcowych</w:t>
-            </w:r>
-          </w:p>
-        </w:tc>
-        <w:tc>
-          <w:tcPr>
-            <w:tcW w:type="dxa" w:w="1100"/>
-            <w:tcBorders>
-              <w:top w:val="single" w:color="000000" w:sz="4"/>
-              <w:left w:val="single" w:color="000000" w:sz="4"/>
-              <w:bottom w:val="single" w:color="000000" w:sz="4"/>
-              <w:right w:val="single" w:color="000000" w:sz="4"/>
-            </w:tcBorders>
-            <w:tcMar>
-              <w:top w:type="dxa" w:w="40"/>
-              <w:left w:type="dxa" w:w="80"/>
-              <w:bottom w:type="dxa" w:w="40"/>
-              <w:right w:type="dxa" w:w="80"/>
-            </w:tcMar>
-            <w:vAlign w:val="center"/>
-          </w:tcPr>
-          <w:p>
-            <w:pPr>
-              <w:spacing w:after="0" w:before="0" w:line="240"/>
-              <w:jc w:val="center"/>
-            </w:pPr>
-            <w:r>
-              <w:rPr>
-                <w:rFonts w:ascii="Calibri" w:cs="Calibri" w:eastAsia="Calibri" w:hAnsi="Calibri"/>
-                <w:sz w:val="19"/>
-                <w:szCs w:val="19"/>
-              </w:rPr>
-              <w:t xml:space="preserve">–</w:t>
-            </w:r>
-          </w:p>
-        </w:tc>
-        <w:tc>
-          <w:tcPr>
-            <w:tcW w:type="dxa" w:w="1300"/>
-            <w:tcBorders>
-              <w:top w:val="single" w:color="000000" w:sz="4"/>
-              <w:left w:val="single" w:color="000000" w:sz="4"/>
-              <w:bottom w:val="single" w:color="000000" w:sz="4"/>
-              <w:right w:val="single" w:color="000000" w:sz="4"/>
-            </w:tcBorders>
-            <w:tcMar>
-              <w:top w:type="dxa" w:w="40"/>
-              <w:left w:type="dxa" w:w="80"/>
-              <w:bottom w:type="dxa" w:w="40"/>
-              <w:right w:type="dxa" w:w="80"/>
-            </w:tcMar>
-            <w:vAlign w:val="center"/>
-          </w:tcPr>
-          <w:p>
-            <w:pPr>
-              <w:spacing w:after="0" w:before="0" w:line="240"/>
-              <w:jc w:val="center"/>
-            </w:pPr>
-            <w:r>
-              <w:rPr>
-                <w:rFonts w:ascii="Calibri" w:cs="Calibri" w:eastAsia="Calibri" w:hAnsi="Calibri"/>
-                <w:b/>
-                <w:bCs/>
-                <w:sz w:val="19"/>
-                <w:szCs w:val="19"/>
-              </w:rPr>
-              <w:t xml:space="preserve">50%</w:t>
-            </w:r>
-          </w:p>
-        </w:tc>
-        <w:tc>
-          <w:tcPr>
-            <w:tcW w:type="dxa" w:w="1200"/>
-            <w:tcBorders>
-              <w:top w:val="single" w:color="000000" w:sz="4"/>
-              <w:left w:val="single" w:color="000000" w:sz="4"/>
-              <w:bottom w:val="single" w:color="000000" w:sz="4"/>
-              <w:right w:val="single" w:color="000000" w:sz="4"/>
-            </w:tcBorders>
-            <w:tcMar>
-              <w:top w:type="dxa" w:w="40"/>
-              <w:left w:type="dxa" w:w="80"/>
-              <w:bottom w:type="dxa" w:w="40"/>
-              <w:right w:type="dxa" w:w="80"/>
-            </w:tcMar>
-            <w:vAlign w:val="center"/>
-          </w:tcPr>
-          <w:p>
-            <w:pPr>
-              <w:spacing w:after="0" w:before="0" w:line="240"/>
-              <w:jc w:val="center"/>
-            </w:pPr>
-            <w:r>
-              <w:rPr>
-                <w:rFonts w:ascii="Calibri" w:cs="Calibri" w:eastAsia="Calibri" w:hAnsi="Calibri"/>
-                <w:sz w:val="17"/>
-                <w:szCs w:val="17"/>
-              </w:rPr>
-              <w:t xml:space="preserve">w przygotowaniu</w:t>
-            </w:r>
-          </w:p>
-        </w:tc>
-      </w:tr>
-      <w:tr>
-        <w:trPr>
-          <w:cantSplit/>
-        </w:trPr>
-        <w:tc>
-          <w:tcPr>
-            <w:tcW w:type="dxa" w:w="6038"/>
-            <w:tcBorders>
-              <w:top w:val="single" w:color="000000" w:sz="4"/>
-              <w:left w:val="single" w:color="000000" w:sz="4"/>
-              <w:bottom w:val="single" w:color="000000" w:sz="4"/>
-              <w:right w:val="single" w:color="000000" w:sz="4"/>
-            </w:tcBorders>
-            <w:tcMar>
-              <w:top w:type="dxa" w:w="40"/>
-              <w:left w:type="dxa" w:w="80"/>
-              <w:bottom w:type="dxa" w:w="40"/>
-              <w:right w:type="dxa" w:w="80"/>
-            </w:tcMar>
-            <w:vAlign w:val="center"/>
-          </w:tcPr>
-          <w:p>
-            <w:pPr>
-              <w:spacing w:after="0" w:before="0" w:line="240"/>
-              <w:jc w:val="left"/>
-            </w:pPr>
-            <w:r>
-              <w:rPr>
-                <w:rFonts w:ascii="Calibri" w:cs="Calibri" w:eastAsia="Calibri" w:hAnsi="Calibri"/>
-                <w:sz w:val="19"/>
-                <w:szCs w:val="19"/>
-              </w:rPr>
-              <w:t xml:space="preserve">      6.1. Schemat procesu technologicznego</w:t>
-            </w:r>
-          </w:p>
-        </w:tc>
-        <w:tc>
-          <w:tcPr>
-            <w:tcW w:type="dxa" w:w="1100"/>
-            <w:tcBorders>
-              <w:top w:val="single" w:color="000000" w:sz="4"/>
-              <w:left w:val="single" w:color="000000" w:sz="4"/>
-              <w:bottom w:val="single" w:color="000000" w:sz="4"/>
-              <w:right w:val="single" w:color="000000" w:sz="4"/>
-            </w:tcBorders>
-            <w:tcMar>
-              <w:top w:type="dxa" w:w="40"/>
-              <w:left w:type="dxa" w:w="80"/>
-              <w:bottom w:type="dxa" w:w="40"/>
-              <w:right w:type="dxa" w:w="80"/>
-            </w:tcMar>
-            <w:vAlign w:val="center"/>
-          </w:tcPr>
-          <w:p>
-            <w:pPr>
-              <w:spacing w:after="0" w:before="0" w:line="240"/>
-              <w:jc w:val="center"/>
-            </w:pPr>
-            <w:r>
-              <w:rPr>
-                <w:rFonts w:ascii="Calibri" w:cs="Calibri" w:eastAsia="Calibri" w:hAnsi="Calibri"/>
-                <w:sz w:val="19"/>
-                <w:szCs w:val="19"/>
-              </w:rPr>
-              <w:t xml:space="preserve">–</w:t>
-            </w:r>
-          </w:p>
-        </w:tc>
-        <w:tc>
-          <w:tcPr>
-            <w:tcW w:type="dxa" w:w="1300"/>
-            <w:tcBorders>
-              <w:top w:val="single" w:color="000000" w:sz="4"/>
-              <w:left w:val="single" w:color="000000" w:sz="4"/>
-              <w:bottom w:val="single" w:color="000000" w:sz="4"/>
-              <w:right w:val="single" w:color="000000" w:sz="4"/>
-            </w:tcBorders>
-            <w:tcMar>
-              <w:top w:type="dxa" w:w="40"/>
-              <w:left w:type="dxa" w:w="80"/>
-              <w:bottom w:type="dxa" w:w="40"/>
-              <w:right w:type="dxa" w:w="80"/>
-            </w:tcMar>
-            <w:vAlign w:val="center"/>
-          </w:tcPr>
-          <w:p>
-            <w:pPr>
-              <w:spacing w:after="0" w:before="0" w:line="240"/>
-              <w:jc w:val="center"/>
-            </w:pPr>
-          </w:p>
-        </w:tc>
-        <w:tc>
-          <w:tcPr>
-            <w:tcW w:type="dxa" w:w="1200"/>
-            <w:tcBorders>
-              <w:top w:val="single" w:color="000000" w:sz="4"/>
-              <w:left w:val="single" w:color="000000" w:sz="4"/>
-              <w:bottom w:val="single" w:color="000000" w:sz="4"/>
-              <w:right w:val="single" w:color="000000" w:sz="4"/>
-            </w:tcBorders>
-            <w:tcMar>
-              <w:top w:type="dxa" w:w="40"/>
-              <w:left w:type="dxa" w:w="80"/>
-              <w:bottom w:type="dxa" w:w="40"/>
-              <w:right w:type="dxa" w:w="80"/>
-            </w:tcMar>
-            <w:vAlign w:val="center"/>
-          </w:tcPr>
-          <w:p>
-            <w:pPr>
-              <w:spacing w:after="0" w:before="0" w:line="240"/>
-              <w:jc w:val="center"/>
-            </w:pPr>
-          </w:p>
-        </w:tc>
-      </w:tr>
-      <w:tr>
-        <w:trPr>
-          <w:cantSplit/>
-        </w:trPr>
-        <w:tc>
-          <w:tcPr>
-            <w:tcW w:type="dxa" w:w="6038"/>
-            <w:tcBorders>
-              <w:top w:val="single" w:color="000000" w:sz="4"/>
-              <w:left w:val="single" w:color="000000" w:sz="4"/>
-              <w:bottom w:val="single" w:color="000000" w:sz="4"/>
-              <w:right w:val="single" w:color="000000" w:sz="4"/>
-            </w:tcBorders>
-            <w:tcMar>
-              <w:top w:type="dxa" w:w="40"/>
-              <w:left w:type="dxa" w:w="80"/>
-              <w:bottom w:type="dxa" w:w="40"/>
-              <w:right w:type="dxa" w:w="80"/>
-            </w:tcMar>
-            <w:vAlign w:val="center"/>
-          </w:tcPr>
-          <w:p>
-            <w:pPr>
-              <w:spacing w:after="0" w:before="0" w:line="240"/>
-              <w:jc w:val="left"/>
-            </w:pPr>
-            <w:r>
-              <w:rPr>
-                <w:rFonts w:ascii="Calibri" w:cs="Calibri" w:eastAsia="Calibri" w:hAnsi="Calibri"/>
-                <w:sz w:val="19"/>
-                <w:szCs w:val="19"/>
-              </w:rPr>
-              <w:t xml:space="preserve">      6.2. Karta instrukcyjna operacji</w:t>
-            </w:r>
-          </w:p>
-        </w:tc>
-        <w:tc>
-          <w:tcPr>
-            <w:tcW w:type="dxa" w:w="1100"/>
-            <w:tcBorders>
-              <w:top w:val="single" w:color="000000" w:sz="4"/>
-              <w:left w:val="single" w:color="000000" w:sz="4"/>
-              <w:bottom w:val="single" w:color="000000" w:sz="4"/>
-              <w:right w:val="single" w:color="000000" w:sz="4"/>
-            </w:tcBorders>
-            <w:tcMar>
-              <w:top w:type="dxa" w:w="40"/>
-              <w:left w:type="dxa" w:w="80"/>
-              <w:bottom w:type="dxa" w:w="40"/>
-              <w:right w:type="dxa" w:w="80"/>
-            </w:tcMar>
-            <w:vAlign w:val="center"/>
-          </w:tcPr>
-          <w:p>
-            <w:pPr>
-              <w:spacing w:after="0" w:before="0" w:line="240"/>
-              <w:jc w:val="center"/>
-            </w:pPr>
-            <w:r>
-              <w:rPr>
-                <w:rFonts w:ascii="Calibri" w:cs="Calibri" w:eastAsia="Calibri" w:hAnsi="Calibri"/>
-                <w:sz w:val="19"/>
-                <w:szCs w:val="19"/>
-              </w:rPr>
-              <w:t xml:space="preserve">–</w:t>
-            </w:r>
-          </w:p>
-        </w:tc>
-        <w:tc>
-          <w:tcPr>
-            <w:tcW w:type="dxa" w:w="1300"/>
-            <w:tcBorders>
-              <w:top w:val="single" w:color="000000" w:sz="4"/>
-              <w:left w:val="single" w:color="000000" w:sz="4"/>
-              <w:bottom w:val="single" w:color="000000" w:sz="4"/>
-              <w:right w:val="single" w:color="000000" w:sz="4"/>
-            </w:tcBorders>
-            <w:tcMar>
-              <w:top w:type="dxa" w:w="40"/>
-              <w:left w:type="dxa" w:w="80"/>
-              <w:bottom w:type="dxa" w:w="40"/>
-              <w:right w:type="dxa" w:w="80"/>
-            </w:tcMar>
-            <w:vAlign w:val="center"/>
-          </w:tcPr>
-          <w:p>
-            <w:pPr>
-              <w:spacing w:after="0" w:before="0" w:line="240"/>
-              <w:jc w:val="center"/>
-            </w:pPr>
-          </w:p>
-        </w:tc>
-        <w:tc>
-          <w:tcPr>
-            <w:tcW w:type="dxa" w:w="1200"/>
-            <w:tcBorders>
-              <w:top w:val="single" w:color="000000" w:sz="4"/>
-              <w:left w:val="single" w:color="000000" w:sz="4"/>
-              <w:bottom w:val="single" w:color="000000" w:sz="4"/>
-              <w:right w:val="single" w:color="000000" w:sz="4"/>
-            </w:tcBorders>
-            <w:tcMar>
-              <w:top w:type="dxa" w:w="40"/>
-              <w:left w:type="dxa" w:w="80"/>
-              <w:bottom w:type="dxa" w:w="40"/>
-              <w:right w:type="dxa" w:w="80"/>
-            </w:tcMar>
-            <w:vAlign w:val="center"/>
-          </w:tcPr>
-          <w:p>
-            <w:pPr>
-              <w:spacing w:after="0" w:before="0" w:line="240"/>
-              <w:jc w:val="center"/>
-            </w:pPr>
-          </w:p>
-        </w:tc>
-      </w:tr>
-      <w:tr>
-        <w:trPr>
-          <w:cantSplit/>
-        </w:trPr>
-        <w:tc>
-          <w:tcPr>
-            <w:tcW w:type="dxa" w:w="6038"/>
-            <w:tcBorders>
-              <w:top w:val="single" w:color="000000" w:sz="4"/>
-              <w:left w:val="single" w:color="000000" w:sz="4"/>
-              <w:bottom w:val="single" w:color="000000" w:sz="4"/>
-              <w:right w:val="single" w:color="000000" w:sz="4"/>
-            </w:tcBorders>
-            <w:tcMar>
-              <w:top w:type="dxa" w:w="40"/>
-              <w:left w:type="dxa" w:w="80"/>
-              <w:bottom w:type="dxa" w:w="40"/>
-              <w:right w:type="dxa" w:w="80"/>
-            </w:tcMar>
-            <w:vAlign w:val="center"/>
-          </w:tcPr>
-          <w:p>
-            <w:pPr>
-              <w:spacing w:after="0" w:before="0" w:line="240"/>
-              <w:jc w:val="left"/>
-            </w:pPr>
-            <w:r>
-              <w:rPr>
-                <w:rFonts w:ascii="Calibri" w:cs="Calibri" w:eastAsia="Calibri" w:hAnsi="Calibri"/>
-                <w:b/>
-                <w:bCs/>
-                <w:sz w:val="19"/>
-                <w:szCs w:val="19"/>
-              </w:rPr>
-              <w:t xml:space="preserve">7. Kontrola jakości po naprawie</w:t>
-            </w:r>
-          </w:p>
-        </w:tc>
-        <w:tc>
-          <w:tcPr>
-            <w:tcW w:type="dxa" w:w="1100"/>
-            <w:tcBorders>
-              <w:top w:val="single" w:color="000000" w:sz="4"/>
-              <w:left w:val="single" w:color="000000" w:sz="4"/>
-              <w:bottom w:val="single" w:color="000000" w:sz="4"/>
-              <w:right w:val="single" w:color="000000" w:sz="4"/>
-            </w:tcBorders>
-            <w:tcMar>
-              <w:top w:type="dxa" w:w="40"/>
-              <w:left w:type="dxa" w:w="80"/>
-              <w:bottom w:type="dxa" w:w="40"/>
-              <w:right w:type="dxa" w:w="80"/>
-            </w:tcMar>
-            <w:vAlign w:val="center"/>
-          </w:tcPr>
-          <w:p>
-            <w:pPr>
-              <w:spacing w:after="0" w:before="0" w:line="240"/>
-              <w:jc w:val="center"/>
-            </w:pPr>
-            <w:r>
-              <w:rPr>
-                <w:rFonts w:ascii="Calibri" w:cs="Calibri" w:eastAsia="Calibri" w:hAnsi="Calibri"/>
-                <w:sz w:val="19"/>
-                <w:szCs w:val="19"/>
-              </w:rPr>
-              <w:t xml:space="preserve">–</w:t>
-            </w:r>
-          </w:p>
-        </w:tc>
-        <w:tc>
-          <w:tcPr>
-            <w:tcW w:type="dxa" w:w="1300"/>
-            <w:tcBorders>
-              <w:top w:val="single" w:color="000000" w:sz="4"/>
-              <w:left w:val="single" w:color="000000" w:sz="4"/>
-              <w:bottom w:val="single" w:color="000000" w:sz="4"/>
-              <w:right w:val="single" w:color="000000" w:sz="4"/>
-            </w:tcBorders>
-            <w:tcMar>
-              <w:top w:type="dxa" w:w="40"/>
-              <w:left w:type="dxa" w:w="80"/>
-              <w:bottom w:type="dxa" w:w="40"/>
-              <w:right w:type="dxa" w:w="80"/>
-            </w:tcMar>
-            <w:vAlign w:val="center"/>
-          </w:tcPr>
-          <w:p>
-            <w:pPr>
-              <w:spacing w:after="0" w:before="0" w:line="240"/>
-              <w:jc w:val="center"/>
-            </w:pPr>
-            <w:r>
-              <w:rPr>
-                <w:rFonts w:ascii="Calibri" w:cs="Calibri" w:eastAsia="Calibri" w:hAnsi="Calibri"/>
-                <w:b/>
-                <w:bCs/>
-                <w:sz w:val="19"/>
-                <w:szCs w:val="19"/>
-              </w:rPr>
-              <w:t xml:space="preserve">7%</w:t>
-            </w:r>
-          </w:p>
-        </w:tc>
-        <w:tc>
-          <w:tcPr>
-            <w:tcW w:type="dxa" w:w="1200"/>
-            <w:tcBorders>
-              <w:top w:val="single" w:color="000000" w:sz="4"/>
-              <w:left w:val="single" w:color="000000" w:sz="4"/>
-              <w:bottom w:val="single" w:color="000000" w:sz="4"/>
-              <w:right w:val="single" w:color="000000" w:sz="4"/>
-            </w:tcBorders>
-            <w:tcMar>
-              <w:top w:type="dxa" w:w="40"/>
-              <w:left w:type="dxa" w:w="80"/>
-              <w:bottom w:type="dxa" w:w="40"/>
-              <w:right w:type="dxa" w:w="80"/>
-            </w:tcMar>
-            <w:vAlign w:val="center"/>
-          </w:tcPr>
-          <w:p>
-            <w:pPr>
-              <w:spacing w:after="0" w:before="0" w:line="240"/>
-              <w:jc w:val="center"/>
-            </w:pPr>
-            <w:r>
-              <w:rPr>
-                <w:rFonts w:ascii="Calibri" w:cs="Calibri" w:eastAsia="Calibri" w:hAnsi="Calibri"/>
-                <w:sz w:val="17"/>
-                <w:szCs w:val="17"/>
-              </w:rPr>
-              <w:t xml:space="preserve">w przygotowaniu</w:t>
-            </w:r>
-          </w:p>
-        </w:tc>
-      </w:tr>
-      <w:tr>
-        <w:trPr>
-          <w:cantSplit/>
-        </w:trPr>
-        <w:tc>
-          <w:tcPr>
-            <w:tcW w:type="dxa" w:w="6038"/>
-            <w:tcBorders>
-              <w:top w:val="single" w:color="000000" w:sz="4"/>
-              <w:left w:val="single" w:color="000000" w:sz="4"/>
-              <w:bottom w:val="single" w:color="000000" w:sz="4"/>
-              <w:right w:val="single" w:color="000000" w:sz="4"/>
-            </w:tcBorders>
-            <w:tcMar>
-              <w:top w:type="dxa" w:w="40"/>
-              <w:left w:type="dxa" w:w="80"/>
-              <w:bottom w:type="dxa" w:w="40"/>
-              <w:right w:type="dxa" w:w="80"/>
-            </w:tcMar>
-            <w:vAlign w:val="center"/>
-          </w:tcPr>
-          <w:p>
-            <w:pPr>
-              <w:spacing w:after="0" w:before="0" w:line="240"/>
-              <w:jc w:val="left"/>
-            </w:pPr>
-            <w:r>
-              <w:rPr>
-                <w:rFonts w:ascii="Calibri" w:cs="Calibri" w:eastAsia="Calibri" w:hAnsi="Calibri"/>
-                <w:sz w:val="19"/>
-                <w:szCs w:val="19"/>
-              </w:rPr>
-              <w:t xml:space="preserve">      7.1. Kontrola statyczna układu hamulcowego</w:t>
-            </w:r>
-          </w:p>
-        </w:tc>
-        <w:tc>
-          <w:tcPr>
-            <w:tcW w:type="dxa" w:w="1100"/>
-            <w:tcBorders>
-              <w:top w:val="single" w:color="000000" w:sz="4"/>
-              <w:left w:val="single" w:color="000000" w:sz="4"/>
-              <w:bottom w:val="single" w:color="000000" w:sz="4"/>
-              <w:right w:val="single" w:color="000000" w:sz="4"/>
-            </w:tcBorders>
-            <w:tcMar>
-              <w:top w:type="dxa" w:w="40"/>
-              <w:left w:type="dxa" w:w="80"/>
-              <w:bottom w:type="dxa" w:w="40"/>
-              <w:right w:type="dxa" w:w="80"/>
-            </w:tcMar>
-            <w:vAlign w:val="center"/>
-          </w:tcPr>
-          <w:p>
-            <w:pPr>
-              <w:spacing w:after="0" w:before="0" w:line="240"/>
-              <w:jc w:val="center"/>
-            </w:pPr>
-            <w:r>
-              <w:rPr>
-                <w:rFonts w:ascii="Calibri" w:cs="Calibri" w:eastAsia="Calibri" w:hAnsi="Calibri"/>
-                <w:sz w:val="19"/>
-                <w:szCs w:val="19"/>
-              </w:rPr>
-              <w:t xml:space="preserve">–</w:t>
-            </w:r>
-          </w:p>
-        </w:tc>
-        <w:tc>
-          <w:tcPr>
-            <w:tcW w:type="dxa" w:w="1300"/>
-            <w:tcBorders>
-              <w:top w:val="single" w:color="000000" w:sz="4"/>
-              <w:left w:val="single" w:color="000000" w:sz="4"/>
-              <w:bottom w:val="single" w:color="000000" w:sz="4"/>
-              <w:right w:val="single" w:color="000000" w:sz="4"/>
-            </w:tcBorders>
-            <w:tcMar>
-              <w:top w:type="dxa" w:w="40"/>
-              <w:left w:type="dxa" w:w="80"/>
-              <w:bottom w:type="dxa" w:w="40"/>
-              <w:right w:type="dxa" w:w="80"/>
-            </w:tcMar>
-            <w:vAlign w:val="center"/>
-          </w:tcPr>
-          <w:p>
-            <w:pPr>
-              <w:spacing w:after="0" w:before="0" w:line="240"/>
-              <w:jc w:val="center"/>
-            </w:pPr>
-          </w:p>
-        </w:tc>
-        <w:tc>
-          <w:tcPr>
-            <w:tcW w:type="dxa" w:w="1200"/>
-            <w:tcBorders>
-              <w:top w:val="single" w:color="000000" w:sz="4"/>
-              <w:left w:val="single" w:color="000000" w:sz="4"/>
-              <w:bottom w:val="single" w:color="000000" w:sz="4"/>
-              <w:right w:val="single" w:color="000000" w:sz="4"/>
-            </w:tcBorders>
-            <w:tcMar>
-              <w:top w:type="dxa" w:w="40"/>
-              <w:left w:type="dxa" w:w="80"/>
-              <w:bottom w:type="dxa" w:w="40"/>
-              <w:right w:type="dxa" w:w="80"/>
-            </w:tcMar>
-            <w:vAlign w:val="center"/>
-          </w:tcPr>
-          <w:p>
-            <w:pPr>
-              <w:spacing w:after="0" w:before="0" w:line="240"/>
-              <w:jc w:val="center"/>
-            </w:pPr>
-          </w:p>
-        </w:tc>
-      </w:tr>
-      <w:tr>
-        <w:trPr>
-          <w:cantSplit/>
-        </w:trPr>
-        <w:tc>
-          <w:tcPr>
-            <w:tcW w:type="dxa" w:w="6038"/>
-            <w:tcBorders>
-              <w:top w:val="single" w:color="000000" w:sz="4"/>
-              <w:left w:val="single" w:color="000000" w:sz="4"/>
-              <w:bottom w:val="single" w:color="000000" w:sz="4"/>
-              <w:right w:val="single" w:color="000000" w:sz="4"/>
-            </w:tcBorders>
-            <w:tcMar>
-              <w:top w:type="dxa" w:w="40"/>
-              <w:left w:type="dxa" w:w="80"/>
-              <w:bottom w:type="dxa" w:w="40"/>
-              <w:right w:type="dxa" w:w="80"/>
-            </w:tcMar>
-            <w:vAlign w:val="center"/>
-          </w:tcPr>
-          <w:p>
-            <w:pPr>
-              <w:spacing w:after="0" w:before="0" w:line="240"/>
-              <w:jc w:val="left"/>
-            </w:pPr>
-            <w:r>
-              <w:rPr>
-                <w:rFonts w:ascii="Calibri" w:cs="Calibri" w:eastAsia="Calibri" w:hAnsi="Calibri"/>
-                <w:sz w:val="19"/>
-                <w:szCs w:val="19"/>
-              </w:rPr>
-              <w:t xml:space="preserve">      7.2. Badanie skuteczności hamowania na stanowisku rolkowym</w:t>
-            </w:r>
-          </w:p>
-        </w:tc>
-        <w:tc>
-          <w:tcPr>
-            <w:tcW w:type="dxa" w:w="1100"/>
-            <w:tcBorders>
-              <w:top w:val="single" w:color="000000" w:sz="4"/>
-              <w:left w:val="single" w:color="000000" w:sz="4"/>
-              <w:bottom w:val="single" w:color="000000" w:sz="4"/>
-              <w:right w:val="single" w:color="000000" w:sz="4"/>
-            </w:tcBorders>
-            <w:tcMar>
-              <w:top w:type="dxa" w:w="40"/>
-              <w:left w:type="dxa" w:w="80"/>
-              <w:bottom w:type="dxa" w:w="40"/>
-              <w:right w:type="dxa" w:w="80"/>
-            </w:tcMar>
-            <w:vAlign w:val="center"/>
-          </w:tcPr>
-          <w:p>
-            <w:pPr>
-              <w:spacing w:after="0" w:before="0" w:line="240"/>
-              <w:jc w:val="center"/>
-            </w:pPr>
-            <w:r>
-              <w:rPr>
-                <w:rFonts w:ascii="Calibri" w:cs="Calibri" w:eastAsia="Calibri" w:hAnsi="Calibri"/>
-                <w:sz w:val="19"/>
-                <w:szCs w:val="19"/>
-              </w:rPr>
-              <w:t xml:space="preserve">–</w:t>
-            </w:r>
-          </w:p>
-        </w:tc>
-        <w:tc>
-          <w:tcPr>
-            <w:tcW w:type="dxa" w:w="1300"/>
-            <w:tcBorders>
-              <w:top w:val="single" w:color="000000" w:sz="4"/>
-              <w:left w:val="single" w:color="000000" w:sz="4"/>
-              <w:bottom w:val="single" w:color="000000" w:sz="4"/>
-              <w:right w:val="single" w:color="000000" w:sz="4"/>
-            </w:tcBorders>
-            <w:tcMar>
-              <w:top w:type="dxa" w:w="40"/>
-              <w:left w:type="dxa" w:w="80"/>
-              <w:bottom w:type="dxa" w:w="40"/>
-              <w:right w:type="dxa" w:w="80"/>
-            </w:tcMar>
-            <w:vAlign w:val="center"/>
-          </w:tcPr>
-          <w:p>
-            <w:pPr>
-              <w:spacing w:after="0" w:before="0" w:line="240"/>
-              <w:jc w:val="center"/>
-            </w:pPr>
-          </w:p>
-        </w:tc>
-        <w:tc>
-          <w:tcPr>
-            <w:tcW w:type="dxa" w:w="1200"/>
-            <w:tcBorders>
-              <w:top w:val="single" w:color="000000" w:sz="4"/>
-              <w:left w:val="single" w:color="000000" w:sz="4"/>
-              <w:bottom w:val="single" w:color="000000" w:sz="4"/>
-              <w:right w:val="single" w:color="000000" w:sz="4"/>
-            </w:tcBorders>
-            <w:tcMar>
-              <w:top w:type="dxa" w:w="40"/>
-              <w:left w:type="dxa" w:w="80"/>
-              <w:bottom w:type="dxa" w:w="40"/>
-              <w:right w:type="dxa" w:w="80"/>
-            </w:tcMar>
-            <w:vAlign w:val="center"/>
-          </w:tcPr>
-          <w:p>
-            <w:pPr>
-              <w:spacing w:after="0" w:before="0" w:line="240"/>
-              <w:jc w:val="center"/>
-            </w:pPr>
-          </w:p>
-        </w:tc>
-      </w:tr>
-      <w:tr>
-        <w:trPr>
-          <w:cantSplit/>
-        </w:trPr>
-        <w:tc>
-          <w:tcPr>
-            <w:tcW w:type="dxa" w:w="6038"/>
-            <w:tcBorders>
-              <w:top w:val="single" w:color="000000" w:sz="4"/>
-              <w:left w:val="single" w:color="000000" w:sz="4"/>
-              <w:bottom w:val="single" w:color="000000" w:sz="4"/>
-              <w:right w:val="single" w:color="000000" w:sz="4"/>
-            </w:tcBorders>
-            <w:tcMar>
-              <w:top w:type="dxa" w:w="40"/>
-              <w:left w:type="dxa" w:w="80"/>
-              <w:bottom w:type="dxa" w:w="40"/>
-              <w:right w:type="dxa" w:w="80"/>
-            </w:tcMar>
-            <w:vAlign w:val="center"/>
-          </w:tcPr>
-          <w:p>
-            <w:pPr>
-              <w:spacing w:after="0" w:before="0" w:line="240"/>
-              <w:jc w:val="left"/>
-            </w:pPr>
-            <w:r>
-              <w:rPr>
-                <w:rFonts w:ascii="Calibri" w:cs="Calibri" w:eastAsia="Calibri" w:hAnsi="Calibri"/>
-                <w:sz w:val="19"/>
-                <w:szCs w:val="19"/>
-              </w:rPr>
-              <w:t xml:space="preserve">      7.3. Protokół kontroli jakości</w:t>
-            </w:r>
-          </w:p>
-        </w:tc>
-        <w:tc>
-          <w:tcPr>
-            <w:tcW w:type="dxa" w:w="1100"/>
-            <w:tcBorders>
-              <w:top w:val="single" w:color="000000" w:sz="4"/>
-              <w:left w:val="single" w:color="000000" w:sz="4"/>
-              <w:bottom w:val="single" w:color="000000" w:sz="4"/>
-              <w:right w:val="single" w:color="000000" w:sz="4"/>
-            </w:tcBorders>
-            <w:tcMar>
-              <w:top w:type="dxa" w:w="40"/>
-              <w:left w:type="dxa" w:w="80"/>
-              <w:bottom w:type="dxa" w:w="40"/>
-              <w:right w:type="dxa" w:w="80"/>
-            </w:tcMar>
-            <w:vAlign w:val="center"/>
-          </w:tcPr>
-          <w:p>
-            <w:pPr>
-              <w:spacing w:after="0" w:before="0" w:line="240"/>
-              <w:jc w:val="center"/>
-            </w:pPr>
-            <w:r>
-              <w:rPr>
-                <w:rFonts w:ascii="Calibri" w:cs="Calibri" w:eastAsia="Calibri" w:hAnsi="Calibri"/>
-                <w:sz w:val="19"/>
-                <w:szCs w:val="19"/>
-              </w:rPr>
-              <w:t xml:space="preserve">–</w:t>
-            </w:r>
-          </w:p>
-        </w:tc>
-        <w:tc>
-          <w:tcPr>
-            <w:tcW w:type="dxa" w:w="1300"/>
-            <w:tcBorders>
-              <w:top w:val="single" w:color="000000" w:sz="4"/>
-              <w:left w:val="single" w:color="000000" w:sz="4"/>
-              <w:bottom w:val="single" w:color="000000" w:sz="4"/>
-              <w:right w:val="single" w:color="000000" w:sz="4"/>
-            </w:tcBorders>
-            <w:tcMar>
-              <w:top w:type="dxa" w:w="40"/>
-              <w:left w:type="dxa" w:w="80"/>
-              <w:bottom w:type="dxa" w:w="40"/>
-              <w:right w:type="dxa" w:w="80"/>
-            </w:tcMar>
-            <w:vAlign w:val="center"/>
-          </w:tcPr>
-          <w:p>
-            <w:pPr>
-              <w:spacing w:after="0" w:before="0" w:line="240"/>
-              <w:jc w:val="center"/>
-            </w:pPr>
-          </w:p>
-        </w:tc>
-        <w:tc>
-          <w:tcPr>
-            <w:tcW w:type="dxa" w:w="1200"/>
-            <w:tcBorders>
-              <w:top w:val="single" w:color="000000" w:sz="4"/>
-              <w:left w:val="single" w:color="000000" w:sz="4"/>
-              <w:bottom w:val="single" w:color="000000" w:sz="4"/>
-              <w:right w:val="single" w:color="000000" w:sz="4"/>
-            </w:tcBorders>
-            <w:tcMar>
-              <w:top w:type="dxa" w:w="40"/>
-              <w:left w:type="dxa" w:w="80"/>
-              <w:bottom w:type="dxa" w:w="40"/>
-              <w:right w:type="dxa" w:w="80"/>
-            </w:tcMar>
-            <w:vAlign w:val="center"/>
-          </w:tcPr>
-          <w:p>
-            <w:pPr>
-              <w:spacing w:after="0" w:before="0" w:line="240"/>
-              <w:jc w:val="center"/>
-            </w:pPr>
-          </w:p>
-        </w:tc>
-      </w:tr>
-      <w:tr>
-        <w:trPr>
-          <w:cantSplit/>
-        </w:trPr>
-        <w:tc>
-          <w:tcPr>
-            <w:tcW w:type="dxa" w:w="6038"/>
-            <w:tcBorders>
-              <w:top w:val="single" w:color="000000" w:sz="4"/>
-              <w:left w:val="single" w:color="000000" w:sz="4"/>
-              <w:bottom w:val="single" w:color="000000" w:sz="4"/>
-              <w:right w:val="single" w:color="000000" w:sz="4"/>
-            </w:tcBorders>
-            <w:tcMar>
-              <w:top w:type="dxa" w:w="40"/>
-              <w:left w:type="dxa" w:w="80"/>
-              <w:bottom w:type="dxa" w:w="40"/>
-              <w:right w:type="dxa" w:w="80"/>
-            </w:tcMar>
-            <w:vAlign w:val="center"/>
-          </w:tcPr>
-          <w:p>
-            <w:pPr>
-              <w:spacing w:after="0" w:before="0" w:line="240"/>
-              <w:jc w:val="left"/>
-            </w:pPr>
-            <w:r>
-              <w:rPr>
-                <w:rFonts w:ascii="Calibri" w:cs="Calibri" w:eastAsia="Calibri" w:hAnsi="Calibri"/>
-                <w:sz w:val="19"/>
-                <w:szCs w:val="19"/>
-              </w:rPr>
-              <w:t xml:space="preserve">      7.4. Jazda próbna i docieranie klocków</w:t>
-            </w:r>
-          </w:p>
-        </w:tc>
-        <w:tc>
-          <w:tcPr>
-            <w:tcW w:type="dxa" w:w="1100"/>
-            <w:tcBorders>
-              <w:top w:val="single" w:color="000000" w:sz="4"/>
-              <w:left w:val="single" w:color="000000" w:sz="4"/>
-              <w:bottom w:val="single" w:color="000000" w:sz="4"/>
-              <w:right w:val="single" w:color="000000" w:sz="4"/>
-            </w:tcBorders>
-            <w:tcMar>
-              <w:top w:type="dxa" w:w="40"/>
-              <w:left w:type="dxa" w:w="80"/>
-              <w:bottom w:type="dxa" w:w="40"/>
-              <w:right w:type="dxa" w:w="80"/>
-            </w:tcMar>
-            <w:vAlign w:val="center"/>
-          </w:tcPr>
-          <w:p>
-            <w:pPr>
-              <w:spacing w:after="0" w:before="0" w:line="240"/>
-              <w:jc w:val="center"/>
-            </w:pPr>
-            <w:r>
-              <w:rPr>
-                <w:rFonts w:ascii="Calibri" w:cs="Calibri" w:eastAsia="Calibri" w:hAnsi="Calibri"/>
-                <w:sz w:val="19"/>
-                <w:szCs w:val="19"/>
-              </w:rPr>
-              <w:t xml:space="preserve">–</w:t>
-            </w:r>
-          </w:p>
-        </w:tc>
-        <w:tc>
-          <w:tcPr>
-            <w:tcW w:type="dxa" w:w="1300"/>
-            <w:tcBorders>
-              <w:top w:val="single" w:color="000000" w:sz="4"/>
-              <w:left w:val="single" w:color="000000" w:sz="4"/>
-              <w:bottom w:val="single" w:color="000000" w:sz="4"/>
-              <w:right w:val="single" w:color="000000" w:sz="4"/>
-            </w:tcBorders>
-            <w:tcMar>
-              <w:top w:type="dxa" w:w="40"/>
-              <w:left w:type="dxa" w:w="80"/>
-              <w:bottom w:type="dxa" w:w="40"/>
-              <w:right w:type="dxa" w:w="80"/>
-            </w:tcMar>
-            <w:vAlign w:val="center"/>
-          </w:tcPr>
-          <w:p>
-            <w:pPr>
-              <w:spacing w:after="0" w:before="0" w:line="240"/>
-              <w:jc w:val="center"/>
-            </w:pPr>
-          </w:p>
-        </w:tc>
-        <w:tc>
-          <w:tcPr>
-            <w:tcW w:type="dxa" w:w="1200"/>
-            <w:tcBorders>
-              <w:top w:val="single" w:color="000000" w:sz="4"/>
-              <w:left w:val="single" w:color="000000" w:sz="4"/>
-              <w:bottom w:val="single" w:color="000000" w:sz="4"/>
-              <w:right w:val="single" w:color="000000" w:sz="4"/>
-            </w:tcBorders>
-            <w:tcMar>
-              <w:top w:type="dxa" w:w="40"/>
-              <w:left w:type="dxa" w:w="80"/>
-              <w:bottom w:type="dxa" w:w="40"/>
-              <w:right w:type="dxa" w:w="80"/>
-            </w:tcMar>
-            <w:vAlign w:val="center"/>
-          </w:tcPr>
-          <w:p>
-            <w:pPr>
-              <w:spacing w:after="0" w:before="0" w:line="240"/>
-              <w:jc w:val="center"/>
-            </w:pPr>
-          </w:p>
-        </w:tc>
-      </w:tr>
-      <w:tr>
-        <w:trPr>
-          <w:cantSplit/>
-        </w:trPr>
-        <w:tc>
-          <w:tcPr>
-            <w:tcW w:type="dxa" w:w="6038"/>
-            <w:tcBorders>
-              <w:top w:val="single" w:color="000000" w:sz="4"/>
-              <w:left w:val="single" w:color="000000" w:sz="4"/>
-              <w:bottom w:val="single" w:color="000000" w:sz="4"/>
-              <w:right w:val="single" w:color="000000" w:sz="4"/>
-            </w:tcBorders>
-            <w:tcMar>
-              <w:top w:type="dxa" w:w="40"/>
-              <w:left w:type="dxa" w:w="80"/>
-              <w:bottom w:type="dxa" w:w="40"/>
-              <w:right w:type="dxa" w:w="80"/>
-            </w:tcMar>
-            <w:vAlign w:val="center"/>
-          </w:tcPr>
-          <w:p>
-            <w:pPr>
-              <w:spacing w:after="0" w:before="0" w:line="240"/>
-              <w:jc w:val="left"/>
-            </w:pPr>
-            <w:r>
-              <w:rPr>
-                <w:rFonts w:ascii="Calibri" w:cs="Calibri" w:eastAsia="Calibri" w:hAnsi="Calibri"/>
-                <w:b/>
-                <w:bCs/>
-                <w:sz w:val="19"/>
-                <w:szCs w:val="19"/>
-              </w:rPr>
-              <w:t xml:space="preserve">8. Typowe błędy wykonawcze i ich skutki</w:t>
-            </w:r>
-          </w:p>
-        </w:tc>
-        <w:tc>
-          <w:tcPr>
-            <w:tcW w:type="dxa" w:w="1100"/>
-            <w:tcBorders>
-              <w:top w:val="single" w:color="000000" w:sz="4"/>
-              <w:left w:val="single" w:color="000000" w:sz="4"/>
-              <w:bottom w:val="single" w:color="000000" w:sz="4"/>
-              <w:right w:val="single" w:color="000000" w:sz="4"/>
-            </w:tcBorders>
-            <w:tcMar>
-              <w:top w:type="dxa" w:w="40"/>
-              <w:left w:type="dxa" w:w="80"/>
-              <w:bottom w:type="dxa" w:w="40"/>
-              <w:right w:type="dxa" w:w="80"/>
-            </w:tcMar>
-            <w:vAlign w:val="center"/>
-          </w:tcPr>
-          <w:p>
-            <w:pPr>
-              <w:spacing w:after="0" w:before="0" w:line="240"/>
-              <w:jc w:val="center"/>
-            </w:pPr>
-            <w:r>
-              <w:rPr>
-                <w:rFonts w:ascii="Calibri" w:cs="Calibri" w:eastAsia="Calibri" w:hAnsi="Calibri"/>
-                <w:sz w:val="19"/>
-                <w:szCs w:val="19"/>
-              </w:rPr>
-              <w:t xml:space="preserve">–</w:t>
-            </w:r>
-          </w:p>
-        </w:tc>
-        <w:tc>
-          <w:tcPr>
-            <w:tcW w:type="dxa" w:w="1300"/>
-            <w:tcBorders>
-              <w:top w:val="single" w:color="000000" w:sz="4"/>
-              <w:left w:val="single" w:color="000000" w:sz="4"/>
-              <w:bottom w:val="single" w:color="000000" w:sz="4"/>
-              <w:right w:val="single" w:color="000000" w:sz="4"/>
-            </w:tcBorders>
-            <w:tcMar>
-              <w:top w:type="dxa" w:w="40"/>
-              <w:left w:type="dxa" w:w="80"/>
-              <w:bottom w:type="dxa" w:w="40"/>
-              <w:right w:type="dxa" w:w="80"/>
-            </w:tcMar>
-            <w:vAlign w:val="center"/>
-          </w:tcPr>
-          <w:p>
-            <w:pPr>
-              <w:spacing w:after="0" w:before="0" w:line="240"/>
-              <w:jc w:val="center"/>
-            </w:pPr>
-            <w:r>
-              <w:rPr>
-                <w:rFonts w:ascii="Calibri" w:cs="Calibri" w:eastAsia="Calibri" w:hAnsi="Calibri"/>
-                <w:b/>
-                <w:bCs/>
-                <w:sz w:val="19"/>
-                <w:szCs w:val="19"/>
-              </w:rPr>
-              <w:t xml:space="preserve">4%</w:t>
-            </w:r>
-          </w:p>
-        </w:tc>
-        <w:tc>
-          <w:tcPr>
-            <w:tcW w:type="dxa" w:w="1200"/>
-            <w:tcBorders>
-              <w:top w:val="single" w:color="000000" w:sz="4"/>
-              <w:left w:val="single" w:color="000000" w:sz="4"/>
-              <w:bottom w:val="single" w:color="000000" w:sz="4"/>
-              <w:right w:val="single" w:color="000000" w:sz="4"/>
-            </w:tcBorders>
-            <w:tcMar>
-              <w:top w:type="dxa" w:w="40"/>
-              <w:left w:type="dxa" w:w="80"/>
-              <w:bottom w:type="dxa" w:w="40"/>
-              <w:right w:type="dxa" w:w="80"/>
-            </w:tcMar>
-            <w:vAlign w:val="center"/>
-          </w:tcPr>
-          <w:p>
-            <w:pPr>
-              <w:spacing w:after="0" w:before="0" w:line="240"/>
-              <w:jc w:val="center"/>
-            </w:pPr>
-            <w:r>
-              <w:rPr>
-                <w:rFonts w:ascii="Calibri" w:cs="Calibri" w:eastAsia="Calibri" w:hAnsi="Calibri"/>
-                <w:sz w:val="17"/>
-                <w:szCs w:val="17"/>
-              </w:rPr>
-              <w:t xml:space="preserve">w przygotowaniu</w:t>
-            </w:r>
-          </w:p>
-        </w:tc>
-      </w:tr>
-      <w:tr>
-        <w:trPr>
-          <w:cantSplit/>
-        </w:trPr>
-        <w:tc>
-          <w:tcPr>
-            <w:tcW w:type="dxa" w:w="6038"/>
-            <w:tcBorders>
-              <w:top w:val="single" w:color="000000" w:sz="4"/>
-              <w:left w:val="single" w:color="000000" w:sz="4"/>
-              <w:bottom w:val="single" w:color="000000" w:sz="4"/>
-              <w:right w:val="single" w:color="000000" w:sz="4"/>
-            </w:tcBorders>
-            <w:tcMar>
-              <w:top w:type="dxa" w:w="40"/>
-              <w:left w:type="dxa" w:w="80"/>
-              <w:bottom w:type="dxa" w:w="40"/>
-              <w:right w:type="dxa" w:w="80"/>
-            </w:tcMar>
-            <w:vAlign w:val="center"/>
-          </w:tcPr>
-          <w:p>
-            <w:pPr>
-              <w:spacing w:after="0" w:before="0" w:line="240"/>
-              <w:jc w:val="left"/>
-            </w:pPr>
-            <w:r>
-              <w:rPr>
-                <w:rFonts w:ascii="Calibri" w:cs="Calibri" w:eastAsia="Calibri" w:hAnsi="Calibri"/>
-                <w:b/>
-                <w:bCs/>
-                <w:sz w:val="19"/>
-                <w:szCs w:val="19"/>
-              </w:rPr>
-              <w:t xml:space="preserve">9. Analiza kosztów naprawy</w:t>
-            </w:r>
-          </w:p>
-        </w:tc>
-        <w:tc>
-          <w:tcPr>
-            <w:tcW w:type="dxa" w:w="1100"/>
-            <w:tcBorders>
-              <w:top w:val="single" w:color="000000" w:sz="4"/>
-              <w:left w:val="single" w:color="000000" w:sz="4"/>
-              <w:bottom w:val="single" w:color="000000" w:sz="4"/>
-              <w:right w:val="single" w:color="000000" w:sz="4"/>
-            </w:tcBorders>
-            <w:tcMar>
-              <w:top w:type="dxa" w:w="40"/>
-              <w:left w:type="dxa" w:w="80"/>
-              <w:bottom w:type="dxa" w:w="40"/>
-              <w:right w:type="dxa" w:w="80"/>
-            </w:tcMar>
-            <w:vAlign w:val="center"/>
-          </w:tcPr>
-          <w:p>
-            <w:pPr>
-              <w:spacing w:after="0" w:before="0" w:line="240"/>
-              <w:jc w:val="center"/>
-            </w:pPr>
-            <w:r>
-              <w:rPr>
-                <w:rFonts w:ascii="Calibri" w:cs="Calibri" w:eastAsia="Calibri" w:hAnsi="Calibri"/>
-                <w:sz w:val="19"/>
-                <w:szCs w:val="19"/>
-              </w:rPr>
-              <w:t xml:space="preserve">–</w:t>
-            </w:r>
-          </w:p>
-        </w:tc>
-        <w:tc>
-          <w:tcPr>
-            <w:tcW w:type="dxa" w:w="1300"/>
-            <w:tcBorders>
-              <w:top w:val="single" w:color="000000" w:sz="4"/>
-              <w:left w:val="single" w:color="000000" w:sz="4"/>
-              <w:bottom w:val="single" w:color="000000" w:sz="4"/>
-              <w:right w:val="single" w:color="000000" w:sz="4"/>
-            </w:tcBorders>
-            <w:tcMar>
-              <w:top w:type="dxa" w:w="40"/>
-              <w:left w:type="dxa" w:w="80"/>
-              <w:bottom w:type="dxa" w:w="40"/>
-              <w:right w:type="dxa" w:w="80"/>
-            </w:tcMar>
-            <w:vAlign w:val="center"/>
-          </w:tcPr>
-          <w:p>
-            <w:pPr>
-              <w:spacing w:after="0" w:before="0" w:line="240"/>
-              <w:jc w:val="center"/>
-            </w:pPr>
-            <w:r>
-              <w:rPr>
-                <w:rFonts w:ascii="Calibri" w:cs="Calibri" w:eastAsia="Calibri" w:hAnsi="Calibri"/>
-                <w:b/>
-                <w:bCs/>
-                <w:sz w:val="19"/>
-                <w:szCs w:val="19"/>
-              </w:rPr>
-              <w:t xml:space="preserve">4%</w:t>
-            </w:r>
-          </w:p>
-        </w:tc>
-        <w:tc>
-          <w:tcPr>
-            <w:tcW w:type="dxa" w:w="1200"/>
-            <w:tcBorders>
-              <w:top w:val="single" w:color="000000" w:sz="4"/>
-              <w:left w:val="single" w:color="000000" w:sz="4"/>
-              <w:bottom w:val="single" w:color="000000" w:sz="4"/>
-              <w:right w:val="single" w:color="000000" w:sz="4"/>
-            </w:tcBorders>
-            <w:tcMar>
-              <w:top w:type="dxa" w:w="40"/>
-              <w:left w:type="dxa" w:w="80"/>
-              <w:bottom w:type="dxa" w:w="40"/>
-              <w:right w:type="dxa" w:w="80"/>
-            </w:tcMar>
-            <w:vAlign w:val="center"/>
-          </w:tcPr>
-          <w:p>
-            <w:pPr>
-              <w:spacing w:after="0" w:before="0" w:line="240"/>
-              <w:jc w:val="center"/>
-            </w:pPr>
-            <w:r>
-              <w:rPr>
-                <w:rFonts w:ascii="Calibri" w:cs="Calibri" w:eastAsia="Calibri" w:hAnsi="Calibri"/>
-                <w:sz w:val="17"/>
-                <w:szCs w:val="17"/>
-              </w:rPr>
-              <w:t xml:space="preserve">w przygotowaniu</w:t>
-            </w:r>
-          </w:p>
-        </w:tc>
-      </w:tr>
-      <w:tr>
-        <w:trPr>
-          <w:cantSplit/>
-        </w:trPr>
-        <w:tc>
-          <w:tcPr>
-            <w:tcW w:type="dxa" w:w="6038"/>
-            <w:tcBorders>
-              <w:top w:val="single" w:color="000000" w:sz="4"/>
-              <w:left w:val="single" w:color="000000" w:sz="4"/>
-              <w:bottom w:val="single" w:color="000000" w:sz="4"/>
-              <w:right w:val="single" w:color="000000" w:sz="4"/>
-            </w:tcBorders>
-            <w:tcMar>
-              <w:top w:type="dxa" w:w="40"/>
-              <w:left w:type="dxa" w:w="80"/>
-              <w:bottom w:type="dxa" w:w="40"/>
-              <w:right w:type="dxa" w:w="80"/>
-            </w:tcMar>
-            <w:vAlign w:val="center"/>
-          </w:tcPr>
-          <w:p>
-            <w:pPr>
-              <w:spacing w:after="0" w:before="0" w:line="240"/>
-              <w:jc w:val="left"/>
-            </w:pPr>
-            <w:r>
-              <w:rPr>
-                <w:rFonts w:ascii="Calibri" w:cs="Calibri" w:eastAsia="Calibri" w:hAnsi="Calibri"/>
-                <w:sz w:val="19"/>
-                <w:szCs w:val="19"/>
-              </w:rPr>
-              <w:t xml:space="preserve">      9.1. Warianty doboru części</w:t>
-            </w:r>
-          </w:p>
-        </w:tc>
-        <w:tc>
-          <w:tcPr>
-            <w:tcW w:type="dxa" w:w="1100"/>
-            <w:tcBorders>
-              <w:top w:val="single" w:color="000000" w:sz="4"/>
-              <w:left w:val="single" w:color="000000" w:sz="4"/>
-              <w:bottom w:val="single" w:color="000000" w:sz="4"/>
-              <w:right w:val="single" w:color="000000" w:sz="4"/>
-            </w:tcBorders>
-            <w:tcMar>
-              <w:top w:type="dxa" w:w="40"/>
-              <w:left w:type="dxa" w:w="80"/>
-              <w:bottom w:type="dxa" w:w="40"/>
-              <w:right w:type="dxa" w:w="80"/>
-            </w:tcMar>
-            <w:vAlign w:val="center"/>
-          </w:tcPr>
-          <w:p>
-            <w:pPr>
-              <w:spacing w:after="0" w:before="0" w:line="240"/>
-              <w:jc w:val="center"/>
-            </w:pPr>
-            <w:r>
-              <w:rPr>
-                <w:rFonts w:ascii="Calibri" w:cs="Calibri" w:eastAsia="Calibri" w:hAnsi="Calibri"/>
-                <w:sz w:val="19"/>
-                <w:szCs w:val="19"/>
-              </w:rPr>
-              <w:t xml:space="preserve">–</w:t>
-            </w:r>
-          </w:p>
-        </w:tc>
-        <w:tc>
-          <w:tcPr>
-            <w:tcW w:type="dxa" w:w="1300"/>
-            <w:tcBorders>
-              <w:top w:val="single" w:color="000000" w:sz="4"/>
-              <w:left w:val="single" w:color="000000" w:sz="4"/>
-              <w:bottom w:val="single" w:color="000000" w:sz="4"/>
-              <w:right w:val="single" w:color="000000" w:sz="4"/>
-            </w:tcBorders>
-            <w:tcMar>
-              <w:top w:type="dxa" w:w="40"/>
-              <w:left w:type="dxa" w:w="80"/>
-              <w:bottom w:type="dxa" w:w="40"/>
-              <w:right w:type="dxa" w:w="80"/>
-            </w:tcMar>
-            <w:vAlign w:val="center"/>
-          </w:tcPr>
-          <w:p>
-            <w:pPr>
-              <w:spacing w:after="0" w:before="0" w:line="240"/>
-              <w:jc w:val="center"/>
-            </w:pPr>
-          </w:p>
-        </w:tc>
-        <w:tc>
-          <w:tcPr>
-            <w:tcW w:type="dxa" w:w="1200"/>
-            <w:tcBorders>
-              <w:top w:val="single" w:color="000000" w:sz="4"/>
-              <w:left w:val="single" w:color="000000" w:sz="4"/>
-              <w:bottom w:val="single" w:color="000000" w:sz="4"/>
-              <w:right w:val="single" w:color="000000" w:sz="4"/>
-            </w:tcBorders>
-            <w:tcMar>
-              <w:top w:type="dxa" w:w="40"/>
-              <w:left w:type="dxa" w:w="80"/>
-              <w:bottom w:type="dxa" w:w="40"/>
-              <w:right w:type="dxa" w:w="80"/>
-            </w:tcMar>
-            <w:vAlign w:val="center"/>
-          </w:tcPr>
-          <w:p>
-            <w:pPr>
-              <w:spacing w:after="0" w:before="0" w:line="240"/>
-              <w:jc w:val="center"/>
-            </w:pPr>
-          </w:p>
-        </w:tc>
-      </w:tr>
-      <w:tr>
-        <w:trPr>
-          <w:cantSplit/>
-        </w:trPr>
-        <w:tc>
-          <w:tcPr>
-            <w:tcW w:type="dxa" w:w="6038"/>
-            <w:tcBorders>
-              <w:top w:val="single" w:color="000000" w:sz="4"/>
-              <w:left w:val="single" w:color="000000" w:sz="4"/>
-              <w:bottom w:val="single" w:color="000000" w:sz="4"/>
-              <w:right w:val="single" w:color="000000" w:sz="4"/>
-            </w:tcBorders>
-            <w:tcMar>
-              <w:top w:type="dxa" w:w="40"/>
-              <w:left w:type="dxa" w:w="80"/>
-              <w:bottom w:type="dxa" w:w="40"/>
-              <w:right w:type="dxa" w:w="80"/>
-            </w:tcMar>
-            <w:vAlign w:val="center"/>
-          </w:tcPr>
-          <w:p>
-            <w:pPr>
-              <w:spacing w:after="0" w:before="0" w:line="240"/>
-              <w:jc w:val="left"/>
-            </w:pPr>
-            <w:r>
-              <w:rPr>
-                <w:rFonts w:ascii="Calibri" w:cs="Calibri" w:eastAsia="Calibri" w:hAnsi="Calibri"/>
-                <w:sz w:val="19"/>
-                <w:szCs w:val="19"/>
-              </w:rPr>
-              <w:t xml:space="preserve">      9.2. Koszt robocizny</w:t>
-            </w:r>
-          </w:p>
-        </w:tc>
-        <w:tc>
-          <w:tcPr>
-            <w:tcW w:type="dxa" w:w="1100"/>
-            <w:tcBorders>
-              <w:top w:val="single" w:color="000000" w:sz="4"/>
-              <w:left w:val="single" w:color="000000" w:sz="4"/>
-              <w:bottom w:val="single" w:color="000000" w:sz="4"/>
-              <w:right w:val="single" w:color="000000" w:sz="4"/>
-            </w:tcBorders>
-            <w:tcMar>
-              <w:top w:type="dxa" w:w="40"/>
-              <w:left w:type="dxa" w:w="80"/>
-              <w:bottom w:type="dxa" w:w="40"/>
-              <w:right w:type="dxa" w:w="80"/>
-            </w:tcMar>
-            <w:vAlign w:val="center"/>
-          </w:tcPr>
-          <w:p>
-            <w:pPr>
-              <w:spacing w:after="0" w:before="0" w:line="240"/>
-              <w:jc w:val="center"/>
-            </w:pPr>
-            <w:r>
-              <w:rPr>
-                <w:rFonts w:ascii="Calibri" w:cs="Calibri" w:eastAsia="Calibri" w:hAnsi="Calibri"/>
-                <w:sz w:val="19"/>
-                <w:szCs w:val="19"/>
-              </w:rPr>
-              <w:t xml:space="preserve">–</w:t>
-            </w:r>
-          </w:p>
-        </w:tc>
-        <w:tc>
-          <w:tcPr>
-            <w:tcW w:type="dxa" w:w="1300"/>
-            <w:tcBorders>
-              <w:top w:val="single" w:color="000000" w:sz="4"/>
-              <w:left w:val="single" w:color="000000" w:sz="4"/>
-              <w:bottom w:val="single" w:color="000000" w:sz="4"/>
-              <w:right w:val="single" w:color="000000" w:sz="4"/>
-            </w:tcBorders>
-            <w:tcMar>
-              <w:top w:type="dxa" w:w="40"/>
-              <w:left w:type="dxa" w:w="80"/>
-              <w:bottom w:type="dxa" w:w="40"/>
-              <w:right w:type="dxa" w:w="80"/>
-            </w:tcMar>
-            <w:vAlign w:val="center"/>
-          </w:tcPr>
-          <w:p>
-            <w:pPr>
-              <w:spacing w:after="0" w:before="0" w:line="240"/>
-              <w:jc w:val="center"/>
-            </w:pPr>
-          </w:p>
-        </w:tc>
-        <w:tc>
-          <w:tcPr>
-            <w:tcW w:type="dxa" w:w="1200"/>
-            <w:tcBorders>
-              <w:top w:val="single" w:color="000000" w:sz="4"/>
-              <w:left w:val="single" w:color="000000" w:sz="4"/>
-              <w:bottom w:val="single" w:color="000000" w:sz="4"/>
-              <w:right w:val="single" w:color="000000" w:sz="4"/>
-            </w:tcBorders>
-            <w:tcMar>
-              <w:top w:type="dxa" w:w="40"/>
-              <w:left w:type="dxa" w:w="80"/>
-              <w:bottom w:type="dxa" w:w="40"/>
-              <w:right w:type="dxa" w:w="80"/>
-            </w:tcMar>
-            <w:vAlign w:val="center"/>
-          </w:tcPr>
-          <w:p>
-            <w:pPr>
-              <w:spacing w:after="0" w:before="0" w:line="240"/>
-              <w:jc w:val="center"/>
-            </w:pPr>
-          </w:p>
-        </w:tc>
-      </w:tr>
-      <w:tr>
-        <w:trPr>
-          <w:cantSplit/>
-        </w:trPr>
-        <w:tc>
-          <w:tcPr>
-            <w:tcW w:type="dxa" w:w="6038"/>
-            <w:tcBorders>
-              <w:top w:val="single" w:color="000000" w:sz="4"/>
-              <w:left w:val="single" w:color="000000" w:sz="4"/>
-              <w:bottom w:val="single" w:color="000000" w:sz="4"/>
-              <w:right w:val="single" w:color="000000" w:sz="4"/>
-            </w:tcBorders>
-            <w:tcMar>
-              <w:top w:type="dxa" w:w="40"/>
-              <w:left w:type="dxa" w:w="80"/>
-              <w:bottom w:type="dxa" w:w="40"/>
-              <w:right w:type="dxa" w:w="80"/>
-            </w:tcMar>
-            <w:vAlign w:val="center"/>
-          </w:tcPr>
-          <w:p>
-            <w:pPr>
-              <w:spacing w:after="0" w:before="0" w:line="240"/>
-              <w:jc w:val="left"/>
-            </w:pPr>
-            <w:r>
-              <w:rPr>
-                <w:rFonts w:ascii="Calibri" w:cs="Calibri" w:eastAsia="Calibri" w:hAnsi="Calibri"/>
-                <w:sz w:val="19"/>
-                <w:szCs w:val="19"/>
-              </w:rPr>
-              <w:t xml:space="preserve">      9.3. Zestawienie kosztów</w:t>
-            </w:r>
-          </w:p>
-        </w:tc>
-        <w:tc>
-          <w:tcPr>
-            <w:tcW w:type="dxa" w:w="1100"/>
-            <w:tcBorders>
-              <w:top w:val="single" w:color="000000" w:sz="4"/>
-              <w:left w:val="single" w:color="000000" w:sz="4"/>
-              <w:bottom w:val="single" w:color="000000" w:sz="4"/>
-              <w:right w:val="single" w:color="000000" w:sz="4"/>
-            </w:tcBorders>
-            <w:tcMar>
-              <w:top w:type="dxa" w:w="40"/>
-              <w:left w:type="dxa" w:w="80"/>
-              <w:bottom w:type="dxa" w:w="40"/>
-              <w:right w:type="dxa" w:w="80"/>
-            </w:tcMar>
-            <w:vAlign w:val="center"/>
-          </w:tcPr>
-          <w:p>
-            <w:pPr>
-              <w:spacing w:after="0" w:before="0" w:line="240"/>
-              <w:jc w:val="center"/>
-            </w:pPr>
-            <w:r>
-              <w:rPr>
-                <w:rFonts w:ascii="Calibri" w:cs="Calibri" w:eastAsia="Calibri" w:hAnsi="Calibri"/>
-                <w:sz w:val="19"/>
-                <w:szCs w:val="19"/>
-              </w:rPr>
-              <w:t xml:space="preserve">–</w:t>
-            </w:r>
-          </w:p>
-        </w:tc>
-        <w:tc>
-          <w:tcPr>
-            <w:tcW w:type="dxa" w:w="1300"/>
-            <w:tcBorders>
-              <w:top w:val="single" w:color="000000" w:sz="4"/>
-              <w:left w:val="single" w:color="000000" w:sz="4"/>
-              <w:bottom w:val="single" w:color="000000" w:sz="4"/>
-              <w:right w:val="single" w:color="000000" w:sz="4"/>
-            </w:tcBorders>
-            <w:tcMar>
-              <w:top w:type="dxa" w:w="40"/>
-              <w:left w:type="dxa" w:w="80"/>
-              <w:bottom w:type="dxa" w:w="40"/>
-              <w:right w:type="dxa" w:w="80"/>
-            </w:tcMar>
-            <w:vAlign w:val="center"/>
-          </w:tcPr>
-          <w:p>
-            <w:pPr>
-              <w:spacing w:after="0" w:before="0" w:line="240"/>
-              <w:jc w:val="center"/>
-            </w:pPr>
-          </w:p>
-        </w:tc>
-        <w:tc>
-          <w:tcPr>
-            <w:tcW w:type="dxa" w:w="1200"/>
-            <w:tcBorders>
-              <w:top w:val="single" w:color="000000" w:sz="4"/>
-              <w:left w:val="single" w:color="000000" w:sz="4"/>
-              <w:bottom w:val="single" w:color="000000" w:sz="4"/>
-              <w:right w:val="single" w:color="000000" w:sz="4"/>
-            </w:tcBorders>
-            <w:tcMar>
-              <w:top w:type="dxa" w:w="40"/>
-              <w:left w:type="dxa" w:w="80"/>
-              <w:bottom w:type="dxa" w:w="40"/>
-              <w:right w:type="dxa" w:w="80"/>
-            </w:tcMar>
-            <w:vAlign w:val="center"/>
-          </w:tcPr>
-          <w:p>
-            <w:pPr>
-              <w:spacing w:after="0" w:before="0" w:line="240"/>
-              <w:jc w:val="center"/>
-            </w:pPr>
-          </w:p>
-        </w:tc>
-      </w:tr>
-      <w:tr>
-        <w:trPr>
-          <w:cantSplit/>
-        </w:trPr>
-        <w:tc>
-          <w:tcPr>
-            <w:tcW w:type="dxa" w:w="6038"/>
-            <w:tcBorders>
-              <w:top w:val="single" w:color="000000" w:sz="4"/>
-              <w:left w:val="single" w:color="000000" w:sz="4"/>
-              <w:bottom w:val="single" w:color="000000" w:sz="4"/>
-              <w:right w:val="single" w:color="000000" w:sz="4"/>
-            </w:tcBorders>
-            <w:tcMar>
-              <w:top w:type="dxa" w:w="40"/>
-              <w:left w:type="dxa" w:w="80"/>
-              <w:bottom w:type="dxa" w:w="40"/>
-              <w:right w:type="dxa" w:w="80"/>
-            </w:tcMar>
-            <w:vAlign w:val="center"/>
-          </w:tcPr>
-          <w:p>
-            <w:pPr>
-              <w:spacing w:after="0" w:before="0" w:line="240"/>
-              <w:jc w:val="left"/>
-            </w:pPr>
-            <w:r>
-              <w:rPr>
-                <w:rFonts w:ascii="Calibri" w:cs="Calibri" w:eastAsia="Calibri" w:hAnsi="Calibri"/>
-                <w:b/>
-                <w:bCs/>
-                <w:sz w:val="19"/>
-                <w:szCs w:val="19"/>
-              </w:rPr>
-              <w:t xml:space="preserve">10. Wnioski</w:t>
-            </w:r>
-          </w:p>
-        </w:tc>
-        <w:tc>
-          <w:tcPr>
-            <w:tcW w:type="dxa" w:w="1100"/>
-            <w:tcBorders>
-              <w:top w:val="single" w:color="000000" w:sz="4"/>
-              <w:left w:val="single" w:color="000000" w:sz="4"/>
-              <w:bottom w:val="single" w:color="000000" w:sz="4"/>
-              <w:right w:val="single" w:color="000000" w:sz="4"/>
-            </w:tcBorders>
-            <w:tcMar>
-              <w:top w:type="dxa" w:w="40"/>
-              <w:left w:type="dxa" w:w="80"/>
-              <w:bottom w:type="dxa" w:w="40"/>
-              <w:right w:type="dxa" w:w="80"/>
-            </w:tcMar>
-            <w:vAlign w:val="center"/>
-          </w:tcPr>
-          <w:p>
-            <w:pPr>
-              <w:spacing w:after="0" w:before="0" w:line="240"/>
-              <w:jc w:val="center"/>
-            </w:pPr>
-            <w:r>
-              <w:rPr>
-                <w:rFonts w:ascii="Calibri" w:cs="Calibri" w:eastAsia="Calibri" w:hAnsi="Calibri"/>
-                <w:sz w:val="19"/>
-                <w:szCs w:val="19"/>
-              </w:rPr>
-              <w:t xml:space="preserve">–</w:t>
-            </w:r>
-          </w:p>
-        </w:tc>
-        <w:tc>
-          <w:tcPr>
-            <w:tcW w:type="dxa" w:w="1300"/>
-            <w:tcBorders>
-              <w:top w:val="single" w:color="000000" w:sz="4"/>
-              <w:left w:val="single" w:color="000000" w:sz="4"/>
-              <w:bottom w:val="single" w:color="000000" w:sz="4"/>
-              <w:right w:val="single" w:color="000000" w:sz="4"/>
-            </w:tcBorders>
-            <w:tcMar>
-              <w:top w:type="dxa" w:w="40"/>
-              <w:left w:type="dxa" w:w="80"/>
-              <w:bottom w:type="dxa" w:w="40"/>
-              <w:right w:type="dxa" w:w="80"/>
-            </w:tcMar>
-            <w:vAlign w:val="center"/>
-          </w:tcPr>
-          <w:p>
-            <w:pPr>
-              <w:spacing w:after="0" w:before="0" w:line="240"/>
-              <w:jc w:val="center"/>
-            </w:pPr>
-            <w:r>
-              <w:rPr>
-                <w:rFonts w:ascii="Calibri" w:cs="Calibri" w:eastAsia="Calibri" w:hAnsi="Calibri"/>
-                <w:b/>
-                <w:bCs/>
-                <w:sz w:val="19"/>
-                <w:szCs w:val="19"/>
-              </w:rPr>
-              <w:t xml:space="preserve">3%</w:t>
-            </w:r>
-          </w:p>
-        </w:tc>
-        <w:tc>
-          <w:tcPr>
-            <w:tcW w:type="dxa" w:w="1200"/>
-            <w:tcBorders>
-              <w:top w:val="single" w:color="000000" w:sz="4"/>
-              <w:left w:val="single" w:color="000000" w:sz="4"/>
-              <w:bottom w:val="single" w:color="000000" w:sz="4"/>
-              <w:right w:val="single" w:color="000000" w:sz="4"/>
-            </w:tcBorders>
-            <w:tcMar>
-              <w:top w:type="dxa" w:w="40"/>
-              <w:left w:type="dxa" w:w="80"/>
-              <w:bottom w:type="dxa" w:w="40"/>
-              <w:right w:type="dxa" w:w="80"/>
-            </w:tcMar>
-            <w:vAlign w:val="center"/>
-          </w:tcPr>
-          <w:p>
-            <w:pPr>
-              <w:spacing w:after="0" w:before="0" w:line="240"/>
-              <w:jc w:val="center"/>
-            </w:pPr>
-            <w:r>
-              <w:rPr>
-                <w:rFonts w:ascii="Calibri" w:cs="Calibri" w:eastAsia="Calibri" w:hAnsi="Calibri"/>
-                <w:sz w:val="17"/>
-                <w:szCs w:val="17"/>
-              </w:rPr>
-              <w:t xml:space="preserve">w przygotowaniu</w:t>
-            </w:r>
-          </w:p>
-        </w:tc>
-      </w:tr>
-      <w:tr>
-        <w:trPr>
-          <w:cantSplit/>
-        </w:trPr>
-        <w:tc>
-          <w:tcPr>
-            <w:tcW w:type="dxa" w:w="6038"/>
-            <w:tcBorders>
-              <w:top w:val="single" w:color="000000" w:sz="4"/>
-              <w:left w:val="single" w:color="000000" w:sz="4"/>
-              <w:bottom w:val="single" w:color="000000" w:sz="4"/>
-              <w:right w:val="single" w:color="000000" w:sz="4"/>
-            </w:tcBorders>
-            <w:tcMar>
-              <w:top w:type="dxa" w:w="40"/>
-              <w:left w:type="dxa" w:w="80"/>
-              <w:bottom w:type="dxa" w:w="40"/>
-              <w:right w:type="dxa" w:w="80"/>
-            </w:tcMar>
-            <w:vAlign w:val="center"/>
-          </w:tcPr>
-          <w:p>
-            <w:pPr>
-              <w:spacing w:after="0" w:before="0" w:line="240"/>
-              <w:jc w:val="left"/>
-            </w:pPr>
-            <w:r>
-              <w:rPr>
-                <w:rFonts w:ascii="Calibri" w:cs="Calibri" w:eastAsia="Calibri" w:hAnsi="Calibri"/>
-                <w:b/>
-                <w:bCs/>
-                <w:sz w:val="19"/>
-                <w:szCs w:val="19"/>
-              </w:rPr>
-              <w:t xml:space="preserve">Bibliografia</w:t>
-            </w:r>
-          </w:p>
-        </w:tc>
-        <w:tc>
-          <w:tcPr>
-            <w:tcW w:type="dxa" w:w="1100"/>
-            <w:tcBorders>
-              <w:top w:val="single" w:color="000000" w:sz="4"/>
-              <w:left w:val="single" w:color="000000" w:sz="4"/>
-              <w:bottom w:val="single" w:color="000000" w:sz="4"/>
-              <w:right w:val="single" w:color="000000" w:sz="4"/>
-            </w:tcBorders>
-            <w:tcMar>
-              <w:top w:type="dxa" w:w="40"/>
-              <w:left w:type="dxa" w:w="80"/>
-              <w:bottom w:type="dxa" w:w="40"/>
-              <w:right w:type="dxa" w:w="80"/>
-            </w:tcMar>
-            <w:vAlign w:val="center"/>
-          </w:tcPr>
-          <w:p>
-            <w:pPr>
-              <w:spacing w:after="0" w:before="0" w:line="240"/>
-              <w:jc w:val="center"/>
-            </w:pPr>
-            <w:r>
-              <w:rPr>
-                <w:rFonts w:ascii="Calibri" w:cs="Calibri" w:eastAsia="Calibri" w:hAnsi="Calibri"/>
-                <w:sz w:val="19"/>
-                <w:szCs w:val="19"/>
-              </w:rPr>
-              <w:t xml:space="preserve">9</w:t>
-            </w:r>
-          </w:p>
-        </w:tc>
-        <w:tc>
-          <w:tcPr>
-            <w:tcW w:type="dxa" w:w="1300"/>
-            <w:tcBorders>
-              <w:top w:val="single" w:color="000000" w:sz="4"/>
-              <w:left w:val="single" w:color="000000" w:sz="4"/>
-              <w:bottom w:val="single" w:color="000000" w:sz="4"/>
-              <w:right w:val="single" w:color="000000" w:sz="4"/>
-            </w:tcBorders>
-            <w:tcMar>
-              <w:top w:type="dxa" w:w="40"/>
-              <w:left w:type="dxa" w:w="80"/>
-              <w:bottom w:type="dxa" w:w="40"/>
-              <w:right w:type="dxa" w:w="80"/>
-            </w:tcMar>
-            <w:vAlign w:val="center"/>
-          </w:tcPr>
-          <w:p>
-            <w:pPr>
-              <w:spacing w:after="0" w:before="0" w:line="240"/>
-              <w:jc w:val="center"/>
-            </w:pPr>
-            <w:r>
-              <w:rPr>
-                <w:rFonts w:ascii="Calibri" w:cs="Calibri" w:eastAsia="Calibri" w:hAnsi="Calibri"/>
-                <w:b/>
-                <w:bCs/>
-                <w:sz w:val="19"/>
-                <w:szCs w:val="19"/>
-              </w:rPr>
-              <w:t xml:space="preserve">4%</w:t>
-            </w:r>
-          </w:p>
-        </w:tc>
-        <w:tc>
-          <w:tcPr>
-            <w:tcW w:type="dxa" w:w="1200"/>
-            <w:tcBorders>
-              <w:top w:val="single" w:color="000000" w:sz="4"/>
-              <w:left w:val="single" w:color="000000" w:sz="4"/>
-              <w:bottom w:val="single" w:color="000000" w:sz="4"/>
-              <w:right w:val="single" w:color="000000" w:sz="4"/>
-            </w:tcBorders>
-            <w:tcMar>
-              <w:top w:type="dxa" w:w="40"/>
-              <w:left w:type="dxa" w:w="80"/>
-              <w:bottom w:type="dxa" w:w="40"/>
-              <w:right w:type="dxa" w:w="80"/>
-            </w:tcMar>
-            <w:vAlign w:val="center"/>
-          </w:tcPr>
-          <w:p>
-            <w:pPr>
-              <w:spacing w:after="0" w:before="0" w:line="240"/>
-              <w:jc w:val="center"/>
-            </w:pPr>
-            <w:r>
-              <w:rPr>
-                <w:rFonts w:ascii="Calibri" w:cs="Calibri" w:eastAsia="Calibri" w:hAnsi="Calibri"/>
-                <w:sz w:val="17"/>
-                <w:szCs w:val="17"/>
-              </w:rPr>
-              <w:t xml:space="preserve">opracowany</w:t>
-            </w:r>
-          </w:p>
-        </w:tc>
-      </w:tr>
-      <w:tr>
-        <w:tc>
-          <w:tcPr>
-            <w:tcW w:type="dxa" w:w="6038"/>
-            <w:tcBorders>
-              <w:top w:val="single" w:color="000000" w:sz="4"/>
-              <w:left w:val="single" w:color="000000" w:sz="4"/>
-              <w:bottom w:val="single" w:color="000000" w:sz="4"/>
-              <w:right w:val="single" w:color="000000" w:sz="4"/>
-            </w:tcBorders>
-            <w:tcMar>
-              <w:top w:type="dxa" w:w="40"/>
-              <w:left w:type="dxa" w:w="80"/>
-              <w:bottom w:type="dxa" w:w="40"/>
-              <w:right w:type="dxa" w:w="80"/>
-            </w:tcMar>
-            <w:vAlign w:val="center"/>
-          </w:tcPr>
-          <w:p>
-            <w:pPr>
-              <w:spacing w:after="0" w:before="0" w:line="240"/>
-              <w:jc w:val="left"/>
-            </w:pPr>
-            <w:r>
-              <w:rPr>
-                <w:rFonts w:ascii="Calibri" w:cs="Calibri" w:eastAsia="Calibri" w:hAnsi="Calibri"/>
-                <w:b/>
-                <w:bCs/>
-                <w:sz w:val="19"/>
-                <w:szCs w:val="19"/>
-              </w:rPr>
-              <w:t xml:space="preserve">Razem</w:t>
-            </w:r>
-          </w:p>
-        </w:tc>
-        <w:tc>
-          <w:tcPr>
-            <w:tcW w:type="dxa" w:w="1100"/>
-            <w:tcBorders>
-              <w:top w:val="single" w:color="000000" w:sz="4"/>
-              <w:left w:val="single" w:color="000000" w:sz="4"/>
-              <w:bottom w:val="single" w:color="000000" w:sz="4"/>
-              <w:right w:val="single" w:color="000000" w:sz="4"/>
-            </w:tcBorders>
-            <w:tcMar>
-              <w:top w:type="dxa" w:w="40"/>
-              <w:left w:type="dxa" w:w="80"/>
-              <w:bottom w:type="dxa" w:w="40"/>
-              <w:right w:type="dxa" w:w="80"/>
-            </w:tcMar>
-            <w:vAlign w:val="center"/>
-          </w:tcPr>
-          <w:p>
-            <w:pPr>
-              <w:spacing w:after="0" w:before="0" w:line="240"/>
-              <w:jc w:val="left"/>
-            </w:pPr>
-          </w:p>
-        </w:tc>
-        <w:tc>
-          <w:tcPr>
-            <w:tcW w:type="dxa" w:w="1300"/>
-            <w:tcBorders>
-              <w:top w:val="single" w:color="000000" w:sz="4"/>
-              <w:left w:val="single" w:color="000000" w:sz="4"/>
-              <w:bottom w:val="single" w:color="000000" w:sz="4"/>
-              <w:right w:val="single" w:color="000000" w:sz="4"/>
-            </w:tcBorders>
-            <w:tcMar>
-              <w:top w:type="dxa" w:w="40"/>
-              <w:left w:type="dxa" w:w="80"/>
-              <w:bottom w:type="dxa" w:w="40"/>
-              <w:right w:type="dxa" w:w="80"/>
-            </w:tcMar>
-            <w:vAlign w:val="center"/>
-          </w:tcPr>
-          <w:p>
-            <w:pPr>
-              <w:spacing w:after="0" w:before="0" w:line="240"/>
-              <w:jc w:val="center"/>
-            </w:pPr>
-            <w:r>
-              <w:rPr>
-                <w:rFonts w:ascii="Calibri" w:cs="Calibri" w:eastAsia="Calibri" w:hAnsi="Calibri"/>
-                <w:b/>
-                <w:bCs/>
-                <w:sz w:val="19"/>
-                <w:szCs w:val="19"/>
-              </w:rPr>
-              <w:t xml:space="preserve">100%</w:t>
-            </w:r>
-          </w:p>
-        </w:tc>
-        <w:tc>
-          <w:tcPr>
-            <w:tcW w:type="dxa" w:w="1200"/>
-            <w:tcBorders>
-              <w:top w:val="single" w:color="000000" w:sz="4"/>
-              <w:left w:val="single" w:color="000000" w:sz="4"/>
-              <w:bottom w:val="single" w:color="000000" w:sz="4"/>
-              <w:right w:val="single" w:color="000000" w:sz="4"/>
-            </w:tcBorders>
-            <w:tcMar>
-              <w:top w:type="dxa" w:w="40"/>
-              <w:left w:type="dxa" w:w="80"/>
-              <w:bottom w:type="dxa" w:w="40"/>
-              <w:right w:type="dxa" w:w="80"/>
-            </w:tcMar>
-            <w:vAlign w:val="center"/>
-          </w:tcPr>
-          <w:p>
-            <w:pPr>
-              <w:spacing w:after="0" w:before="0" w:line="240"/>
-              <w:jc w:val="left"/>
-            </w:pPr>
-          </w:p>
-        </w:tc>
-      </w:tr>
-    </w:tbl>
-    <w:p>
-      <w:pPr>
-        <w:spacing w:after="120" w:before="160" w:line="276"/>
-        <w:jc w:val="both"/>
-      </w:pPr>
-      <w:r>
-        <w:rPr>
-          <w:rFonts w:ascii="Calibri" w:cs="Calibri" w:eastAsia="Calibri" w:hAnsi="Calibri"/>
-          <w:i/>
-          <w:iCs/>
-          <w:sz w:val="19"/>
-          <w:szCs w:val="19"/>
-        </w:rPr>
-        <w:t xml:space="preserve">Udział procentowy oszacowano na podstawie planowanej objętości poszczególnych części projektu. Największą część (ok. 50%) stanowi rozdział 6 – karta instrukcyjna operacji (16 arkuszy, 32 czynności z dokumentacją fotograficzną).</w:t>
+          <w:sz w:val="22"/>
+          <w:szCs w:val="22"/>
+        </w:rPr>
+        <w:t xml:space="preserve">Razem	100%</w:t>
       </w:r>
     </w:p>
     <w:p>

</xml_diff>

<commit_message>
Część 1: wstęp jako plan pracy, bibliografia tylko ze źródeł użytych w rozdz. 1–2.1 (przenumerowana)
Co-Authored-By: Claude Opus 5.5 <noreply@anthropic.com>
Claude-Session: https://claude.ai/code/session_01QehAftz7E7q6ro6WRzRWTg
</commit_message>
<xml_diff>
--- a/Czesc_1_Projekt_Toyota_Corolla_E12.docx
+++ b/Czesc_1_Projekt_Toyota_Corolla_E12.docx
@@ -922,7 +922,7 @@
           <w:sz w:val="22"/>
           <w:szCs w:val="22"/>
         </w:rPr>
-        <w:t xml:space="preserve">Hamulec tarczowy osi przedniej przenosi w samochodzie osobowym większą część sił hamowania, a jego elementy cierne zużywają się w sposób ciągły podczas eksploatacji. Klocki hamulcowe są więc częścią, której stan decyduje bezpośrednio o drodze hamowania i stabilności pojazdu. Ich wymiana jest zabiegiem krótkim, ale – jak wykazano w rozdziale 8 – podatnym na błędy wykonawcze, których skutki ujawniają się dopiero podczas jazdy.</w:t>
+        <w:t xml:space="preserve">Hamulec tarczowy osi przedniej przenosi w samochodzie osobowym większą część sił hamowania, a jego elementy cierne zużywają się w sposób ciągły podczas eksploatacji. Klocki hamulcowe są więc częścią, której stan decyduje bezpośrednio o drodze hamowania i stabilności pojazdu. Ich wymiana jest zabiegiem krótkim, ale wymagającym zachowania wymiarów granicznych i momentów dokręcania określonych przez producenta – błędy popełnione podczas montażu ujawniają się często dopiero w czasie jazdy.</w:t>
       </w:r>
     </w:p>
     <w:p>
@@ -946,7 +946,7 @@
           <w:sz w:val="22"/>
           <w:szCs w:val="22"/>
         </w:rPr>
-        <w:t xml:space="preserve"> jest opracowanie kompletnego procesu technologicznego weryfikacji i wymiany przednich klocków hamulcowych dla konkretnego pojazdu – Toyoty Corolli IX (E12) hatchback 1.6 VVT-i (silnik 3ZZ-FE, 81 kW, kod typu ZZE121) – zakończonego mierzalną kontrolą jakości naprawy.</w:t>
+        <w:t xml:space="preserve"> jest opracowanie procesu technologicznego weryfikacji i wymiany przednich klocków hamulcowych dla konkretnego pojazdu – Toyoty Corolli IX (E12) hatchback 1.6 VVT-i (silnik 3ZZ-FE, 81 kW, kod typu ZZE121) – zakończonego kontrolą jakości wykonanej naprawy.</w:t>
       </w:r>
     </w:p>
     <w:p>
@@ -961,7 +961,7 @@
           <w:sz w:val="22"/>
           <w:szCs w:val="22"/>
         </w:rPr>
-        <w:t xml:space="preserve">Zakres opracowania obejmuje:</w:t>
+        <w:t xml:space="preserve">Planowany zakres opracowania obejmuje:</w:t>
       </w:r>
     </w:p>
     <w:p>
@@ -980,7 +980,7 @@
           <w:sz w:val="22"/>
           <w:szCs w:val="22"/>
         </w:rPr>
-        <w:t xml:space="preserve">charakterystykę obiektu naprawy i wykaz elementów zespołu wraz ze sposobem postępowania z każdym z nich,</w:t>
+        <w:t xml:space="preserve">charakterystykę obiektu naprawy – danych technicznych pojazdu oraz budowy hamulca osi przedniej,</w:t>
       </w:r>
     </w:p>
     <w:p>
@@ -1018,7 +1018,7 @@
           <w:sz w:val="22"/>
           <w:szCs w:val="22"/>
         </w:rPr>
-        <w:t xml:space="preserve">macierz diagnostyczną objawów i kartę weryfikacji części, na podstawie których pojazd kwalifikowany jest do naprawy,</w:t>
+        <w:t xml:space="preserve">diagnostykę i kwalifikację pojazdu do naprawy na podstawie objawów i pomiarów części,</w:t>
       </w:r>
     </w:p>
     <w:p>
@@ -1037,7 +1037,7 @@
           <w:sz w:val="22"/>
           <w:szCs w:val="22"/>
         </w:rPr>
-        <w:t xml:space="preserve">wyposażenie stanowiska pracy z przypisaniem narzędzi do numerów czynności,</w:t>
+        <w:t xml:space="preserve">wyposażenie stanowiska pracy,</w:t>
       </w:r>
     </w:p>
     <w:p>
@@ -1075,7 +1075,7 @@
           <w:sz w:val="22"/>
           <w:szCs w:val="22"/>
         </w:rPr>
-        <w:t xml:space="preserve">kontrolę jakości po naprawie, w tym badanie na stanowisku rolkowym i protokół odbioru,</w:t>
+        <w:t xml:space="preserve">kontrolę jakości po naprawie, w tym badanie skuteczności hamowania na stanowisku rolkowym,</w:t>
       </w:r>
     </w:p>
     <w:p>
@@ -1094,7 +1094,7 @@
           <w:sz w:val="22"/>
           <w:szCs w:val="22"/>
         </w:rPr>
-        <w:t xml:space="preserve">analizę typowych błędów wykonawczych oraz porównanie kosztów trzech wariantów doboru części.</w:t>
+        <w:t xml:space="preserve">analizę typowych błędów wykonawczych oraz kalkulację kosztów usługi.</w:t>
       </w:r>
     </w:p>
     <w:p>
@@ -1118,7 +1118,7 @@
           <w:sz w:val="22"/>
           <w:szCs w:val="22"/>
         </w:rPr>
-        <w:t xml:space="preserve"> Wszystkie wymiary, luzy, bicia i momenty dokręcania przyjęto z instrukcji naprawy producenta Toyota Corolla (E120) Repair Manual [1], [4]–[6]. Producent nie podaje w niej rozmiarów kluczy ani dokumentacji fotograficznej, dlatego te informacje uzupełniono instrukcją wymiany krok po kroku przygotowaną dla tego modelu [2], [3]. W przypadku rozbieżności (np. moment śrub zacisku 34,3 N·m wg [1] i 35 N·m wg [2]) przyjmowano wartość producenta. Wymagania kontroli na stanowisku rolkowym oparto na kryteriach stosowanych w badaniach technicznych pojazdów [15]–[17], a dane katalogowe części i ceny – na katalogach i ofertach handlowych [11]–[14], [18], [19], [24], [25].</w:t>
+        <w:t xml:space="preserve"> Podstawowym źródłem danych technicznych jest instrukcja naprawy producenta Toyota Corolla (E120) Repair Manual [1], z której przyjmowane będą wymiary nominalne i dopuszczalne, luzy oraz momenty dokręcania. Producent nie podaje w niej rozmiarów kluczy ani dokumentacji fotograficznej poszczególnych czynności, dlatego informacje te zostaną uzupełnione na podstawie instrukcji wymiany krok po kroku przygotowanej dla tego modelu [2]. W przypadku rozbieżności między źródłami przyjmowana będzie wartość podana przez producenta. Dane techniczne pojazdu zestawione w rozdziale 2 zaczerpnięto z katalogów i serwisów motoryzacyjnych [3]–[6].</w:t>
       </w:r>
     </w:p>
     <w:p>
@@ -1168,7 +1168,7 @@
           <w:sz w:val="22"/>
           <w:szCs w:val="22"/>
         </w:rPr>
-        <w:t xml:space="preserve">Obiektem naprawy jest samochód osobowy Toyota Corolla IX generacji (oznaczenie fabryczne E12/E120), produkowany w latach 2001–2007. Analizowany egzemplarz to 5-drzwiowy hatchback z benzynowym silnikiem 1.6 VVT-i o kodzie 3ZZ-FE i oznaczeniu typu ZZE121 [10]. Z punktu widzenia procesu najważniejsze są: dopuszczalna masa całkowita (wykorzystana w rozdziale 7 do obliczenia wymaganej siły hamowania), rodzaj hamulców osi przedniej oraz typ hamulca postojowego (decydujący o braku potrzeby użycia testera diagnostycznego).</w:t>
+        <w:t xml:space="preserve">Obiektem naprawy jest samochód osobowy Toyota Corolla IX generacji (oznaczenie fabryczne E12/E120), produkowany w latach 2001–2007. Analizowany egzemplarz to 5-drzwiowy hatchback z benzynowym silnikiem 1.6 VVT-i o kodzie 3ZZ-FE i oznaczeniu typu ZZE121 [6]. Z punktu widzenia procesu najważniejsze są: dopuszczalna masa całkowita (potrzebna do wyznaczenia wymaganej siły hamowania w kontroli jakości po naprawie), rodzaj hamulców osi przedniej oraz typ hamulca postojowego (decydujący o braku potrzeby użycia testera diagnostycznego).</w:t>
       </w:r>
     </w:p>
     <w:p>
@@ -1249,7 +1249,7 @@
                 <w:sz w:val="16"/>
                 <w:szCs w:val="16"/>
               </w:rPr>
-              <w:t xml:space="preserve">Toyota Corolla E12 hatchback – zdjęcie ogólne pojazdu (np. Wikimedia Commons, z podaniem źródła)</w:t>
+              <w:t xml:space="preserve">Toyota Corolla E12 hatchback – zdjęcie ogólne pojazdu (AutoCentrum [3])</w:t>
             </w:r>
           </w:p>
         </w:tc>
@@ -1268,7 +1268,7 @@
           <w:sz w:val="18"/>
           <w:szCs w:val="18"/>
         </w:rPr>
-        <w:t xml:space="preserve">Rysunek 1. Toyota Corolla IX (E12) hatchback, [źródło zdjęcia]</w:t>
+        <w:t xml:space="preserve">Rysunek 1. Toyota Corolla IX (E12) hatchback, [3]</w:t>
       </w:r>
     </w:p>
     <w:p>
@@ -1285,7 +1285,7 @@
           <w:sz w:val="18"/>
           <w:szCs w:val="18"/>
         </w:rPr>
-        <w:t xml:space="preserve">Tabela 1. Dane techniczne pojazdu Toyota Corolla IX (E12) 1.6 VVT-i, [7]–[10]</w:t>
+        <w:t xml:space="preserve">Tabela 1. Dane techniczne pojazdu Toyota Corolla IX (E12) 1.6 VVT-i, [3]–[6]</w:t>
       </w:r>
     </w:p>
     <w:tbl>
@@ -1554,7 +1554,7 @@
                 <w:sz w:val="19"/>
                 <w:szCs w:val="19"/>
               </w:rPr>
-              <w:t xml:space="preserve">ZZE121; 2001–2007 [10]</w:t>
+              <w:t xml:space="preserve">ZZE121; 2001–2007 [6]</w:t>
             </w:r>
           </w:p>
         </w:tc>
@@ -2367,7 +2367,7 @@
                 <w:sz w:val="19"/>
                 <w:szCs w:val="19"/>
               </w:rPr>
-              <w:t xml:space="preserve">tarczowe wentylowane Ø 255 mm, zacisk pływający jednotłoczkowy [1], [13]</w:t>
+              <w:t xml:space="preserve">tarczowe wentylowane Ø 255 mm, zacisk pływający jednotłoczkowy [1], [7]</w:t>
             </w:r>
           </w:p>
         </w:tc>
@@ -2436,7 +2436,7 @@
                 <w:sz w:val="19"/>
                 <w:szCs w:val="19"/>
               </w:rPr>
-              <w:t xml:space="preserve">bębnowe lub tarczowe pełne Ø 258 mm – zależnie od wersji [14]</w:t>
+              <w:t xml:space="preserve">bębnowe lub tarczowe pełne Ø 258 mm – zależnie od wersji [8]</w:t>
             </w:r>
           </w:p>
         </w:tc>
@@ -2643,7 +2643,7 @@
                 <w:sz w:val="19"/>
                 <w:szCs w:val="19"/>
               </w:rPr>
-              <w:t xml:space="preserve">SAE J1703 / FMVSS No. 116 DOT 3 [5]</w:t>
+              <w:t xml:space="preserve">SAE J1703 / FMVSS No. 116 DOT 3 [9]</w:t>
             </w:r>
           </w:p>
         </w:tc>
@@ -2763,7 +2763,7 @@
           <w:sz w:val="20"/>
           <w:szCs w:val="20"/>
         </w:rPr>
-        <w:t xml:space="preserve">AUTODOC CLUB: Toyota Corolla E12 – instrukcje naprawy krok po kroku i filmiki instruktażowe (film: How to change front brake discs and front brake pads on TOYOTA COROLLA E120 | AUTODOC), https://club.autodoc.pl/manuals/toyota/corolla/corolla-zze12-nde12-zde12 (dostęp: 09.10.2026).</w:t>
+        <w:t xml:space="preserve">AutoCentrum: Toyota Corolla IX (E12) 1.6 i 16V 110 KM 2001–2007 – dane techniczne, https://www.autocentrum.pl/dane-techniczne/toyota/corolla/ix-e12/sedan/silnik-benzynowy-1.6-i-16v-110km-2001-2007/ (dostęp: 09.10.2026).</w:t>
       </w:r>
     </w:p>
     <w:p>
@@ -2788,7 +2788,7 @@
           <w:sz w:val="20"/>
           <w:szCs w:val="20"/>
         </w:rPr>
-        <w:t xml:space="preserve">Toyota Motor Corporation: Toyota Corolla (E120) Repair Manual – Brake – Adjustment (brake pedal), https://www.tcorolla.net/adjustment-1133.html (dostęp: 09.10.2026).</w:t>
+        <w:t xml:space="preserve">Autokatalog: Toyota Corolla IX (E120/E130) – dane techniczne, https://autokatalog.pl/toyota/corolla/ix-e120-e130/dane-techniczne (dostęp: 09.10.2026).</w:t>
       </w:r>
     </w:p>
     <w:p>
@@ -2813,7 +2813,7 @@
           <w:sz w:val="20"/>
           <w:szCs w:val="20"/>
         </w:rPr>
-        <w:t xml:space="preserve">Toyota Motor Corporation: Toyota Corolla (E120) Repair Manual – Brake fluid, https://www.tcorolla.net/brake_fluid-1131.html (dostęp: 09.10.2026).</w:t>
+        <w:t xml:space="preserve">Cars-data: Toyota Corolla Hatchback 1.6 16V VVT-i (2002) – specifications, https://cars-data.com/en/toyota/corolla/2002-hatchback-7726/1-6-16v-vvt-i-executive-28121--28121/specs (dostęp: 09.10.2026).</w:t>
       </w:r>
     </w:p>
     <w:p>
@@ -2838,7 +2838,7 @@
           <w:sz w:val="20"/>
           <w:szCs w:val="20"/>
         </w:rPr>
-        <w:t xml:space="preserve">Toyota Motor Corporation: Toyota Corolla (E120) Repair Manual – Front axle hub – Replacement (disc runout), https://www.tcorolla.net/replacement-1121.html (dostęp: 09.10.2026).</w:t>
+        <w:t xml:space="preserve">Schaeffler – katalog zastosowań: TOYOTA COROLLA (_E12_) 1.6 VVT-i (ZZE121_), https://shop.rolling.hu/catalog/SCHAEFFLER/toyota-corolla-saloon-e12-16-vvt-i-zze121 (dostęp: 09.10.2026).</w:t>
       </w:r>
     </w:p>
     <w:p>
@@ -2863,7 +2863,7 @@
           <w:sz w:val="20"/>
           <w:szCs w:val="20"/>
         </w:rPr>
-        <w:t xml:space="preserve">AutoCentrum: Toyota Corolla IX (E12) 1.6 i 16V 110 KM 2001–2007 – dane techniczne, https://www.autocentrum.pl/dane-techniczne/toyota/corolla/ix-e12/sedan/silnik-benzynowy-1.6-i-16v-110km-2001-2007/ (dostęp: 09.10.2026).</w:t>
+        <w:t xml:space="preserve">AUTODOC: Tarcza hamulcowa AP 24941 (Ø 255 mm, grubość 25 mm, min. 23 mm), https://www.autodoc.pl/ap/9367120 (dostęp: 09.10.2026).</w:t>
       </w:r>
     </w:p>
     <w:p>
@@ -2888,7 +2888,7 @@
           <w:sz w:val="20"/>
           <w:szCs w:val="20"/>
         </w:rPr>
-        <w:t xml:space="preserve">Autokatalog: Toyota Corolla IX (E120/E130) – dane techniczne, https://autokatalog.pl/toyota/corolla/ix-e120-e130/dane-techniczne (dostęp: 09.10.2026).</w:t>
+        <w:t xml:space="preserve">Motostacja: TRW tarcze + klocki tył Toyota Corolla E12 (DF4379, GDB3289), https://motostacja.com/p/TRW-2--DF4379-GDB3289 (dostęp: 09.10.2026).</w:t>
       </w:r>
     </w:p>
     <w:p>
@@ -2913,407 +2913,7 @@
           <w:sz w:val="20"/>
           <w:szCs w:val="20"/>
         </w:rPr>
-        <w:t xml:space="preserve">Cars-data: Toyota Corolla Hatchback 1.6 16V VVT-i (2002) – specifications, https://cars-data.com/en/toyota/corolla/2002-hatchback-7726/1-6-16v-vvt-i-executive-28121--28121/specs (dostęp: 09.10.2026).</w:t>
-      </w:r>
-    </w:p>
-    <w:p>
-      <w:pPr>
-        <w:tabs>
-          <w:tab w:val="left" w:pos="560"/>
-        </w:tabs>
-        <w:spacing w:after="100"/>
-        <w:ind w:left="560" w:hanging="560"/>
-      </w:pPr>
-      <w:r>
-        <w:rPr>
-          <w:rFonts w:ascii="Calibri" w:cs="Calibri" w:eastAsia="Calibri" w:hAnsi="Calibri"/>
-          <w:sz w:val="20"/>
-          <w:szCs w:val="20"/>
-        </w:rPr>
-        <w:t xml:space="preserve">[10]	</w:t>
-      </w:r>
-      <w:r>
-        <w:rPr>
-          <w:rFonts w:ascii="Calibri" w:cs="Calibri" w:eastAsia="Calibri" w:hAnsi="Calibri"/>
-          <w:sz w:val="20"/>
-          <w:szCs w:val="20"/>
-        </w:rPr>
-        <w:t xml:space="preserve">Schaeffler – katalog zastosowań: TOYOTA COROLLA (_E12_) 1.6 VVT-i (ZZE121_), https://shop.rolling.hu/catalog/SCHAEFFLER/toyota-corolla-saloon-e12-16-vvt-i-zze121 (dostęp: 09.10.2026).</w:t>
-      </w:r>
-    </w:p>
-    <w:p>
-      <w:pPr>
-        <w:tabs>
-          <w:tab w:val="left" w:pos="560"/>
-        </w:tabs>
-        <w:spacing w:after="100"/>
-        <w:ind w:left="560" w:hanging="560"/>
-      </w:pPr>
-      <w:r>
-        <w:rPr>
-          <w:rFonts w:ascii="Calibri" w:cs="Calibri" w:eastAsia="Calibri" w:hAnsi="Calibri"/>
-          <w:sz w:val="20"/>
-          <w:szCs w:val="20"/>
-        </w:rPr>
-        <w:t xml:space="preserve">[11]	</w:t>
-      </w:r>
-      <w:r>
-        <w:rPr>
-          <w:rFonts w:ascii="Calibri" w:cs="Calibri" w:eastAsia="Calibri" w:hAnsi="Calibri"/>
-          <w:sz w:val="20"/>
-          <w:szCs w:val="20"/>
-        </w:rPr>
-        <w:t xml:space="preserve">Inter Cars: Klocki hamulcowe TRW Automotive GDB3288 – dane techniczne, https://intercars.pl/produkty/321869-klocki-hamulcowe-trw-automotive-gdb3288 (dostęp: 09.10.2026).</w:t>
-      </w:r>
-    </w:p>
-    <w:p>
-      <w:pPr>
-        <w:tabs>
-          <w:tab w:val="left" w:pos="560"/>
-        </w:tabs>
-        <w:spacing w:after="100"/>
-        <w:ind w:left="560" w:hanging="560"/>
-      </w:pPr>
-      <w:r>
-        <w:rPr>
-          <w:rFonts w:ascii="Calibri" w:cs="Calibri" w:eastAsia="Calibri" w:hAnsi="Calibri"/>
-          <w:sz w:val="20"/>
-          <w:szCs w:val="20"/>
-        </w:rPr>
-        <w:t xml:space="preserve">[12]	</w:t>
-      </w:r>
-      <w:r>
-        <w:rPr>
-          <w:rFonts w:ascii="Calibri" w:cs="Calibri" w:eastAsia="Calibri" w:hAnsi="Calibri"/>
-          <w:sz w:val="20"/>
-          <w:szCs w:val="20"/>
-        </w:rPr>
-        <w:t xml:space="preserve">AUTODOC: TRW GDB3288 Klocki hamulcowe z akustycznym czujnikiem zużycia do TOYOTA COROLLA, https://www.autodoc.pl/trw/2192809 (dostęp: 09.10.2026).</w:t>
-      </w:r>
-    </w:p>
-    <w:p>
-      <w:pPr>
-        <w:tabs>
-          <w:tab w:val="left" w:pos="560"/>
-        </w:tabs>
-        <w:spacing w:after="100"/>
-        <w:ind w:left="560" w:hanging="560"/>
-      </w:pPr>
-      <w:r>
-        <w:rPr>
-          <w:rFonts w:ascii="Calibri" w:cs="Calibri" w:eastAsia="Calibri" w:hAnsi="Calibri"/>
-          <w:sz w:val="20"/>
-          <w:szCs w:val="20"/>
-        </w:rPr>
-        <w:t xml:space="preserve">[13]	</w:t>
-      </w:r>
-      <w:r>
-        <w:rPr>
-          <w:rFonts w:ascii="Calibri" w:cs="Calibri" w:eastAsia="Calibri" w:hAnsi="Calibri"/>
-          <w:sz w:val="20"/>
-          <w:szCs w:val="20"/>
-        </w:rPr>
-        <w:t xml:space="preserve">AUTODOC: Tarcza hamulcowa AP 24941 (Ø 255 mm, grubość 25 mm, min. 23 mm), https://www.autodoc.pl/ap/9367120 (dostęp: 09.10.2026).</w:t>
-      </w:r>
-    </w:p>
-    <w:p>
-      <w:pPr>
-        <w:tabs>
-          <w:tab w:val="left" w:pos="560"/>
-        </w:tabs>
-        <w:spacing w:after="100"/>
-        <w:ind w:left="560" w:hanging="560"/>
-      </w:pPr>
-      <w:r>
-        <w:rPr>
-          <w:rFonts w:ascii="Calibri" w:cs="Calibri" w:eastAsia="Calibri" w:hAnsi="Calibri"/>
-          <w:sz w:val="20"/>
-          <w:szCs w:val="20"/>
-        </w:rPr>
-        <w:t xml:space="preserve">[14]	</w:t>
-      </w:r>
-      <w:r>
-        <w:rPr>
-          <w:rFonts w:ascii="Calibri" w:cs="Calibri" w:eastAsia="Calibri" w:hAnsi="Calibri"/>
-          <w:sz w:val="20"/>
-          <w:szCs w:val="20"/>
-        </w:rPr>
-        <w:t xml:space="preserve">Motostacja: TRW tarcze + klocki tył Toyota Corolla E12 (DF4379, GDB3289), https://motostacja.com/p/TRW-2--DF4379-GDB3289 (dostęp: 09.10.2026).</w:t>
-      </w:r>
-    </w:p>
-    <w:p>
-      <w:pPr>
-        <w:tabs>
-          <w:tab w:val="left" w:pos="560"/>
-        </w:tabs>
-        <w:spacing w:after="100"/>
-        <w:ind w:left="560" w:hanging="560"/>
-      </w:pPr>
-      <w:r>
-        <w:rPr>
-          <w:rFonts w:ascii="Calibri" w:cs="Calibri" w:eastAsia="Calibri" w:hAnsi="Calibri"/>
-          <w:sz w:val="20"/>
-          <w:szCs w:val="20"/>
-        </w:rPr>
-        <w:t xml:space="preserve">[15]	</w:t>
-      </w:r>
-      <w:r>
-        <w:rPr>
-          <w:rFonts w:ascii="Calibri" w:cs="Calibri" w:eastAsia="Calibri" w:hAnsi="Calibri"/>
-          <w:sz w:val="20"/>
-          <w:szCs w:val="20"/>
-        </w:rPr>
-        <w:t xml:space="preserve">Warsztat.pl: Diagnozowanie układu hamulcowego pojazdu samochodowego (cz. 3), https://warsztat.pl/artykuly/diagnozowanie-ukladu-hamulcowego-pojazdu-samochodowego-cz-3,57838,bm9uZSE1NzgzOCEhbm93b2N6ZXNueXdhcnN6dGF0LnBsL2FydHlrdWx5LzA0LTIwMTIvb2xlamUvMg (dostęp: 09.10.2026).</w:t>
-      </w:r>
-    </w:p>
-    <w:p>
-      <w:pPr>
-        <w:tabs>
-          <w:tab w:val="left" w:pos="560"/>
-        </w:tabs>
-        <w:spacing w:after="100"/>
-        <w:ind w:left="560" w:hanging="560"/>
-      </w:pPr>
-      <w:r>
-        <w:rPr>
-          <w:rFonts w:ascii="Calibri" w:cs="Calibri" w:eastAsia="Calibri" w:hAnsi="Calibri"/>
-          <w:sz w:val="20"/>
-          <w:szCs w:val="20"/>
-        </w:rPr>
-        <w:t xml:space="preserve">[16]	</w:t>
-      </w:r>
-      <w:r>
-        <w:rPr>
-          <w:rFonts w:ascii="Calibri" w:cs="Calibri" w:eastAsia="Calibri" w:hAnsi="Calibri"/>
-          <w:sz w:val="20"/>
-          <w:szCs w:val="20"/>
-        </w:rPr>
-        <w:t xml:space="preserve">Gajek A.: Archiwum Motoryzacji – artykuł dotyczący oceny skuteczności hamowania w stacjach kontroli pojazdów, https://yadda.icm.edu.pl/baztech/element/bwmeta1.element.baztech-1930bdd7-1355-423d-93b0-ddc9a790e278/c/AM73_Andrzej_Gajek_PL.pdf (dostęp: 09.10.2026).</w:t>
-      </w:r>
-    </w:p>
-    <w:p>
-      <w:pPr>
-        <w:tabs>
-          <w:tab w:val="left" w:pos="560"/>
-        </w:tabs>
-        <w:spacing w:after="100"/>
-        <w:ind w:left="560" w:hanging="560"/>
-      </w:pPr>
-      <w:r>
-        <w:rPr>
-          <w:rFonts w:ascii="Calibri" w:cs="Calibri" w:eastAsia="Calibri" w:hAnsi="Calibri"/>
-          <w:sz w:val="20"/>
-          <w:szCs w:val="20"/>
-        </w:rPr>
-        <w:t xml:space="preserve">[17]	</w:t>
-      </w:r>
-      <w:r>
-        <w:rPr>
-          <w:rFonts w:ascii="Calibri" w:cs="Calibri" w:eastAsia="Calibri" w:hAnsi="Calibri"/>
-          <w:sz w:val="20"/>
-          <w:szCs w:val="20"/>
-        </w:rPr>
-        <w:t xml:space="preserve">Rozporządzenie Ministra Infrastruktury w sprawie zakresu i sposobu przeprowadzania badań technicznych pojazdów oraz wzorów dokumentów stosowanych przy tych badaniach (tekst ujednolicony), https://www.piskp.pl/images/stories/Procedura_badan_tekst_ujednolicony_08_2015.pdf (dostęp: 09.10.2026).</w:t>
-      </w:r>
-    </w:p>
-    <w:p>
-      <w:pPr>
-        <w:tabs>
-          <w:tab w:val="left" w:pos="560"/>
-        </w:tabs>
-        <w:spacing w:after="100"/>
-        <w:ind w:left="560" w:hanging="560"/>
-      </w:pPr>
-      <w:r>
-        <w:rPr>
-          <w:rFonts w:ascii="Calibri" w:cs="Calibri" w:eastAsia="Calibri" w:hAnsi="Calibri"/>
-          <w:sz w:val="20"/>
-          <w:szCs w:val="20"/>
-        </w:rPr>
-        <w:t xml:space="preserve">[18]	</w:t>
-      </w:r>
-      <w:r>
-        <w:rPr>
-          <w:rFonts w:ascii="Calibri" w:cs="Calibri" w:eastAsia="Calibri" w:hAnsi="Calibri"/>
-          <w:sz w:val="20"/>
-          <w:szCs w:val="20"/>
-        </w:rPr>
-        <w:t xml:space="preserve">Henkiel: Klocki hamulcowe TRW GDB3288 – Toyota Corolla (E12), oś przednia, https://www.henkiel.com.pl/65070-klocki-hamulcowe-trw-gdb3288-toyota-corolla-e12-corolla-e11-os-przednia (dostęp: 09.10.2026).</w:t>
-      </w:r>
-    </w:p>
-    <w:p>
-      <w:pPr>
-        <w:tabs>
-          <w:tab w:val="left" w:pos="560"/>
-        </w:tabs>
-        <w:spacing w:after="100"/>
-        <w:ind w:left="560" w:hanging="560"/>
-      </w:pPr>
-      <w:r>
-        <w:rPr>
-          <w:rFonts w:ascii="Calibri" w:cs="Calibri" w:eastAsia="Calibri" w:hAnsi="Calibri"/>
-          <w:sz w:val="20"/>
-          <w:szCs w:val="20"/>
-        </w:rPr>
-        <w:t xml:space="preserve">[19]	</w:t>
-      </w:r>
-      <w:r>
-        <w:rPr>
-          <w:rFonts w:ascii="Calibri" w:cs="Calibri" w:eastAsia="Calibri" w:hAnsi="Calibri"/>
-          <w:sz w:val="20"/>
-          <w:szCs w:val="20"/>
-        </w:rPr>
-        <w:t xml:space="preserve">Magmoto: TRW GDB3288 Zestaw klocków hamulcowych, https://magmoto.pl/trw-gdb3288-zestaw-klockow-hamulcowych-hamulce-tarczowe-p-140773.html (dostęp: 09.10.2026).</w:t>
-      </w:r>
-    </w:p>
-    <w:p>
-      <w:pPr>
-        <w:tabs>
-          <w:tab w:val="left" w:pos="560"/>
-        </w:tabs>
-        <w:spacing w:after="100"/>
-        <w:ind w:left="560" w:hanging="560"/>
-      </w:pPr>
-      <w:r>
-        <w:rPr>
-          <w:rFonts w:ascii="Calibri" w:cs="Calibri" w:eastAsia="Calibri" w:hAnsi="Calibri"/>
-          <w:sz w:val="20"/>
-          <w:szCs w:val="20"/>
-        </w:rPr>
-        <w:t xml:space="preserve">[20]	</w:t>
-      </w:r>
-      <w:r>
-        <w:rPr>
-          <w:rFonts w:ascii="Calibri" w:cs="Calibri" w:eastAsia="Calibri" w:hAnsi="Calibri"/>
-          <w:sz w:val="20"/>
-          <w:szCs w:val="20"/>
-        </w:rPr>
-        <w:t xml:space="preserve">Freenance: Zarobki mechanika samochodowego 2026 – stawki roboczogodziny, https://freenance.io/zarobki/zarobki-mechanika-samochodowego-2026/ (dostęp: 09.10.2026).</w:t>
-      </w:r>
-    </w:p>
-    <w:p>
-      <w:pPr>
-        <w:tabs>
-          <w:tab w:val="left" w:pos="560"/>
-        </w:tabs>
-        <w:spacing w:after="100"/>
-        <w:ind w:left="560" w:hanging="560"/>
-      </w:pPr>
-      <w:r>
-        <w:rPr>
-          <w:rFonts w:ascii="Calibri" w:cs="Calibri" w:eastAsia="Calibri" w:hAnsi="Calibri"/>
-          <w:sz w:val="20"/>
-          <w:szCs w:val="20"/>
-        </w:rPr>
-        <w:t xml:space="preserve">[21]	</w:t>
-      </w:r>
-      <w:r>
-        <w:rPr>
-          <w:rFonts w:ascii="Calibri" w:cs="Calibri" w:eastAsia="Calibri" w:hAnsi="Calibri"/>
-          <w:sz w:val="20"/>
-          <w:szCs w:val="20"/>
-        </w:rPr>
-        <w:t xml:space="preserve">Otomoto: Ile kosztuje wymiana klocków hamulcowych?, https://www.otomoto.pl/news/ile-kosztuje-wymiana-klockow-hamulcowych (dostęp: 09.10.2026).</w:t>
-      </w:r>
-    </w:p>
-    <w:p>
-      <w:pPr>
-        <w:tabs>
-          <w:tab w:val="left" w:pos="560"/>
-        </w:tabs>
-        <w:spacing w:after="100"/>
-        <w:ind w:left="560" w:hanging="560"/>
-      </w:pPr>
-      <w:r>
-        <w:rPr>
-          <w:rFonts w:ascii="Calibri" w:cs="Calibri" w:eastAsia="Calibri" w:hAnsi="Calibri"/>
-          <w:sz w:val="20"/>
-          <w:szCs w:val="20"/>
-        </w:rPr>
-        <w:t xml:space="preserve">[22]	</w:t>
-      </w:r>
-      <w:r>
-        <w:rPr>
-          <w:rFonts w:ascii="Calibri" w:cs="Calibri" w:eastAsia="Calibri" w:hAnsi="Calibri"/>
-          <w:sz w:val="20"/>
-          <w:szCs w:val="20"/>
-        </w:rPr>
-        <w:t xml:space="preserve">Arkusz egzaminacyjny MOT.06 – styczeń 2022, część praktyczna, https://zawodowe.edu.pl/arkusz-praktyczny/mot06-2022-styczen-01/arkusz.pdf (dostęp: 09.10.2026).</w:t>
-      </w:r>
-    </w:p>
-    <w:p>
-      <w:pPr>
-        <w:tabs>
-          <w:tab w:val="left" w:pos="560"/>
-        </w:tabs>
-        <w:spacing w:after="100"/>
-        <w:ind w:left="560" w:hanging="560"/>
-      </w:pPr>
-      <w:r>
-        <w:rPr>
-          <w:rFonts w:ascii="Calibri" w:cs="Calibri" w:eastAsia="Calibri" w:hAnsi="Calibri"/>
-          <w:sz w:val="20"/>
-          <w:szCs w:val="20"/>
-        </w:rPr>
-        <w:t xml:space="preserve">[23]	</w:t>
-      </w:r>
-      <w:r>
-        <w:rPr>
-          <w:rFonts w:ascii="Calibri" w:cs="Calibri" w:eastAsia="Calibri" w:hAnsi="Calibri"/>
-          <w:sz w:val="20"/>
-          <w:szCs w:val="20"/>
-        </w:rPr>
-        <w:t xml:space="preserve">Toyota Motor Europe: portal informacji technicznej dla niezależnych operatorów, https://www.toyota-tech.eu (dostęp: 09.10.2026).</w:t>
-      </w:r>
-    </w:p>
-    <w:p>
-      <w:pPr>
-        <w:tabs>
-          <w:tab w:val="left" w:pos="560"/>
-        </w:tabs>
-        <w:spacing w:after="100"/>
-        <w:ind w:left="560" w:hanging="560"/>
-      </w:pPr>
-      <w:r>
-        <w:rPr>
-          <w:rFonts w:ascii="Calibri" w:cs="Calibri" w:eastAsia="Calibri" w:hAnsi="Calibri"/>
-          <w:sz w:val="20"/>
-          <w:szCs w:val="20"/>
-        </w:rPr>
-        <w:t xml:space="preserve">[24]	</w:t>
-      </w:r>
-      <w:r>
-        <w:rPr>
-          <w:rFonts w:ascii="Calibri" w:cs="Calibri" w:eastAsia="Calibri" w:hAnsi="Calibri"/>
-          <w:sz w:val="20"/>
-          <w:szCs w:val="20"/>
-        </w:rPr>
-        <w:t xml:space="preserve">AUTODOC: Ridex 402B0107 Klocki hamulcowe (WVA 23766), https://www.autodoc.pl/ridex/12754705 (dostęp: 09.10.2026).</w:t>
-      </w:r>
-    </w:p>
-    <w:p>
-      <w:pPr>
-        <w:tabs>
-          <w:tab w:val="left" w:pos="560"/>
-        </w:tabs>
-        <w:spacing w:after="100"/>
-        <w:ind w:left="560" w:hanging="560"/>
-      </w:pPr>
-      <w:r>
-        <w:rPr>
-          <w:rFonts w:ascii="Calibri" w:cs="Calibri" w:eastAsia="Calibri" w:hAnsi="Calibri"/>
-          <w:sz w:val="20"/>
-          <w:szCs w:val="20"/>
-        </w:rPr>
-        <w:t xml:space="preserve">[25]	</w:t>
-      </w:r>
-      <w:r>
-        <w:rPr>
-          <w:rFonts w:ascii="Calibri" w:cs="Calibri" w:eastAsia="Calibri" w:hAnsi="Calibri"/>
-          <w:sz w:val="20"/>
-          <w:szCs w:val="20"/>
-        </w:rPr>
-        <w:t xml:space="preserve">AUTODOC: ATE 13.0460-5815.2 Klocki hamulcowe, https://www.autodoc.pl/ate/955966 (dostęp: 09.10.2026).</w:t>
+        <w:t xml:space="preserve">Toyota Motor Corporation: Toyota Corolla (E120) Repair Manual – Brake fluid, https://www.tcorolla.net/brake_fluid-1131.html (dostęp: 09.10.2026).</w:t>
       </w:r>
     </w:p>
     <w:sectPr>

</xml_diff>

<commit_message>
Część 1: wstęp w wersji ostatecznej z odwołaniami do rozdziałów; dwie ściągi do nauki
Co-Authored-By: Claude Opus 5.5 <noreply@anthropic.com>
Claude-Session: https://claude.ai/code/session_01QehAftz7E7q6ro6WRzRWTg
</commit_message>
<xml_diff>
--- a/Czesc_1_Projekt_Toyota_Corolla_E12.docx
+++ b/Czesc_1_Projekt_Toyota_Corolla_E12.docx
@@ -922,7 +922,7 @@
           <w:sz w:val="22"/>
           <w:szCs w:val="22"/>
         </w:rPr>
-        <w:t xml:space="preserve">Hamulec tarczowy osi przedniej przenosi w samochodzie osobowym większą część sił hamowania, a jego elementy cierne zużywają się w sposób ciągły podczas eksploatacji. Klocki hamulcowe są więc częścią, której stan decyduje bezpośrednio o drodze hamowania i stabilności pojazdu. Ich wymiana jest zabiegiem krótkim, ale wymagającym zachowania wymiarów granicznych i momentów dokręcania określonych przez producenta – błędy popełnione podczas montażu ujawniają się często dopiero w czasie jazdy.</w:t>
+        <w:t xml:space="preserve">Hamulec tarczowy osi przedniej przenosi w samochodzie osobowym większą część sił hamowania, a jego elementy cierne zużywają się w sposób ciągły podczas eksploatacji. Klocki hamulcowe są więc częścią, której stan decyduje bezpośrednio o drodze hamowania i stabilności pojazdu. Ich wymiana jest zabiegiem krótkim, ale – jak pokazano w rozdziale 8 – podatnym na błędy wykonawcze, których skutki ujawniają się dopiero podczas jazdy.</w:t>
       </w:r>
     </w:p>
     <w:p>
@@ -946,7 +946,7 @@
           <w:sz w:val="22"/>
           <w:szCs w:val="22"/>
         </w:rPr>
-        <w:t xml:space="preserve"> jest opracowanie procesu technologicznego weryfikacji i wymiany przednich klocków hamulcowych dla konkretnego pojazdu – Toyoty Corolli IX (E12) hatchback 1.6 VVT-i (silnik 3ZZ-FE, 81 kW, kod typu ZZE121) – zakończonego kontrolą jakości wykonanej naprawy.</w:t>
+        <w:t xml:space="preserve"> jest opracowanie kompletnego procesu technologicznego weryfikacji i wymiany przednich klocków hamulcowych dla konkretnego pojazdu – Toyoty Corolli IX (E12) hatchback 1.6 VVT-i (silnik 3ZZ-FE, 81 kW, kod typu ZZE121) – zakończonego mierzalną kontrolą jakości naprawy.</w:t>
       </w:r>
     </w:p>
     <w:p>
@@ -961,7 +961,7 @@
           <w:sz w:val="22"/>
           <w:szCs w:val="22"/>
         </w:rPr>
-        <w:t xml:space="preserve">Planowany zakres opracowania obejmuje:</w:t>
+        <w:t xml:space="preserve">Zakres opracowania obejmuje:</w:t>
       </w:r>
     </w:p>
     <w:p>
@@ -980,7 +980,7 @@
           <w:sz w:val="22"/>
           <w:szCs w:val="22"/>
         </w:rPr>
-        <w:t xml:space="preserve">charakterystykę obiektu naprawy – danych technicznych pojazdu oraz budowy hamulca osi przedniej,</w:t>
+        <w:t xml:space="preserve">charakterystykę obiektu naprawy i elementów hamulca osi przedniej (rozdział 2),</w:t>
       </w:r>
     </w:p>
     <w:p>
@@ -999,7 +999,7 @@
           <w:sz w:val="22"/>
           <w:szCs w:val="22"/>
         </w:rPr>
-        <w:t xml:space="preserve">warunki techniczne weryfikacji i montażu: wymiary nominalne i dopuszczalne, momenty dokręcania, rozmiary i typy kluczy oraz środki smarne,</w:t>
+        <w:t xml:space="preserve">warunki techniczne weryfikacji i montażu: wymiary nominalne i dopuszczalne, momenty dokręcania, rozmiary i typy kluczy oraz środki smarne (rozdział 3),</w:t>
       </w:r>
     </w:p>
     <w:p>
@@ -1018,7 +1018,7 @@
           <w:sz w:val="22"/>
           <w:szCs w:val="22"/>
         </w:rPr>
-        <w:t xml:space="preserve">diagnostykę i kwalifikację pojazdu do naprawy na podstawie objawów i pomiarów części,</w:t>
+        <w:t xml:space="preserve">macierz diagnostyczną objawów i kartę weryfikacji części, na podstawie których pojazd kwalifikowany jest do naprawy (rozdział 4),</w:t>
       </w:r>
     </w:p>
     <w:p>
@@ -1037,7 +1037,7 @@
           <w:sz w:val="22"/>
           <w:szCs w:val="22"/>
         </w:rPr>
-        <w:t xml:space="preserve">wyposażenie stanowiska pracy,</w:t>
+        <w:t xml:space="preserve">wyposażenie stanowiska pracy z przypisaniem narzędzi do numerów czynności (rozdział 5),</w:t>
       </w:r>
     </w:p>
     <w:p>
@@ -1056,7 +1056,7 @@
           <w:sz w:val="22"/>
           <w:szCs w:val="22"/>
         </w:rPr>
-        <w:t xml:space="preserve">schemat procesu technologicznego i kartę instrukcyjną operacji,</w:t>
+        <w:t xml:space="preserve">schemat procesu technologicznego i kartę instrukcyjną operacji (rozdział 6),</w:t>
       </w:r>
     </w:p>
     <w:p>
@@ -1075,7 +1075,7 @@
           <w:sz w:val="22"/>
           <w:szCs w:val="22"/>
         </w:rPr>
-        <w:t xml:space="preserve">kontrolę jakości po naprawie, w tym badanie skuteczności hamowania na stanowisku rolkowym,</w:t>
+        <w:t xml:space="preserve">kontrolę jakości po naprawie, w tym badanie na stanowisku rolkowym i protokół odbioru (rozdział 7),</w:t>
       </w:r>
     </w:p>
     <w:p>
@@ -1094,7 +1094,7 @@
           <w:sz w:val="22"/>
           <w:szCs w:val="22"/>
         </w:rPr>
-        <w:t xml:space="preserve">analizę typowych błędów wykonawczych oraz kalkulację kosztów usługi.</w:t>
+        <w:t xml:space="preserve">analizę typowych błędów wykonawczych (rozdział 8) oraz analizę kosztów naprawy (rozdział 9).</w:t>
       </w:r>
     </w:p>
     <w:p>
@@ -1118,7 +1118,7 @@
           <w:sz w:val="22"/>
           <w:szCs w:val="22"/>
         </w:rPr>
-        <w:t xml:space="preserve"> Podstawowym źródłem danych technicznych jest instrukcja naprawy producenta Toyota Corolla (E120) Repair Manual [1], z której przyjmowane będą wymiary nominalne i dopuszczalne, luzy oraz momenty dokręcania. Producent nie podaje w niej rozmiarów kluczy ani dokumentacji fotograficznej poszczególnych czynności, dlatego informacje te zostaną uzupełnione na podstawie instrukcji wymiany krok po kroku przygotowanej dla tego modelu [2]. W przypadku rozbieżności między źródłami przyjmowana będzie wartość podana przez producenta. Dane techniczne pojazdu zestawione w rozdziale 2 zaczerpnięto z katalogów i serwisów motoryzacyjnych [3]–[6].</w:t>
+        <w:t xml:space="preserve"> Wymiary, luzy, bicia i momenty dokręcania przyjęto z instrukcji naprawy producenta Toyota Corolla (E120) Repair Manual [1]. Producent nie podaje w niej rozmiarów kluczy ani dokumentacji fotograficznej, dlatego te informacje uzupełniono instrukcją wymiany krok po kroku przygotowaną dla tego modelu [2]. W przypadku rozbieżności (np. moment dokręcenia śrub zacisku 34,3 N·m według [1] i 35 N·m według [2]) przyjmowano wartość producenta. Dane techniczne pojazdu zestawione w rozdziale 2 pochodzą z katalogów i serwisów motoryzacyjnych [3]–[6], a dane katalogowe części – z katalogów części zamiennych [7], [8].</w:t>
       </w:r>
     </w:p>
     <w:p>

</xml_diff>

<commit_message>
Wstaw zdjęcia pojazdu (przód i tył) z Motointegratora i dodaj źródło do bibliografii
Co-Authored-By: Claude Opus 5.5 <noreply@anthropic.com>
Claude-Session: https://claude.ai/code/session_01QehAftz7E7q6ro6WRzRWTg
</commit_message>
<xml_diff>
--- a/Czesc_1_Projekt_Toyota_Corolla_E12.docx
+++ b/Czesc_1_Projekt_Toyota_Corolla_E12.docx
@@ -1118,7 +1118,7 @@
           <w:sz w:val="22"/>
           <w:szCs w:val="22"/>
         </w:rPr>
-        <w:t xml:space="preserve"> Wymiary, luzy, bicia i momenty dokręcania przyjęto z instrukcji naprawy producenta Toyota Corolla (E120) Repair Manual [1]. Producent nie podaje w niej rozmiarów kluczy ani dokumentacji fotograficznej, dlatego te informacje uzupełniono instrukcją wymiany krok po kroku przygotowaną dla tego modelu [2]. W przypadku rozbieżności (np. moment dokręcenia śrub zacisku 34,3 N·m według [1] i 35 N·m według [2]) przyjmowano wartość producenta. Dane techniczne pojazdu zestawione w rozdziale 2 pochodzą z katalogów i serwisów motoryzacyjnych [3]–[6], a dane katalogowe części – z katalogów części zamiennych [7], [8].</w:t>
+        <w:t xml:space="preserve"> Wymiary, luzy, bicia i momenty dokręcania przyjęto z instrukcji naprawy producenta Toyota Corolla (E120) Repair Manual [1]. Producent nie podaje w niej rozmiarów kluczy ani dokumentacji fotograficznej, dlatego te informacje uzupełniono instrukcją wymiany krok po kroku przygotowaną dla tego modelu [2]. W przypadku rozbieżności (np. moment dokręcenia śrub zacisku 34,3 N·m według [1] i 35 N·m według [2]) przyjmowano wartość producenta. Dane techniczne pojazdu zestawione w rozdziale 2 pochodzą z katalogów i serwisów motoryzacyjnych [3]–[6], zdjęcia pojazdu – z serwisu [7], a dane katalogowe części – z katalogów części zamiennych [8], [9].</w:t>
       </w:r>
     </w:p>
     <w:p>
@@ -1183,78 +1183,56 @@
           <w:sz w:val="22"/>
           <w:szCs w:val="22"/>
         </w:rPr>
-        <w:t xml:space="preserve">Na rysunku numer 1 poniżej pokazano analizowany model pojazdu.</w:t>
-      </w:r>
-    </w:p>
-    <w:tbl>
-      <w:tblPr>
-        <w:tblW w:type="dxa" w:w="7000"/>
+        <w:t xml:space="preserve">Na rysunkach numer 1 i 2 poniżej pokazano analizowany model pojazdu w widoku z przodu i z tyłu.</w:t>
+      </w:r>
+    </w:p>
+    <w:p>
+      <w:pPr>
+        <w:keepNext/>
+        <w:spacing w:after="60"/>
         <w:jc w:val="center"/>
-        <w:tblBorders>
-          <w:top w:val="single" w:color="auto" w:sz="4"/>
-          <w:left w:val="single" w:color="auto" w:sz="4"/>
-          <w:bottom w:val="single" w:color="auto" w:sz="4"/>
-          <w:right w:val="single" w:color="auto" w:sz="4"/>
-          <w:insideH w:val="single" w:color="auto" w:sz="4"/>
-          <w:insideV w:val="single" w:color="auto" w:sz="4"/>
-        </w:tblBorders>
-      </w:tblPr>
-      <w:tblGrid>
-        <w:gridCol w:w="7000"/>
-      </w:tblGrid>
-      <w:tr>
-        <w:trPr>
-          <w:trHeight w:val="3400" w:hRule="atLeast"/>
-        </w:trPr>
-        <w:tc>
-          <w:tcPr>
-            <w:tcW w:type="dxa" w:w="7000"/>
-            <w:tcBorders>
-              <w:top w:val="dashed" w:color="8C8C8C" w:sz="6"/>
-              <w:left w:val="dashed" w:color="8C8C8C" w:sz="6"/>
-              <w:bottom w:val="dashed" w:color="8C8C8C" w:sz="6"/>
-              <w:right w:val="dashed" w:color="8C8C8C" w:sz="6"/>
-            </w:tcBorders>
-            <w:shd w:fill="F2F2F2" w:color="auto" w:val="clear"/>
-            <w:vAlign w:val="center"/>
-          </w:tcPr>
-          <w:p>
-            <w:pPr>
-              <w:spacing w:after="40" w:before="0" w:line="276"/>
-              <w:jc w:val="center"/>
-            </w:pPr>
-            <w:r>
-              <w:rPr>
-                <w:rFonts w:ascii="Calibri" w:cs="Calibri" w:eastAsia="Calibri" w:hAnsi="Calibri"/>
-                <w:b/>
-                <w:bCs/>
-                <w:color w:val="808080"/>
-                <w:sz w:val="18"/>
-                <w:szCs w:val="18"/>
-              </w:rPr>
-              <w:t xml:space="preserve">MIEJSCE NA ZDJĘCIE</w:t>
-            </w:r>
-          </w:p>
-          <w:p>
-            <w:pPr>
-              <w:spacing w:after="0" w:before="0" w:line="276"/>
-              <w:jc w:val="center"/>
-            </w:pPr>
-            <w:r>
-              <w:rPr>
-                <w:rFonts w:ascii="Calibri" w:cs="Calibri" w:eastAsia="Calibri" w:hAnsi="Calibri"/>
-                <w:i/>
-                <w:iCs/>
-                <w:color w:val="808080"/>
-                <w:sz w:val="16"/>
-                <w:szCs w:val="16"/>
-              </w:rPr>
-              <w:t xml:space="preserve">Toyota Corolla E12 hatchback – zdjęcie ogólne pojazdu (AutoCentrum [3])</w:t>
-            </w:r>
-          </w:p>
-        </w:tc>
-      </w:tr>
-    </w:tbl>
+      </w:pPr>
+      <w:r>
+        <w:drawing>
+          <wp:inline distT="0" distB="0" distL="0" distR="0">
+            <wp:extent cx="4000500" cy="2638425"/>
+            <wp:effectExtent t="0" r="0" b="0" l="0"/>
+            <wp:docPr id="1" name="" descr="" title=""/>
+            <wp:cNvGraphicFramePr>
+              <a:graphicFrameLocks xmlns:a="http://schemas.openxmlformats.org/drawingml/2006/main" noChangeAspect="1"/>
+            </wp:cNvGraphicFramePr>
+            <a:graphic xmlns:a="http://schemas.openxmlformats.org/drawingml/2006/main">
+              <a:graphicData uri="http://schemas.openxmlformats.org/drawingml/2006/picture">
+                <pic:pic xmlns:pic="http://schemas.openxmlformats.org/drawingml/2006/picture">
+                  <pic:nvPicPr>
+                    <pic:cNvPr id="0" name="" descr=""/>
+                    <pic:cNvPicPr>
+                      <a:picLocks noChangeAspect="1" noChangeArrowheads="1"/>
+                    </pic:cNvPicPr>
+                  </pic:nvPicPr>
+                  <pic:blipFill>
+                    <a:blip r:embed="rId9" cstate="none"/>
+                    <a:srcRect/>
+                    <a:stretch>
+                      <a:fillRect/>
+                    </a:stretch>
+                  </pic:blipFill>
+                  <pic:spPr bwMode="auto">
+                    <a:xfrm>
+                      <a:off x="0" y="0"/>
+                      <a:ext cx="4000500" cy="2638425"/>
+                    </a:xfrm>
+                    <a:prstGeom prst="rect">
+                      <a:avLst/>
+                    </a:prstGeom>
+                  </pic:spPr>
+                </pic:pic>
+              </a:graphicData>
+            </a:graphic>
+          </wp:inline>
+        </w:drawing>
+      </w:r>
+    </w:p>
     <w:p>
       <w:pPr>
         <w:spacing w:after="200" w:before="0" w:line="276"/>
@@ -1268,7 +1246,70 @@
           <w:sz w:val="18"/>
           <w:szCs w:val="18"/>
         </w:rPr>
-        <w:t xml:space="preserve">Rysunek 1. Toyota Corolla IX (E12) hatchback, [3]</w:t>
+        <w:t xml:space="preserve">Rysunek 1. Toyota Corolla IX (E12) hatchback 5-drzwiowy – widok z przodu, [7]</w:t>
+      </w:r>
+    </w:p>
+    <w:p>
+      <w:pPr>
+        <w:keepNext/>
+        <w:spacing w:after="60"/>
+        <w:jc w:val="center"/>
+      </w:pPr>
+      <w:r>
+        <w:drawing>
+          <wp:inline distT="0" distB="0" distL="0" distR="0">
+            <wp:extent cx="4000500" cy="3000375"/>
+            <wp:effectExtent t="0" r="0" b="0" l="0"/>
+            <wp:docPr id="1" name="" descr="" title=""/>
+            <wp:cNvGraphicFramePr>
+              <a:graphicFrameLocks xmlns:a="http://schemas.openxmlformats.org/drawingml/2006/main" noChangeAspect="1"/>
+            </wp:cNvGraphicFramePr>
+            <a:graphic xmlns:a="http://schemas.openxmlformats.org/drawingml/2006/main">
+              <a:graphicData uri="http://schemas.openxmlformats.org/drawingml/2006/picture">
+                <pic:pic xmlns:pic="http://schemas.openxmlformats.org/drawingml/2006/picture">
+                  <pic:nvPicPr>
+                    <pic:cNvPr id="0" name="" descr=""/>
+                    <pic:cNvPicPr>
+                      <a:picLocks noChangeAspect="1" noChangeArrowheads="1"/>
+                    </pic:cNvPicPr>
+                  </pic:nvPicPr>
+                  <pic:blipFill>
+                    <a:blip r:embed="rId10" cstate="none"/>
+                    <a:srcRect/>
+                    <a:stretch>
+                      <a:fillRect/>
+                    </a:stretch>
+                  </pic:blipFill>
+                  <pic:spPr bwMode="auto">
+                    <a:xfrm>
+                      <a:off x="0" y="0"/>
+                      <a:ext cx="4000500" cy="3000375"/>
+                    </a:xfrm>
+                    <a:prstGeom prst="rect">
+                      <a:avLst/>
+                    </a:prstGeom>
+                  </pic:spPr>
+                </pic:pic>
+              </a:graphicData>
+            </a:graphic>
+          </wp:inline>
+        </w:drawing>
+      </w:r>
+    </w:p>
+    <w:p>
+      <w:pPr>
+        <w:spacing w:after="200" w:before="0" w:line="276"/>
+        <w:jc w:val="left"/>
+      </w:pPr>
+      <w:r>
+        <w:rPr>
+          <w:rFonts w:ascii="Calibri" w:cs="Calibri" w:eastAsia="Calibri" w:hAnsi="Calibri"/>
+          <w:b/>
+          <w:bCs/>
+          <w:sz w:val="18"/>
+          <w:szCs w:val="18"/>
+        </w:rPr>
+        <w:t xml:space="preserve">Rysunek 2. Toyota Corolla IX (E12) hatchback 5-drzwiowy – widok z tyłu, [7]</w:t>
       </w:r>
     </w:p>
     <w:p>
@@ -2367,7 +2408,7 @@
                 <w:sz w:val="19"/>
                 <w:szCs w:val="19"/>
               </w:rPr>
-              <w:t xml:space="preserve">tarczowe wentylowane Ø 255 mm, zacisk pływający jednotłoczkowy [1], [7]</w:t>
+              <w:t xml:space="preserve">tarczowe wentylowane Ø 255 mm, zacisk pływający jednotłoczkowy [1], [8]</w:t>
             </w:r>
           </w:p>
         </w:tc>
@@ -2436,7 +2477,7 @@
                 <w:sz w:val="19"/>
                 <w:szCs w:val="19"/>
               </w:rPr>
-              <w:t xml:space="preserve">bębnowe lub tarczowe pełne Ø 258 mm – zależnie od wersji [8]</w:t>
+              <w:t xml:space="preserve">bębnowe lub tarczowe pełne Ø 258 mm – zależnie od wersji [9]</w:t>
             </w:r>
           </w:p>
         </w:tc>
@@ -2643,7 +2684,7 @@
                 <w:sz w:val="19"/>
                 <w:szCs w:val="19"/>
               </w:rPr>
-              <w:t xml:space="preserve">SAE J1703 / FMVSS No. 116 DOT 3 [9]</w:t>
+              <w:t xml:space="preserve">SAE J1703 / FMVSS No. 116 DOT 3 [10]</w:t>
             </w:r>
           </w:p>
         </w:tc>
@@ -2863,7 +2904,7 @@
           <w:sz w:val="20"/>
           <w:szCs w:val="20"/>
         </w:rPr>
-        <w:t xml:space="preserve">AUTODOC: Tarcza hamulcowa AP 24941 (Ø 255 mm, grubość 25 mm, min. 23 mm), https://www.autodoc.pl/ap/9367120 (dostęp: 09.10.2026).</w:t>
+        <w:t xml:space="preserve">Motointegrator: Toyota Corolla E12 – dane techniczne: spalanie, cena i opinie (zdjęcia pojazdu), https://www.motointegrator.pl (dostęp: 18.10.2026).</w:t>
       </w:r>
     </w:p>
     <w:p>
@@ -2888,7 +2929,7 @@
           <w:sz w:val="20"/>
           <w:szCs w:val="20"/>
         </w:rPr>
-        <w:t xml:space="preserve">Motostacja: TRW tarcze + klocki tył Toyota Corolla E12 (DF4379, GDB3289), https://motostacja.com/p/TRW-2--DF4379-GDB3289 (dostęp: 09.10.2026).</w:t>
+        <w:t xml:space="preserve">AUTODOC: Tarcza hamulcowa AP 24941 (Ø 255 mm, grubość 25 mm, min. 23 mm), https://www.autodoc.pl/ap/9367120 (dostęp: 09.10.2026).</w:t>
       </w:r>
     </w:p>
     <w:p>
@@ -2906,6 +2947,31 @@
           <w:szCs w:val="20"/>
         </w:rPr>
         <w:t xml:space="preserve">[9]	</w:t>
+      </w:r>
+      <w:r>
+        <w:rPr>
+          <w:rFonts w:ascii="Calibri" w:cs="Calibri" w:eastAsia="Calibri" w:hAnsi="Calibri"/>
+          <w:sz w:val="20"/>
+          <w:szCs w:val="20"/>
+        </w:rPr>
+        <w:t xml:space="preserve">Motostacja: TRW tarcze + klocki tył Toyota Corolla E12 (DF4379, GDB3289), https://motostacja.com/p/TRW-2--DF4379-GDB3289 (dostęp: 09.10.2026).</w:t>
+      </w:r>
+    </w:p>
+    <w:p>
+      <w:pPr>
+        <w:tabs>
+          <w:tab w:val="left" w:pos="560"/>
+        </w:tabs>
+        <w:spacing w:after="100"/>
+        <w:ind w:left="560" w:hanging="560"/>
+      </w:pPr>
+      <w:r>
+        <w:rPr>
+          <w:rFonts w:ascii="Calibri" w:cs="Calibri" w:eastAsia="Calibri" w:hAnsi="Calibri"/>
+          <w:sz w:val="20"/>
+          <w:szCs w:val="20"/>
+        </w:rPr>
+        <w:t xml:space="preserve">[10]	</w:t>
       </w:r>
       <w:r>
         <w:rPr>

</xml_diff>

<commit_message>
Strona tytułowa PW (Wydział Transportu), nr albumu; opis numeryczny rysunku 4
Co-Authored-By: Claude Opus 5.5 <noreply@anthropic.com>
Claude-Session: https://claude.ai/code/session_01QehAftz7E7q6ro6WRzRWTg
</commit_message>
<xml_diff>
--- a/Czesc_1_Projekt_Toyota_Corolla_E12.docx
+++ b/Czesc_1_Projekt_Toyota_Corolla_E12.docx
@@ -4,7 +4,7 @@
   <w:body>
     <w:p>
       <w:pPr>
-        <w:spacing w:after="120" w:before="600" w:line="276"/>
+        <w:spacing w:after="1200" w:before="600" w:line="276"/>
         <w:jc w:val="center"/>
       </w:pPr>
       <w:r>
@@ -15,7 +15,7 @@
           <w:sz w:val="32"/>
           <w:szCs w:val="32"/>
         </w:rPr>
-        <w:t xml:space="preserve">[NAZWA UCZELNI]</w:t>
+        <w:t xml:space="preserve">POLITECHNIKA WARSZAWSKA</w:t>
       </w:r>
     </w:p>
     <w:p>
@@ -29,7 +29,7 @@
           <w:sz w:val="28"/>
           <w:szCs w:val="28"/>
         </w:rPr>
-        <w:t xml:space="preserve">[Wydział]</w:t>
+        <w:t xml:space="preserve">Wydział Transportu</w:t>
       </w:r>
     </w:p>
     <w:p>
@@ -43,7 +43,7 @@
           <w:sz w:val="26"/>
           <w:szCs w:val="26"/>
         </w:rPr>
-        <w:t xml:space="preserve">[Zakład / Katedra]</w:t>
+        <w:t xml:space="preserve">Zakład Budowy i Eksploatacji Środków Transportu</w:t>
       </w:r>
     </w:p>
     <w:p>
@@ -64,6 +64,22 @@
     </w:p>
     <w:p>
       <w:pPr>
+        <w:spacing w:after="120" w:before="0" w:line="276"/>
+        <w:jc w:val="center"/>
+      </w:pPr>
+      <w:r>
+        <w:rPr>
+          <w:rFonts w:ascii="Calibri" w:cs="Calibri" w:eastAsia="Calibri" w:hAnsi="Calibri"/>
+          <w:b/>
+          <w:bCs/>
+          <w:sz w:val="30"/>
+          <w:szCs w:val="30"/>
+        </w:rPr>
+        <w:t xml:space="preserve">Temat:</w:t>
+      </w:r>
+    </w:p>
+    <w:p>
+      <w:pPr>
         <w:spacing w:after="2400" w:before="0" w:line="276"/>
         <w:jc w:val="center"/>
       </w:pPr>
@@ -73,7 +89,7 @@
           <w:sz w:val="30"/>
           <w:szCs w:val="30"/>
         </w:rPr>
-        <w:t xml:space="preserve">Temat: Proces technologiczny weryfikacji i wymiany przednich klocków hamulcowych wraz z kontrolą jakości naprawy w pojeździe Toyota Corolla IX (E12) 1.6 VVT-i</w:t>
+        <w:t xml:space="preserve">Proces technologiczny weryfikacji i wymiany przednich klocków hamulcowych wraz z kontrolą jakości naprawy w pojeździe Toyota Corolla IX (E12) 1.6 VVT-i</w:t>
       </w:r>
     </w:p>
     <w:p>
@@ -101,7 +117,7 @@
           <w:sz w:val="24"/>
           <w:szCs w:val="24"/>
         </w:rPr>
-        <w:t xml:space="preserve">Nr albumu: ..................</w:t>
+        <w:t xml:space="preserve">Nr albumu: 340047</w:t>
       </w:r>
     </w:p>
     <w:p>

</xml_diff>